<commit_message>
doc(rapport): Ajout d'une source
</commit_message>
<xml_diff>
--- a/DOC/annexes/AugustoRomain-P_DB_GestionAeroport-Rapport.docx
+++ b/DOC/annexes/AugustoRomain-P_DB_GestionAeroport-Rapport.docx
@@ -1448,11 +1448,7 @@
           </mc:Choice>
           <mc:Fallback>
             <w:pict>
-              <v:shapetype w14:anchorId="281DD82F" id="_x0000_t202" coordsize="21600,21600" o:spt="202" path="m,l,21600r21600,l21600,xe">
-                <v:stroke joinstyle="miter"/>
-                <v:path gradientshapeok="t" o:connecttype="rect"/>
-              </v:shapetype>
-              <v:shape id="_x0000_s1027" type="#_x0000_t202" style="position:absolute;margin-left:-37.85pt;margin-top:149.1pt;width:262.7pt;height:117.75pt;z-index:-251651072;visibility:visible;mso-wrap-style:square;mso-width-percent:0;mso-height-percent:0;mso-wrap-distance-left:9pt;mso-wrap-distance-top:3.6pt;mso-wrap-distance-right:9pt;mso-wrap-distance-bottom:3.6pt;mso-position-horizontal:absolute;mso-position-horizontal-relative:text;mso-position-vertical:absolute;mso-position-vertical-relative:text;mso-width-percent:0;mso-height-percent:0;mso-width-relative:margin;mso-height-relative:margin;v-text-anchor:top" o:gfxdata="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" filled="f" stroked="f">
+              <v:shape w14:anchorId="281DD82F" id="_x0000_s1027" type="#_x0000_t202" style="position:absolute;margin-left:-37.85pt;margin-top:149.1pt;width:262.7pt;height:117.75pt;z-index:-251651072;visibility:visible;mso-wrap-style:square;mso-width-percent:0;mso-height-percent:0;mso-wrap-distance-left:9pt;mso-wrap-distance-top:3.6pt;mso-wrap-distance-right:9pt;mso-wrap-distance-bottom:3.6pt;mso-position-horizontal:absolute;mso-position-horizontal-relative:text;mso-position-vertical:absolute;mso-position-vertical-relative:text;mso-width-percent:0;mso-height-percent:0;mso-width-relative:margin;mso-height-relative:margin;v-text-anchor:top" o:gfxdata="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" filled="f" stroked="f">
                 <v:textbox>
                   <w:txbxContent>
                     <w:tbl>
@@ -22682,42 +22678,88 @@
       <w:bookmarkEnd w:id="20"/>
     </w:p>
     <w:p>
-      <w:r>
-        <w:t>Document des conventions de codage de l’ETML</w:t>
-      </w:r>
-    </w:p>
-    <w:p>
-      <w:r>
-        <w:t>Dans ce document j’ai pu analyser les conventions de nommage pour le MCD/MLD.</w:t>
-      </w:r>
-    </w:p>
-    <w:p>
-      <w:r>
-        <w:t xml:space="preserve">Source : </w:t>
-      </w:r>
-    </w:p>
-    <w:p>
-      <w:pPr>
-        <w:pStyle w:val="Titre1"/>
+      <w:pPr>
+        <w:pStyle w:val="Paragraphedeliste"/>
+        <w:numPr>
+          <w:ilvl w:val="0"/>
+          <w:numId w:val="33"/>
+        </w:numPr>
+        <w:jc w:val="both"/>
         <w:rPr>
           <w:rFonts w:ascii="Calibri" w:hAnsi="Calibri" w:cs="Calibri"/>
           <w:b/>
           <w:bCs/>
         </w:rPr>
       </w:pPr>
-      <w:bookmarkStart w:id="21" w:name="_Toc244069793"/>
       <w:r>
         <w:rPr>
           <w:rFonts w:ascii="Calibri" w:hAnsi="Calibri" w:cs="Calibri"/>
           <w:b/>
           <w:bCs/>
         </w:rPr>
+        <w:t>Document des conventions de codage de l’ETML</w:t>
+      </w:r>
+    </w:p>
+    <w:p>
+      <w:pPr>
+        <w:pStyle w:val="Paragraphedeliste"/>
+        <w:jc w:val="both"/>
+        <w:rPr>
+          <w:rFonts w:ascii="Calibri" w:hAnsi="Calibri" w:cs="Calibri"/>
+        </w:rPr>
+      </w:pPr>
+      <w:r>
+        <w:rPr>
+          <w:rFonts w:ascii="Calibri" w:hAnsi="Calibri" w:cs="Calibri"/>
+        </w:rPr>
+        <w:t>Dans ce document j’ai pu analyser les conventions de nommage pour le MCD/MLD.</w:t>
+      </w:r>
+    </w:p>
+    <w:p>
+      <w:pPr>
+        <w:pStyle w:val="Paragraphedeliste"/>
+        <w:jc w:val="both"/>
+      </w:pPr>
+      <w:r>
+        <w:rPr>
+          <w:rFonts w:ascii="Calibri" w:hAnsi="Calibri" w:cs="Calibri"/>
+        </w:rPr>
+        <w:t>Source :</w:t>
+      </w:r>
+      <w:r>
+        <w:t xml:space="preserve"> </w:t>
+      </w:r>
+      <w:hyperlink r:id="rId31" w:history="1">
+        <w:r>
+          <w:rPr>
+            <w:rStyle w:val="Lienhypertexte"/>
+          </w:rPr>
+          <w:t>..\src\I-ConventionsDeCodageV3.6.0.pdf</w:t>
+        </w:r>
+      </w:hyperlink>
+    </w:p>
+    <w:p>
+      <w:pPr>
+        <w:pStyle w:val="Titre1"/>
+        <w:rPr>
+          <w:rFonts w:ascii="Calibri" w:hAnsi="Calibri" w:cs="Calibri"/>
+          <w:b/>
+          <w:bCs/>
+        </w:rPr>
+      </w:pPr>
+      <w:bookmarkStart w:id="21" w:name="_Toc244069793"/>
+      <w:r>
+        <w:rPr>
+          <w:rFonts w:ascii="Calibri" w:hAnsi="Calibri" w:cs="Calibri"/>
+          <w:b/>
+          <w:bCs/>
+        </w:rPr>
         <w:t>7. Annexes</w:t>
       </w:r>
       <w:bookmarkEnd w:id="21"/>
     </w:p>
     <w:sectPr>
-      <w:footerReference w:type="first" r:id="rId31"/>
+      <w:footerReference w:type="first" r:id="rId32"/>
       <w:type w:val="continuous"/>
       <w:pgSz w:w="11906" w:h="16838"/>
       <w:pgMar w:top="1417" w:right="1417" w:bottom="1417" w:left="1417" w:header="708" w:footer="708" w:gutter="0"/>
@@ -24789,6 +24831,119 @@
     </w:lvl>
   </w:abstractNum>
   <w:abstractNum w:abstractNumId="16" w15:restartNumberingAfterBreak="0">
+    <w:nsid w:val="452B5311"/>
+    <w:multiLevelType w:val="hybridMultilevel"/>
+    <w:tmpl w:val="0950845C"/>
+    <w:lvl w:ilvl="0" w:tplc="100C0001">
+      <w:start w:val="1"/>
+      <w:numFmt w:val="bullet"/>
+      <w:lvlText w:val=""/>
+      <w:lvlJc w:val="left"/>
+      <w:pPr>
+        <w:ind w:left="720" w:hanging="360"/>
+      </w:pPr>
+      <w:rPr>
+        <w:rFonts w:ascii="Symbol" w:hAnsi="Symbol" w:hint="default"/>
+      </w:rPr>
+    </w:lvl>
+    <w:lvl w:ilvl="1" w:tplc="100C0003" w:tentative="1">
+      <w:start w:val="1"/>
+      <w:numFmt w:val="bullet"/>
+      <w:lvlText w:val="o"/>
+      <w:lvlJc w:val="left"/>
+      <w:pPr>
+        <w:ind w:left="1440" w:hanging="360"/>
+      </w:pPr>
+      <w:rPr>
+        <w:rFonts w:ascii="Courier New" w:hAnsi="Courier New" w:cs="Courier New" w:hint="default"/>
+      </w:rPr>
+    </w:lvl>
+    <w:lvl w:ilvl="2" w:tplc="100C0005" w:tentative="1">
+      <w:start w:val="1"/>
+      <w:numFmt w:val="bullet"/>
+      <w:lvlText w:val=""/>
+      <w:lvlJc w:val="left"/>
+      <w:pPr>
+        <w:ind w:left="2160" w:hanging="360"/>
+      </w:pPr>
+      <w:rPr>
+        <w:rFonts w:ascii="Wingdings" w:hAnsi="Wingdings" w:hint="default"/>
+      </w:rPr>
+    </w:lvl>
+    <w:lvl w:ilvl="3" w:tplc="100C0001" w:tentative="1">
+      <w:start w:val="1"/>
+      <w:numFmt w:val="bullet"/>
+      <w:lvlText w:val=""/>
+      <w:lvlJc w:val="left"/>
+      <w:pPr>
+        <w:ind w:left="2880" w:hanging="360"/>
+      </w:pPr>
+      <w:rPr>
+        <w:rFonts w:ascii="Symbol" w:hAnsi="Symbol" w:hint="default"/>
+      </w:rPr>
+    </w:lvl>
+    <w:lvl w:ilvl="4" w:tplc="100C0003" w:tentative="1">
+      <w:start w:val="1"/>
+      <w:numFmt w:val="bullet"/>
+      <w:lvlText w:val="o"/>
+      <w:lvlJc w:val="left"/>
+      <w:pPr>
+        <w:ind w:left="3600" w:hanging="360"/>
+      </w:pPr>
+      <w:rPr>
+        <w:rFonts w:ascii="Courier New" w:hAnsi="Courier New" w:cs="Courier New" w:hint="default"/>
+      </w:rPr>
+    </w:lvl>
+    <w:lvl w:ilvl="5" w:tplc="100C0005" w:tentative="1">
+      <w:start w:val="1"/>
+      <w:numFmt w:val="bullet"/>
+      <w:lvlText w:val=""/>
+      <w:lvlJc w:val="left"/>
+      <w:pPr>
+        <w:ind w:left="4320" w:hanging="360"/>
+      </w:pPr>
+      <w:rPr>
+        <w:rFonts w:ascii="Wingdings" w:hAnsi="Wingdings" w:hint="default"/>
+      </w:rPr>
+    </w:lvl>
+    <w:lvl w:ilvl="6" w:tplc="100C0001" w:tentative="1">
+      <w:start w:val="1"/>
+      <w:numFmt w:val="bullet"/>
+      <w:lvlText w:val=""/>
+      <w:lvlJc w:val="left"/>
+      <w:pPr>
+        <w:ind w:left="5040" w:hanging="360"/>
+      </w:pPr>
+      <w:rPr>
+        <w:rFonts w:ascii="Symbol" w:hAnsi="Symbol" w:hint="default"/>
+      </w:rPr>
+    </w:lvl>
+    <w:lvl w:ilvl="7" w:tplc="100C0003" w:tentative="1">
+      <w:start w:val="1"/>
+      <w:numFmt w:val="bullet"/>
+      <w:lvlText w:val="o"/>
+      <w:lvlJc w:val="left"/>
+      <w:pPr>
+        <w:ind w:left="5760" w:hanging="360"/>
+      </w:pPr>
+      <w:rPr>
+        <w:rFonts w:ascii="Courier New" w:hAnsi="Courier New" w:cs="Courier New" w:hint="default"/>
+      </w:rPr>
+    </w:lvl>
+    <w:lvl w:ilvl="8" w:tplc="100C0005" w:tentative="1">
+      <w:start w:val="1"/>
+      <w:numFmt w:val="bullet"/>
+      <w:lvlText w:val=""/>
+      <w:lvlJc w:val="left"/>
+      <w:pPr>
+        <w:ind w:left="6480" w:hanging="360"/>
+      </w:pPr>
+      <w:rPr>
+        <w:rFonts w:ascii="Wingdings" w:hAnsi="Wingdings" w:hint="default"/>
+      </w:rPr>
+    </w:lvl>
+  </w:abstractNum>
+  <w:abstractNum w:abstractNumId="17" w15:restartNumberingAfterBreak="0">
     <w:nsid w:val="46934322"/>
     <w:multiLevelType w:val="hybridMultilevel"/>
     <w:tmpl w:val="691E28DC"/>
@@ -24901,7 +25056,7 @@
       </w:rPr>
     </w:lvl>
   </w:abstractNum>
-  <w:abstractNum w:abstractNumId="17" w15:restartNumberingAfterBreak="0">
+  <w:abstractNum w:abstractNumId="18" w15:restartNumberingAfterBreak="0">
     <w:nsid w:val="4CE06E49"/>
     <w:multiLevelType w:val="hybridMultilevel"/>
     <w:tmpl w:val="A59E08BC"/>
@@ -24990,7 +25145,7 @@
       </w:pPr>
     </w:lvl>
   </w:abstractNum>
-  <w:abstractNum w:abstractNumId="18" w15:restartNumberingAfterBreak="0">
+  <w:abstractNum w:abstractNumId="19" w15:restartNumberingAfterBreak="0">
     <w:nsid w:val="51CB2DBF"/>
     <w:multiLevelType w:val="hybridMultilevel"/>
     <w:tmpl w:val="0DF25F8C"/>
@@ -25103,7 +25258,7 @@
       </w:rPr>
     </w:lvl>
   </w:abstractNum>
-  <w:abstractNum w:abstractNumId="19" w15:restartNumberingAfterBreak="0">
+  <w:abstractNum w:abstractNumId="20" w15:restartNumberingAfterBreak="0">
     <w:nsid w:val="569D7CC1"/>
     <w:multiLevelType w:val="hybridMultilevel"/>
     <w:tmpl w:val="B3A8C868"/>
@@ -25216,7 +25371,7 @@
       </w:rPr>
     </w:lvl>
   </w:abstractNum>
-  <w:abstractNum w:abstractNumId="20" w15:restartNumberingAfterBreak="0">
+  <w:abstractNum w:abstractNumId="21" w15:restartNumberingAfterBreak="0">
     <w:nsid w:val="60D81934"/>
     <w:multiLevelType w:val="hybridMultilevel"/>
     <w:tmpl w:val="1CEA9640"/>
@@ -25329,7 +25484,7 @@
       </w:rPr>
     </w:lvl>
   </w:abstractNum>
-  <w:abstractNum w:abstractNumId="21" w15:restartNumberingAfterBreak="0">
+  <w:abstractNum w:abstractNumId="22" w15:restartNumberingAfterBreak="0">
     <w:nsid w:val="611B2273"/>
     <w:multiLevelType w:val="hybridMultilevel"/>
     <w:tmpl w:val="7E50306A"/>
@@ -25442,7 +25597,7 @@
       </w:rPr>
     </w:lvl>
   </w:abstractNum>
-  <w:abstractNum w:abstractNumId="22" w15:restartNumberingAfterBreak="0">
+  <w:abstractNum w:abstractNumId="23" w15:restartNumberingAfterBreak="0">
     <w:nsid w:val="63F91084"/>
     <w:multiLevelType w:val="hybridMultilevel"/>
     <w:tmpl w:val="996088D6"/>
@@ -25555,7 +25710,7 @@
       </w:rPr>
     </w:lvl>
   </w:abstractNum>
-  <w:abstractNum w:abstractNumId="23" w15:restartNumberingAfterBreak="0">
+  <w:abstractNum w:abstractNumId="24" w15:restartNumberingAfterBreak="0">
     <w:nsid w:val="647F1D0D"/>
     <w:multiLevelType w:val="hybridMultilevel"/>
     <w:tmpl w:val="8648D7FE"/>
@@ -25641,7 +25796,7 @@
       </w:pPr>
     </w:lvl>
   </w:abstractNum>
-  <w:abstractNum w:abstractNumId="24" w15:restartNumberingAfterBreak="0">
+  <w:abstractNum w:abstractNumId="25" w15:restartNumberingAfterBreak="0">
     <w:nsid w:val="67323948"/>
     <w:multiLevelType w:val="hybridMultilevel"/>
     <w:tmpl w:val="7BD295C8"/>
@@ -25754,7 +25909,7 @@
       </w:rPr>
     </w:lvl>
   </w:abstractNum>
-  <w:abstractNum w:abstractNumId="25" w15:restartNumberingAfterBreak="0">
+  <w:abstractNum w:abstractNumId="26" w15:restartNumberingAfterBreak="0">
     <w:nsid w:val="68706354"/>
     <w:multiLevelType w:val="hybridMultilevel"/>
     <w:tmpl w:val="D4CAF374"/>
@@ -25894,7 +26049,7 @@
       </w:rPr>
     </w:lvl>
   </w:abstractNum>
-  <w:abstractNum w:abstractNumId="26" w15:restartNumberingAfterBreak="0">
+  <w:abstractNum w:abstractNumId="27" w15:restartNumberingAfterBreak="0">
     <w:nsid w:val="6DF771E1"/>
     <w:multiLevelType w:val="hybridMultilevel"/>
     <w:tmpl w:val="28CC9E4A"/>
@@ -26007,7 +26162,7 @@
       </w:rPr>
     </w:lvl>
   </w:abstractNum>
-  <w:abstractNum w:abstractNumId="27" w15:restartNumberingAfterBreak="0">
+  <w:abstractNum w:abstractNumId="28" w15:restartNumberingAfterBreak="0">
     <w:nsid w:val="71B21769"/>
     <w:multiLevelType w:val="hybridMultilevel"/>
     <w:tmpl w:val="96C81336"/>
@@ -26120,7 +26275,7 @@
       </w:rPr>
     </w:lvl>
   </w:abstractNum>
-  <w:abstractNum w:abstractNumId="28" w15:restartNumberingAfterBreak="0">
+  <w:abstractNum w:abstractNumId="29" w15:restartNumberingAfterBreak="0">
     <w:nsid w:val="72CD635C"/>
     <w:multiLevelType w:val="hybridMultilevel"/>
     <w:tmpl w:val="2766D7A0"/>
@@ -26233,7 +26388,7 @@
       </w:rPr>
     </w:lvl>
   </w:abstractNum>
-  <w:abstractNum w:abstractNumId="29" w15:restartNumberingAfterBreak="0">
+  <w:abstractNum w:abstractNumId="30" w15:restartNumberingAfterBreak="0">
     <w:nsid w:val="785244FF"/>
     <w:multiLevelType w:val="hybridMultilevel"/>
     <w:tmpl w:val="7B56396A"/>
@@ -26319,7 +26474,7 @@
       </w:pPr>
     </w:lvl>
   </w:abstractNum>
-  <w:abstractNum w:abstractNumId="30" w15:restartNumberingAfterBreak="0">
+  <w:abstractNum w:abstractNumId="31" w15:restartNumberingAfterBreak="0">
     <w:nsid w:val="79756143"/>
     <w:multiLevelType w:val="hybridMultilevel"/>
     <w:tmpl w:val="6634534C"/>
@@ -26432,7 +26587,7 @@
       </w:rPr>
     </w:lvl>
   </w:abstractNum>
-  <w:abstractNum w:abstractNumId="31" w15:restartNumberingAfterBreak="0">
+  <w:abstractNum w:abstractNumId="32" w15:restartNumberingAfterBreak="0">
     <w:nsid w:val="7D4501B9"/>
     <w:multiLevelType w:val="hybridMultilevel"/>
     <w:tmpl w:val="83B64B2C"/>
@@ -26546,28 +26701,28 @@
     </w:lvl>
   </w:abstractNum>
   <w:num w:numId="1" w16cid:durableId="1203133388">
+    <w:abstractNumId w:val="24"/>
+  </w:num>
+  <w:num w:numId="2" w16cid:durableId="136774178">
+    <w:abstractNumId w:val="30"/>
+  </w:num>
+  <w:num w:numId="3" w16cid:durableId="1603030040">
+    <w:abstractNumId w:val="31"/>
+  </w:num>
+  <w:num w:numId="4" w16cid:durableId="328798260">
+    <w:abstractNumId w:val="19"/>
+  </w:num>
+  <w:num w:numId="5" w16cid:durableId="1009866966">
     <w:abstractNumId w:val="23"/>
   </w:num>
-  <w:num w:numId="2" w16cid:durableId="136774178">
-    <w:abstractNumId w:val="29"/>
-  </w:num>
-  <w:num w:numId="3" w16cid:durableId="1603030040">
-    <w:abstractNumId w:val="30"/>
-  </w:num>
-  <w:num w:numId="4" w16cid:durableId="328798260">
-    <w:abstractNumId w:val="18"/>
-  </w:num>
-  <w:num w:numId="5" w16cid:durableId="1009866966">
-    <w:abstractNumId w:val="22"/>
-  </w:num>
   <w:num w:numId="6" w16cid:durableId="886719929">
-    <w:abstractNumId w:val="31"/>
+    <w:abstractNumId w:val="32"/>
   </w:num>
   <w:num w:numId="7" w16cid:durableId="1211848318">
-    <w:abstractNumId w:val="19"/>
+    <w:abstractNumId w:val="20"/>
   </w:num>
   <w:num w:numId="8" w16cid:durableId="1892644994">
-    <w:abstractNumId w:val="26"/>
+    <w:abstractNumId w:val="27"/>
   </w:num>
   <w:num w:numId="9" w16cid:durableId="644434909">
     <w:abstractNumId w:val="11"/>
@@ -26582,10 +26737,10 @@
     <w:abstractNumId w:val="15"/>
   </w:num>
   <w:num w:numId="13" w16cid:durableId="1861966893">
-    <w:abstractNumId w:val="25"/>
+    <w:abstractNumId w:val="26"/>
   </w:num>
   <w:num w:numId="14" w16cid:durableId="246967512">
-    <w:abstractNumId w:val="17"/>
+    <w:abstractNumId w:val="18"/>
   </w:num>
   <w:num w:numId="15" w16cid:durableId="177357244">
     <w:abstractNumId w:val="3"/>
@@ -26603,7 +26758,7 @@
     <w:abstractNumId w:val="12"/>
   </w:num>
   <w:num w:numId="20" w16cid:durableId="416832827">
-    <w:abstractNumId w:val="28"/>
+    <w:abstractNumId w:val="29"/>
   </w:num>
   <w:num w:numId="21" w16cid:durableId="1931964657">
     <w:abstractNumId w:val="9"/>
@@ -26612,16 +26767,16 @@
     <w:abstractNumId w:val="7"/>
   </w:num>
   <w:num w:numId="23" w16cid:durableId="927037760">
-    <w:abstractNumId w:val="27"/>
+    <w:abstractNumId w:val="28"/>
   </w:num>
   <w:num w:numId="24" w16cid:durableId="1124302307">
     <w:abstractNumId w:val="14"/>
   </w:num>
   <w:num w:numId="25" w16cid:durableId="483739954">
-    <w:abstractNumId w:val="16"/>
+    <w:abstractNumId w:val="17"/>
   </w:num>
   <w:num w:numId="26" w16cid:durableId="224683690">
-    <w:abstractNumId w:val="21"/>
+    <w:abstractNumId w:val="22"/>
   </w:num>
   <w:num w:numId="27" w16cid:durableId="1440758041">
     <w:abstractNumId w:val="13"/>
@@ -26630,16 +26785,19 @@
     <w:abstractNumId w:val="1"/>
   </w:num>
   <w:num w:numId="29" w16cid:durableId="309331396">
-    <w:abstractNumId w:val="24"/>
+    <w:abstractNumId w:val="25"/>
   </w:num>
   <w:num w:numId="30" w16cid:durableId="2095396702">
-    <w:abstractNumId w:val="20"/>
+    <w:abstractNumId w:val="21"/>
   </w:num>
   <w:num w:numId="31" w16cid:durableId="1696226800">
     <w:abstractNumId w:val="5"/>
   </w:num>
   <w:num w:numId="32" w16cid:durableId="1371146804">
     <w:abstractNumId w:val="4"/>
+  </w:num>
+  <w:num w:numId="33" w16cid:durableId="389621840">
+    <w:abstractNumId w:val="16"/>
   </w:num>
 </w:numbering>
 </file>

</xml_diff>

<commit_message>
doc(rapport): Ajout d'un annexes
</commit_message>
<xml_diff>
--- a/DOC/annexes/AugustoRomain-P_DB_GestionAeroport-Rapport.docx
+++ b/DOC/annexes/AugustoRomain-P_DB_GestionAeroport-Rapport.docx
@@ -5245,11 +5245,19 @@
               </w:rPr>
             </w:pPr>
             <w:proofErr w:type="spellStart"/>
-            <w:r>
-              <w:rPr>
-                <w:rFonts w:ascii="Calibri" w:hAnsi="Calibri" w:cs="Calibri"/>
-              </w:rPr>
-              <w:t>aeroport_id</w:t>
+            <w:proofErr w:type="gramStart"/>
+            <w:r>
+              <w:rPr>
+                <w:rFonts w:ascii="Calibri" w:hAnsi="Calibri" w:cs="Calibri"/>
+              </w:rPr>
+              <w:t>aeroport</w:t>
+            </w:r>
+            <w:proofErr w:type="gramEnd"/>
+            <w:r>
+              <w:rPr>
+                <w:rFonts w:ascii="Calibri" w:hAnsi="Calibri" w:cs="Calibri"/>
+              </w:rPr>
+              <w:t>_id</w:t>
             </w:r>
             <w:proofErr w:type="spellEnd"/>
           </w:p>
@@ -5306,11 +5314,19 @@
               </w:rPr>
             </w:pPr>
             <w:proofErr w:type="spellStart"/>
-            <w:r>
-              <w:rPr>
-                <w:rFonts w:ascii="Calibri" w:hAnsi="Calibri" w:cs="Calibri"/>
-              </w:rPr>
-              <w:t>aeroport_nom</w:t>
+            <w:proofErr w:type="gramStart"/>
+            <w:r>
+              <w:rPr>
+                <w:rFonts w:ascii="Calibri" w:hAnsi="Calibri" w:cs="Calibri"/>
+              </w:rPr>
+              <w:t>aeroport</w:t>
+            </w:r>
+            <w:proofErr w:type="gramEnd"/>
+            <w:r>
+              <w:rPr>
+                <w:rFonts w:ascii="Calibri" w:hAnsi="Calibri" w:cs="Calibri"/>
+              </w:rPr>
+              <w:t>_nom</w:t>
             </w:r>
             <w:proofErr w:type="spellEnd"/>
           </w:p>
@@ -5367,11 +5383,19 @@
               </w:rPr>
             </w:pPr>
             <w:proofErr w:type="spellStart"/>
-            <w:r>
-              <w:rPr>
-                <w:rFonts w:ascii="Calibri" w:hAnsi="Calibri" w:cs="Calibri"/>
-              </w:rPr>
-              <w:t>aeroport_code_iata</w:t>
+            <w:proofErr w:type="gramStart"/>
+            <w:r>
+              <w:rPr>
+                <w:rFonts w:ascii="Calibri" w:hAnsi="Calibri" w:cs="Calibri"/>
+              </w:rPr>
+              <w:t>aeroport</w:t>
+            </w:r>
+            <w:proofErr w:type="gramEnd"/>
+            <w:r>
+              <w:rPr>
+                <w:rFonts w:ascii="Calibri" w:hAnsi="Calibri" w:cs="Calibri"/>
+              </w:rPr>
+              <w:t>_code_iata</w:t>
             </w:r>
             <w:proofErr w:type="spellEnd"/>
           </w:p>
@@ -5428,11 +5452,19 @@
               </w:rPr>
             </w:pPr>
             <w:proofErr w:type="spellStart"/>
-            <w:r>
-              <w:rPr>
-                <w:rFonts w:ascii="Calibri" w:hAnsi="Calibri" w:cs="Calibri"/>
-              </w:rPr>
-              <w:t>aeroport_code_icao</w:t>
+            <w:proofErr w:type="gramStart"/>
+            <w:r>
+              <w:rPr>
+                <w:rFonts w:ascii="Calibri" w:hAnsi="Calibri" w:cs="Calibri"/>
+              </w:rPr>
+              <w:t>aeroport</w:t>
+            </w:r>
+            <w:proofErr w:type="gramEnd"/>
+            <w:r>
+              <w:rPr>
+                <w:rFonts w:ascii="Calibri" w:hAnsi="Calibri" w:cs="Calibri"/>
+              </w:rPr>
+              <w:t>_code_icao</w:t>
             </w:r>
             <w:proofErr w:type="spellEnd"/>
           </w:p>
@@ -5566,11 +5598,19 @@
               </w:rPr>
             </w:pPr>
             <w:proofErr w:type="spellStart"/>
-            <w:r>
-              <w:rPr>
-                <w:rFonts w:ascii="Calibri" w:hAnsi="Calibri" w:cs="Calibri"/>
-              </w:rPr>
-              <w:t>compagnie_id</w:t>
+            <w:proofErr w:type="gramStart"/>
+            <w:r>
+              <w:rPr>
+                <w:rFonts w:ascii="Calibri" w:hAnsi="Calibri" w:cs="Calibri"/>
+              </w:rPr>
+              <w:t>compagnie</w:t>
+            </w:r>
+            <w:proofErr w:type="gramEnd"/>
+            <w:r>
+              <w:rPr>
+                <w:rFonts w:ascii="Calibri" w:hAnsi="Calibri" w:cs="Calibri"/>
+              </w:rPr>
+              <w:t>_id</w:t>
             </w:r>
             <w:proofErr w:type="spellEnd"/>
           </w:p>
@@ -5627,11 +5667,19 @@
               </w:rPr>
             </w:pPr>
             <w:proofErr w:type="spellStart"/>
-            <w:r>
-              <w:rPr>
-                <w:rFonts w:ascii="Calibri" w:hAnsi="Calibri" w:cs="Calibri"/>
-              </w:rPr>
-              <w:t>compagnie_nom</w:t>
+            <w:proofErr w:type="gramStart"/>
+            <w:r>
+              <w:rPr>
+                <w:rFonts w:ascii="Calibri" w:hAnsi="Calibri" w:cs="Calibri"/>
+              </w:rPr>
+              <w:t>compagnie</w:t>
+            </w:r>
+            <w:proofErr w:type="gramEnd"/>
+            <w:r>
+              <w:rPr>
+                <w:rFonts w:ascii="Calibri" w:hAnsi="Calibri" w:cs="Calibri"/>
+              </w:rPr>
+              <w:t>_nom</w:t>
             </w:r>
             <w:proofErr w:type="spellEnd"/>
           </w:p>
@@ -5688,11 +5736,19 @@
               </w:rPr>
             </w:pPr>
             <w:proofErr w:type="spellStart"/>
-            <w:r>
-              <w:rPr>
-                <w:rFonts w:ascii="Calibri" w:hAnsi="Calibri" w:cs="Calibri"/>
-              </w:rPr>
-              <w:t>compagnie_code_iata</w:t>
+            <w:proofErr w:type="gramStart"/>
+            <w:r>
+              <w:rPr>
+                <w:rFonts w:ascii="Calibri" w:hAnsi="Calibri" w:cs="Calibri"/>
+              </w:rPr>
+              <w:t>compagnie</w:t>
+            </w:r>
+            <w:proofErr w:type="gramEnd"/>
+            <w:r>
+              <w:rPr>
+                <w:rFonts w:ascii="Calibri" w:hAnsi="Calibri" w:cs="Calibri"/>
+              </w:rPr>
+              <w:t>_code_iata</w:t>
             </w:r>
             <w:proofErr w:type="spellEnd"/>
           </w:p>
@@ -5826,11 +5882,19 @@
               </w:rPr>
             </w:pPr>
             <w:proofErr w:type="spellStart"/>
-            <w:r>
-              <w:rPr>
-                <w:rFonts w:ascii="Calibri" w:hAnsi="Calibri" w:cs="Calibri"/>
-              </w:rPr>
-              <w:t>avion_id</w:t>
+            <w:proofErr w:type="gramStart"/>
+            <w:r>
+              <w:rPr>
+                <w:rFonts w:ascii="Calibri" w:hAnsi="Calibri" w:cs="Calibri"/>
+              </w:rPr>
+              <w:t>avion</w:t>
+            </w:r>
+            <w:proofErr w:type="gramEnd"/>
+            <w:r>
+              <w:rPr>
+                <w:rFonts w:ascii="Calibri" w:hAnsi="Calibri" w:cs="Calibri"/>
+              </w:rPr>
+              <w:t>_id</w:t>
             </w:r>
             <w:proofErr w:type="spellEnd"/>
           </w:p>
@@ -5887,11 +5951,19 @@
               </w:rPr>
             </w:pPr>
             <w:proofErr w:type="spellStart"/>
-            <w:r>
-              <w:rPr>
-                <w:rFonts w:ascii="Calibri" w:hAnsi="Calibri" w:cs="Calibri"/>
-              </w:rPr>
-              <w:t>avion_immatriculation</w:t>
+            <w:proofErr w:type="gramStart"/>
+            <w:r>
+              <w:rPr>
+                <w:rFonts w:ascii="Calibri" w:hAnsi="Calibri" w:cs="Calibri"/>
+              </w:rPr>
+              <w:t>avion</w:t>
+            </w:r>
+            <w:proofErr w:type="gramEnd"/>
+            <w:r>
+              <w:rPr>
+                <w:rFonts w:ascii="Calibri" w:hAnsi="Calibri" w:cs="Calibri"/>
+              </w:rPr>
+              <w:t>_immatriculation</w:t>
             </w:r>
             <w:proofErr w:type="spellEnd"/>
           </w:p>
@@ -5948,11 +6020,19 @@
               </w:rPr>
             </w:pPr>
             <w:proofErr w:type="spellStart"/>
-            <w:r>
-              <w:rPr>
-                <w:rFonts w:ascii="Calibri" w:hAnsi="Calibri" w:cs="Calibri"/>
-              </w:rPr>
-              <w:t>avion_capacite</w:t>
+            <w:proofErr w:type="gramStart"/>
+            <w:r>
+              <w:rPr>
+                <w:rFonts w:ascii="Calibri" w:hAnsi="Calibri" w:cs="Calibri"/>
+              </w:rPr>
+              <w:t>avion</w:t>
+            </w:r>
+            <w:proofErr w:type="gramEnd"/>
+            <w:r>
+              <w:rPr>
+                <w:rFonts w:ascii="Calibri" w:hAnsi="Calibri" w:cs="Calibri"/>
+              </w:rPr>
+              <w:t>_capacite</w:t>
             </w:r>
             <w:proofErr w:type="spellEnd"/>
           </w:p>
@@ -6086,11 +6166,19 @@
               </w:rPr>
             </w:pPr>
             <w:proofErr w:type="spellStart"/>
-            <w:r>
-              <w:rPr>
-                <w:rFonts w:ascii="Calibri" w:hAnsi="Calibri" w:cs="Calibri"/>
-              </w:rPr>
-              <w:t>type_avion_id</w:t>
+            <w:proofErr w:type="gramStart"/>
+            <w:r>
+              <w:rPr>
+                <w:rFonts w:ascii="Calibri" w:hAnsi="Calibri" w:cs="Calibri"/>
+              </w:rPr>
+              <w:t>type</w:t>
+            </w:r>
+            <w:proofErr w:type="gramEnd"/>
+            <w:r>
+              <w:rPr>
+                <w:rFonts w:ascii="Calibri" w:hAnsi="Calibri" w:cs="Calibri"/>
+              </w:rPr>
+              <w:t>_avion_id</w:t>
             </w:r>
             <w:proofErr w:type="spellEnd"/>
           </w:p>
@@ -6147,11 +6235,19 @@
               </w:rPr>
             </w:pPr>
             <w:proofErr w:type="spellStart"/>
-            <w:r>
-              <w:rPr>
-                <w:rFonts w:ascii="Calibri" w:hAnsi="Calibri" w:cs="Calibri"/>
-              </w:rPr>
-              <w:t>type_avion_nom</w:t>
+            <w:proofErr w:type="gramStart"/>
+            <w:r>
+              <w:rPr>
+                <w:rFonts w:ascii="Calibri" w:hAnsi="Calibri" w:cs="Calibri"/>
+              </w:rPr>
+              <w:t>type</w:t>
+            </w:r>
+            <w:proofErr w:type="gramEnd"/>
+            <w:r>
+              <w:rPr>
+                <w:rFonts w:ascii="Calibri" w:hAnsi="Calibri" w:cs="Calibri"/>
+              </w:rPr>
+              <w:t>_avion_nom</w:t>
             </w:r>
             <w:proofErr w:type="spellEnd"/>
           </w:p>
@@ -6208,11 +6304,19 @@
               </w:rPr>
             </w:pPr>
             <w:proofErr w:type="spellStart"/>
-            <w:r>
-              <w:rPr>
-                <w:rFonts w:ascii="Calibri" w:hAnsi="Calibri" w:cs="Calibri"/>
-              </w:rPr>
-              <w:t>type_avion_description</w:t>
+            <w:proofErr w:type="gramStart"/>
+            <w:r>
+              <w:rPr>
+                <w:rFonts w:ascii="Calibri" w:hAnsi="Calibri" w:cs="Calibri"/>
+              </w:rPr>
+              <w:t>type</w:t>
+            </w:r>
+            <w:proofErr w:type="gramEnd"/>
+            <w:r>
+              <w:rPr>
+                <w:rFonts w:ascii="Calibri" w:hAnsi="Calibri" w:cs="Calibri"/>
+              </w:rPr>
+              <w:t>_avion_description</w:t>
             </w:r>
             <w:proofErr w:type="spellEnd"/>
           </w:p>
@@ -6346,11 +6450,19 @@
               </w:rPr>
             </w:pPr>
             <w:proofErr w:type="spellStart"/>
-            <w:r>
-              <w:rPr>
-                <w:rFonts w:ascii="Calibri" w:hAnsi="Calibri" w:cs="Calibri"/>
-              </w:rPr>
-              <w:t>programme_vol_id</w:t>
+            <w:proofErr w:type="gramStart"/>
+            <w:r>
+              <w:rPr>
+                <w:rFonts w:ascii="Calibri" w:hAnsi="Calibri" w:cs="Calibri"/>
+              </w:rPr>
+              <w:t>programme</w:t>
+            </w:r>
+            <w:proofErr w:type="gramEnd"/>
+            <w:r>
+              <w:rPr>
+                <w:rFonts w:ascii="Calibri" w:hAnsi="Calibri" w:cs="Calibri"/>
+              </w:rPr>
+              <w:t>_vol_id</w:t>
             </w:r>
             <w:proofErr w:type="spellEnd"/>
           </w:p>
@@ -6407,11 +6519,19 @@
               </w:rPr>
             </w:pPr>
             <w:proofErr w:type="spellStart"/>
-            <w:r>
-              <w:rPr>
-                <w:rFonts w:ascii="Calibri" w:hAnsi="Calibri" w:cs="Calibri"/>
-              </w:rPr>
-              <w:t>vol_numero</w:t>
+            <w:proofErr w:type="gramStart"/>
+            <w:r>
+              <w:rPr>
+                <w:rFonts w:ascii="Calibri" w:hAnsi="Calibri" w:cs="Calibri"/>
+              </w:rPr>
+              <w:t>vol</w:t>
+            </w:r>
+            <w:proofErr w:type="gramEnd"/>
+            <w:r>
+              <w:rPr>
+                <w:rFonts w:ascii="Calibri" w:hAnsi="Calibri" w:cs="Calibri"/>
+              </w:rPr>
+              <w:t>_numero</w:t>
             </w:r>
             <w:proofErr w:type="spellEnd"/>
           </w:p>
@@ -6468,11 +6588,19 @@
               </w:rPr>
             </w:pPr>
             <w:proofErr w:type="spellStart"/>
-            <w:r>
-              <w:rPr>
-                <w:rFonts w:ascii="Calibri" w:hAnsi="Calibri" w:cs="Calibri"/>
-              </w:rPr>
-              <w:t>programme_heure_depart</w:t>
+            <w:proofErr w:type="gramStart"/>
+            <w:r>
+              <w:rPr>
+                <w:rFonts w:ascii="Calibri" w:hAnsi="Calibri" w:cs="Calibri"/>
+              </w:rPr>
+              <w:t>programme</w:t>
+            </w:r>
+            <w:proofErr w:type="gramEnd"/>
+            <w:r>
+              <w:rPr>
+                <w:rFonts w:ascii="Calibri" w:hAnsi="Calibri" w:cs="Calibri"/>
+              </w:rPr>
+              <w:t>_heure_depart</w:t>
             </w:r>
             <w:proofErr w:type="spellEnd"/>
           </w:p>
@@ -6529,11 +6657,19 @@
               </w:rPr>
             </w:pPr>
             <w:proofErr w:type="spellStart"/>
-            <w:r>
-              <w:rPr>
-                <w:rFonts w:ascii="Calibri" w:hAnsi="Calibri" w:cs="Calibri"/>
-              </w:rPr>
-              <w:t>programme_heure_arrivee</w:t>
+            <w:proofErr w:type="gramStart"/>
+            <w:r>
+              <w:rPr>
+                <w:rFonts w:ascii="Calibri" w:hAnsi="Calibri" w:cs="Calibri"/>
+              </w:rPr>
+              <w:t>programme</w:t>
+            </w:r>
+            <w:proofErr w:type="gramEnd"/>
+            <w:r>
+              <w:rPr>
+                <w:rFonts w:ascii="Calibri" w:hAnsi="Calibri" w:cs="Calibri"/>
+              </w:rPr>
+              <w:t>_heure_arrivee</w:t>
             </w:r>
             <w:proofErr w:type="spellEnd"/>
           </w:p>
@@ -6667,11 +6803,19 @@
               </w:rPr>
             </w:pPr>
             <w:proofErr w:type="spellStart"/>
-            <w:r>
-              <w:rPr>
-                <w:rFonts w:ascii="Calibri" w:hAnsi="Calibri" w:cs="Calibri"/>
-              </w:rPr>
-              <w:t>jour_semaine_id</w:t>
+            <w:proofErr w:type="gramStart"/>
+            <w:r>
+              <w:rPr>
+                <w:rFonts w:ascii="Calibri" w:hAnsi="Calibri" w:cs="Calibri"/>
+              </w:rPr>
+              <w:t>jour</w:t>
+            </w:r>
+            <w:proofErr w:type="gramEnd"/>
+            <w:r>
+              <w:rPr>
+                <w:rFonts w:ascii="Calibri" w:hAnsi="Calibri" w:cs="Calibri"/>
+              </w:rPr>
+              <w:t>_semaine_id</w:t>
             </w:r>
             <w:proofErr w:type="spellEnd"/>
           </w:p>
@@ -6728,11 +6872,19 @@
               </w:rPr>
             </w:pPr>
             <w:proofErr w:type="spellStart"/>
-            <w:r>
-              <w:rPr>
-                <w:rFonts w:ascii="Calibri" w:hAnsi="Calibri" w:cs="Calibri"/>
-              </w:rPr>
-              <w:t>jour_semaine_libelle</w:t>
+            <w:proofErr w:type="gramStart"/>
+            <w:r>
+              <w:rPr>
+                <w:rFonts w:ascii="Calibri" w:hAnsi="Calibri" w:cs="Calibri"/>
+              </w:rPr>
+              <w:t>jour</w:t>
+            </w:r>
+            <w:proofErr w:type="gramEnd"/>
+            <w:r>
+              <w:rPr>
+                <w:rFonts w:ascii="Calibri" w:hAnsi="Calibri" w:cs="Calibri"/>
+              </w:rPr>
+              <w:t>_semaine_libelle</w:t>
             </w:r>
             <w:proofErr w:type="spellEnd"/>
           </w:p>
@@ -6866,11 +7018,19 @@
               </w:rPr>
             </w:pPr>
             <w:proofErr w:type="spellStart"/>
-            <w:r>
-              <w:rPr>
-                <w:rFonts w:ascii="Calibri" w:hAnsi="Calibri" w:cs="Calibri"/>
-              </w:rPr>
-              <w:t>vol_id</w:t>
+            <w:proofErr w:type="gramStart"/>
+            <w:r>
+              <w:rPr>
+                <w:rFonts w:ascii="Calibri" w:hAnsi="Calibri" w:cs="Calibri"/>
+              </w:rPr>
+              <w:t>vol</w:t>
+            </w:r>
+            <w:proofErr w:type="gramEnd"/>
+            <w:r>
+              <w:rPr>
+                <w:rFonts w:ascii="Calibri" w:hAnsi="Calibri" w:cs="Calibri"/>
+              </w:rPr>
+              <w:t>_id</w:t>
             </w:r>
             <w:proofErr w:type="spellEnd"/>
           </w:p>
@@ -6927,11 +7087,19 @@
               </w:rPr>
             </w:pPr>
             <w:proofErr w:type="spellStart"/>
-            <w:r>
-              <w:rPr>
-                <w:rFonts w:ascii="Calibri" w:hAnsi="Calibri" w:cs="Calibri"/>
-              </w:rPr>
-              <w:t>vol_date</w:t>
+            <w:proofErr w:type="gramStart"/>
+            <w:r>
+              <w:rPr>
+                <w:rFonts w:ascii="Calibri" w:hAnsi="Calibri" w:cs="Calibri"/>
+              </w:rPr>
+              <w:t>vol</w:t>
+            </w:r>
+            <w:proofErr w:type="gramEnd"/>
+            <w:r>
+              <w:rPr>
+                <w:rFonts w:ascii="Calibri" w:hAnsi="Calibri" w:cs="Calibri"/>
+              </w:rPr>
+              <w:t>_date</w:t>
             </w:r>
             <w:proofErr w:type="spellEnd"/>
           </w:p>
@@ -6988,11 +7156,19 @@
               </w:rPr>
             </w:pPr>
             <w:proofErr w:type="spellStart"/>
-            <w:r>
-              <w:rPr>
-                <w:rFonts w:ascii="Calibri" w:hAnsi="Calibri" w:cs="Calibri"/>
-              </w:rPr>
-              <w:t>vol_heure_depart</w:t>
+            <w:proofErr w:type="gramStart"/>
+            <w:r>
+              <w:rPr>
+                <w:rFonts w:ascii="Calibri" w:hAnsi="Calibri" w:cs="Calibri"/>
+              </w:rPr>
+              <w:t>vol</w:t>
+            </w:r>
+            <w:proofErr w:type="gramEnd"/>
+            <w:r>
+              <w:rPr>
+                <w:rFonts w:ascii="Calibri" w:hAnsi="Calibri" w:cs="Calibri"/>
+              </w:rPr>
+              <w:t>_heure_depart</w:t>
             </w:r>
             <w:proofErr w:type="spellEnd"/>
           </w:p>
@@ -7049,11 +7225,19 @@
               </w:rPr>
             </w:pPr>
             <w:proofErr w:type="spellStart"/>
-            <w:r>
-              <w:rPr>
-                <w:rFonts w:ascii="Calibri" w:hAnsi="Calibri" w:cs="Calibri"/>
-              </w:rPr>
-              <w:t>vol_heure_arrivee</w:t>
+            <w:proofErr w:type="gramStart"/>
+            <w:r>
+              <w:rPr>
+                <w:rFonts w:ascii="Calibri" w:hAnsi="Calibri" w:cs="Calibri"/>
+              </w:rPr>
+              <w:t>vol</w:t>
+            </w:r>
+            <w:proofErr w:type="gramEnd"/>
+            <w:r>
+              <w:rPr>
+                <w:rFonts w:ascii="Calibri" w:hAnsi="Calibri" w:cs="Calibri"/>
+              </w:rPr>
+              <w:t>_heure_arrivee</w:t>
             </w:r>
             <w:proofErr w:type="spellEnd"/>
           </w:p>
@@ -7187,11 +7371,19 @@
               </w:rPr>
             </w:pPr>
             <w:proofErr w:type="spellStart"/>
-            <w:r>
-              <w:rPr>
-                <w:rFonts w:ascii="Calibri" w:hAnsi="Calibri" w:cs="Calibri"/>
-              </w:rPr>
-              <w:t>passager_id</w:t>
+            <w:proofErr w:type="gramStart"/>
+            <w:r>
+              <w:rPr>
+                <w:rFonts w:ascii="Calibri" w:hAnsi="Calibri" w:cs="Calibri"/>
+              </w:rPr>
+              <w:t>passager</w:t>
+            </w:r>
+            <w:proofErr w:type="gramEnd"/>
+            <w:r>
+              <w:rPr>
+                <w:rFonts w:ascii="Calibri" w:hAnsi="Calibri" w:cs="Calibri"/>
+              </w:rPr>
+              <w:t>_id</w:t>
             </w:r>
             <w:proofErr w:type="spellEnd"/>
           </w:p>
@@ -7248,11 +7440,19 @@
               </w:rPr>
             </w:pPr>
             <w:proofErr w:type="spellStart"/>
-            <w:r>
-              <w:rPr>
-                <w:rFonts w:ascii="Calibri" w:hAnsi="Calibri" w:cs="Calibri"/>
-              </w:rPr>
-              <w:t>passager_numero_passeport</w:t>
+            <w:proofErr w:type="gramStart"/>
+            <w:r>
+              <w:rPr>
+                <w:rFonts w:ascii="Calibri" w:hAnsi="Calibri" w:cs="Calibri"/>
+              </w:rPr>
+              <w:t>passager</w:t>
+            </w:r>
+            <w:proofErr w:type="gramEnd"/>
+            <w:r>
+              <w:rPr>
+                <w:rFonts w:ascii="Calibri" w:hAnsi="Calibri" w:cs="Calibri"/>
+              </w:rPr>
+              <w:t>_numero_passeport</w:t>
             </w:r>
             <w:proofErr w:type="spellEnd"/>
           </w:p>
@@ -7309,11 +7509,19 @@
               </w:rPr>
             </w:pPr>
             <w:proofErr w:type="spellStart"/>
-            <w:r>
-              <w:rPr>
-                <w:rFonts w:ascii="Calibri" w:hAnsi="Calibri" w:cs="Calibri"/>
-              </w:rPr>
-              <w:t>passager_nom</w:t>
+            <w:proofErr w:type="gramStart"/>
+            <w:r>
+              <w:rPr>
+                <w:rFonts w:ascii="Calibri" w:hAnsi="Calibri" w:cs="Calibri"/>
+              </w:rPr>
+              <w:t>passager</w:t>
+            </w:r>
+            <w:proofErr w:type="gramEnd"/>
+            <w:r>
+              <w:rPr>
+                <w:rFonts w:ascii="Calibri" w:hAnsi="Calibri" w:cs="Calibri"/>
+              </w:rPr>
+              <w:t>_nom</w:t>
             </w:r>
             <w:proofErr w:type="spellEnd"/>
           </w:p>
@@ -7370,11 +7578,19 @@
               </w:rPr>
             </w:pPr>
             <w:proofErr w:type="spellStart"/>
-            <w:r>
-              <w:rPr>
-                <w:rFonts w:ascii="Calibri" w:hAnsi="Calibri" w:cs="Calibri"/>
-              </w:rPr>
-              <w:t>passager_prenom</w:t>
+            <w:proofErr w:type="gramStart"/>
+            <w:r>
+              <w:rPr>
+                <w:rFonts w:ascii="Calibri" w:hAnsi="Calibri" w:cs="Calibri"/>
+              </w:rPr>
+              <w:t>passager</w:t>
+            </w:r>
+            <w:proofErr w:type="gramEnd"/>
+            <w:r>
+              <w:rPr>
+                <w:rFonts w:ascii="Calibri" w:hAnsi="Calibri" w:cs="Calibri"/>
+              </w:rPr>
+              <w:t>_prenom</w:t>
             </w:r>
             <w:proofErr w:type="spellEnd"/>
           </w:p>
@@ -7508,11 +7724,19 @@
               </w:rPr>
             </w:pPr>
             <w:proofErr w:type="spellStart"/>
-            <w:r>
-              <w:rPr>
-                <w:rFonts w:ascii="Calibri" w:hAnsi="Calibri" w:cs="Calibri"/>
-              </w:rPr>
-              <w:t>reservation_id</w:t>
+            <w:proofErr w:type="gramStart"/>
+            <w:r>
+              <w:rPr>
+                <w:rFonts w:ascii="Calibri" w:hAnsi="Calibri" w:cs="Calibri"/>
+              </w:rPr>
+              <w:t>reservation</w:t>
+            </w:r>
+            <w:proofErr w:type="gramEnd"/>
+            <w:r>
+              <w:rPr>
+                <w:rFonts w:ascii="Calibri" w:hAnsi="Calibri" w:cs="Calibri"/>
+              </w:rPr>
+              <w:t>_id</w:t>
             </w:r>
             <w:proofErr w:type="spellEnd"/>
           </w:p>
@@ -7569,11 +7793,19 @@
               </w:rPr>
             </w:pPr>
             <w:proofErr w:type="spellStart"/>
-            <w:r>
-              <w:rPr>
-                <w:rFonts w:ascii="Calibri" w:hAnsi="Calibri" w:cs="Calibri"/>
-              </w:rPr>
-              <w:t>reservation_siege</w:t>
+            <w:proofErr w:type="gramStart"/>
+            <w:r>
+              <w:rPr>
+                <w:rFonts w:ascii="Calibri" w:hAnsi="Calibri" w:cs="Calibri"/>
+              </w:rPr>
+              <w:t>reservation</w:t>
+            </w:r>
+            <w:proofErr w:type="gramEnd"/>
+            <w:r>
+              <w:rPr>
+                <w:rFonts w:ascii="Calibri" w:hAnsi="Calibri" w:cs="Calibri"/>
+              </w:rPr>
+              <w:t>_siege</w:t>
             </w:r>
             <w:proofErr w:type="spellEnd"/>
           </w:p>
@@ -7630,11 +7862,19 @@
               </w:rPr>
             </w:pPr>
             <w:proofErr w:type="spellStart"/>
-            <w:r>
-              <w:rPr>
-                <w:rFonts w:ascii="Calibri" w:hAnsi="Calibri" w:cs="Calibri"/>
-              </w:rPr>
-              <w:t>reservation_prix</w:t>
+            <w:proofErr w:type="gramStart"/>
+            <w:r>
+              <w:rPr>
+                <w:rFonts w:ascii="Calibri" w:hAnsi="Calibri" w:cs="Calibri"/>
+              </w:rPr>
+              <w:t>reservation</w:t>
+            </w:r>
+            <w:proofErr w:type="gramEnd"/>
+            <w:r>
+              <w:rPr>
+                <w:rFonts w:ascii="Calibri" w:hAnsi="Calibri" w:cs="Calibri"/>
+              </w:rPr>
+              <w:t>_prix</w:t>
             </w:r>
             <w:proofErr w:type="spellEnd"/>
           </w:p>
@@ -10833,13 +11073,23 @@
               <w:t>(</w:t>
             </w:r>
             <w:proofErr w:type="spellStart"/>
+            <w:proofErr w:type="gramStart"/>
             <w:r>
               <w:rPr>
                 <w:rFonts w:ascii="DejaVu Sans Mono" w:hAnsi="DejaVu Sans Mono"/>
                 <w:color w:val="25364B"/>
                 <w:sz w:val="18"/>
               </w:rPr>
-              <w:t>aeroport_id</w:t>
+              <w:t>aeroport</w:t>
+            </w:r>
+            <w:proofErr w:type="gramEnd"/>
+            <w:r>
+              <w:rPr>
+                <w:rFonts w:ascii="DejaVu Sans Mono" w:hAnsi="DejaVu Sans Mono"/>
+                <w:color w:val="25364B"/>
+                <w:sz w:val="18"/>
+              </w:rPr>
+              <w:t>_id</w:t>
             </w:r>
             <w:proofErr w:type="spellEnd"/>
             <w:r>
@@ -11022,13 +11272,23 @@
               <w:t xml:space="preserve">    </w:t>
             </w:r>
             <w:proofErr w:type="spellStart"/>
+            <w:proofErr w:type="gramStart"/>
             <w:r>
               <w:rPr>
                 <w:rFonts w:ascii="DejaVu Sans Mono" w:hAnsi="DejaVu Sans Mono"/>
                 <w:color w:val="25364B"/>
                 <w:sz w:val="18"/>
               </w:rPr>
-              <w:t>code_iata</w:t>
+              <w:t>code</w:t>
+            </w:r>
+            <w:proofErr w:type="gramEnd"/>
+            <w:r>
+              <w:rPr>
+                <w:rFonts w:ascii="DejaVu Sans Mono" w:hAnsi="DejaVu Sans Mono"/>
+                <w:color w:val="25364B"/>
+                <w:sz w:val="18"/>
+              </w:rPr>
+              <w:t>_iata</w:t>
             </w:r>
             <w:proofErr w:type="spellEnd"/>
             <w:r>
@@ -11158,13 +11418,23 @@
               <w:t xml:space="preserve">    </w:t>
             </w:r>
             <w:proofErr w:type="spellStart"/>
+            <w:proofErr w:type="gramStart"/>
             <w:r>
               <w:rPr>
                 <w:rFonts w:ascii="DejaVu Sans Mono" w:hAnsi="DejaVu Sans Mono"/>
                 <w:color w:val="25364B"/>
                 <w:sz w:val="18"/>
               </w:rPr>
-              <w:t>code_icao</w:t>
+              <w:t>code</w:t>
+            </w:r>
+            <w:proofErr w:type="gramEnd"/>
+            <w:r>
+              <w:rPr>
+                <w:rFonts w:ascii="DejaVu Sans Mono" w:hAnsi="DejaVu Sans Mono"/>
+                <w:color w:val="25364B"/>
+                <w:sz w:val="18"/>
+              </w:rPr>
+              <w:t>_icao</w:t>
             </w:r>
             <w:proofErr w:type="spellEnd"/>
             <w:r>
@@ -21099,6 +21369,7 @@
               <w:t xml:space="preserve">, </w:t>
             </w:r>
             <w:proofErr w:type="spellStart"/>
+            <w:proofErr w:type="gramStart"/>
             <w:r>
               <w:rPr>
                 <w:lang w:val="en-US"/>
@@ -21106,6 +21377,7 @@
               <w:t>P.prenom</w:t>
             </w:r>
             <w:proofErr w:type="spellEnd"/>
+            <w:proofErr w:type="gramEnd"/>
             <w:r>
               <w:rPr>
                 <w:lang w:val="en-US"/>
@@ -21113,11 +21385,19 @@
               <w:t xml:space="preserve">, </w:t>
             </w:r>
             <w:proofErr w:type="spellStart"/>
+            <w:proofErr w:type="gramStart"/>
             <w:r>
               <w:rPr>
                 <w:lang w:val="en-US"/>
               </w:rPr>
-              <w:t>P.numero_passeport</w:t>
+              <w:t>P.numero</w:t>
+            </w:r>
+            <w:proofErr w:type="gramEnd"/>
+            <w:r>
+              <w:rPr>
+                <w:lang w:val="en-US"/>
+              </w:rPr>
+              <w:t>_passeport</w:t>
             </w:r>
             <w:proofErr w:type="spellEnd"/>
             <w:r>
@@ -21303,11 +21583,19 @@
               <w:t xml:space="preserve">JOIN t_reservation AS R ON </w:t>
             </w:r>
             <w:proofErr w:type="spellStart"/>
+            <w:proofErr w:type="gramStart"/>
             <w:r>
               <w:rPr>
                 <w:lang w:val="en-US"/>
               </w:rPr>
-              <w:t>R.passager_fk</w:t>
+              <w:t>R.passager</w:t>
+            </w:r>
+            <w:proofErr w:type="gramEnd"/>
+            <w:r>
+              <w:rPr>
+                <w:lang w:val="en-US"/>
+              </w:rPr>
+              <w:t>_fk</w:t>
             </w:r>
             <w:proofErr w:type="spellEnd"/>
             <w:r>
@@ -21317,11 +21605,19 @@
               <w:t xml:space="preserve"> = </w:t>
             </w:r>
             <w:proofErr w:type="spellStart"/>
+            <w:proofErr w:type="gramStart"/>
             <w:r>
               <w:rPr>
                 <w:lang w:val="en-US"/>
               </w:rPr>
-              <w:t>P.passager_id</w:t>
+              <w:t>P.passager</w:t>
+            </w:r>
+            <w:proofErr w:type="gramEnd"/>
+            <w:r>
+              <w:rPr>
+                <w:lang w:val="en-US"/>
+              </w:rPr>
+              <w:t>_id</w:t>
             </w:r>
             <w:proofErr w:type="spellEnd"/>
           </w:p>
@@ -21506,11 +21802,19 @@
               <w:t xml:space="preserve"> AS A ON </w:t>
             </w:r>
             <w:proofErr w:type="spellStart"/>
+            <w:proofErr w:type="gramStart"/>
             <w:r>
               <w:rPr>
                 <w:lang w:val="en-US"/>
               </w:rPr>
-              <w:t>A.aeroport_id</w:t>
+              <w:t>A.aeroport</w:t>
+            </w:r>
+            <w:proofErr w:type="gramEnd"/>
+            <w:r>
+              <w:rPr>
+                <w:lang w:val="en-US"/>
+              </w:rPr>
+              <w:t>_id</w:t>
             </w:r>
             <w:proofErr w:type="spellEnd"/>
             <w:r>
@@ -21520,11 +21824,19 @@
               <w:t xml:space="preserve"> = </w:t>
             </w:r>
             <w:proofErr w:type="spellStart"/>
+            <w:proofErr w:type="gramStart"/>
             <w:r>
               <w:rPr>
                 <w:lang w:val="en-US"/>
               </w:rPr>
-              <w:t>V.aeroport_depart_fk</w:t>
+              <w:t>V.aeroport</w:t>
+            </w:r>
+            <w:proofErr w:type="gramEnd"/>
+            <w:r>
+              <w:rPr>
+                <w:lang w:val="en-US"/>
+              </w:rPr>
+              <w:t>_depart_fk</w:t>
             </w:r>
             <w:proofErr w:type="spellEnd"/>
             <w:r>
@@ -21951,11 +22263,19 @@
                 <w:lang w:val="en-US"/>
               </w:rPr>
             </w:pPr>
+            <w:proofErr w:type="gramStart"/>
             <w:r>
               <w:rPr>
                 <w:lang w:val="en-US"/>
               </w:rPr>
-              <w:t>FROM t_reservation</w:t>
+              <w:t>FROM t</w:t>
+            </w:r>
+            <w:proofErr w:type="gramEnd"/>
+            <w:r>
+              <w:rPr>
+                <w:lang w:val="en-US"/>
+              </w:rPr>
+              <w:t>_reservation</w:t>
             </w:r>
           </w:p>
         </w:tc>
@@ -22758,8 +23078,59 @@
       </w:r>
       <w:bookmarkEnd w:id="21"/>
     </w:p>
+    <w:p>
+      <w:pPr>
+        <w:pStyle w:val="Paragraphedeliste"/>
+        <w:numPr>
+          <w:ilvl w:val="0"/>
+          <w:numId w:val="33"/>
+        </w:numPr>
+        <w:rPr>
+          <w:rFonts w:ascii="Calibri" w:hAnsi="Calibri" w:cs="Calibri"/>
+          <w:b/>
+          <w:bCs/>
+        </w:rPr>
+      </w:pPr>
+      <w:r>
+        <w:rPr>
+          <w:rFonts w:ascii="Calibri" w:hAnsi="Calibri" w:cs="Calibri"/>
+          <w:b/>
+          <w:bCs/>
+        </w:rPr>
+        <w:t>MCD / MLD</w:t>
+      </w:r>
+    </w:p>
+    <w:p>
+      <w:pPr>
+        <w:pStyle w:val="Paragraphedeliste"/>
+        <w:rPr>
+          <w:lang w:val="en-US"/>
+        </w:rPr>
+      </w:pPr>
+      <w:r>
+        <w:rPr>
+          <w:rFonts w:ascii="Calibri" w:hAnsi="Calibri" w:cs="Calibri"/>
+        </w:rPr>
+        <w:t>Source :</w:t>
+      </w:r>
+      <w:r>
+        <w:rPr>
+          <w:lang w:val="en-US"/>
+        </w:rPr>
+        <w:t xml:space="preserve"> </w:t>
+      </w:r>
+      <w:hyperlink r:id="rId32" w:history="1">
+        <w:r>
+          <w:rPr>
+            <w:rStyle w:val="Lienhypertexte"/>
+            <w:lang w:val="en-US"/>
+          </w:rPr>
+          <w:t>..\..\MCD-MLD\db_aeroport.loo</w:t>
+        </w:r>
+      </w:hyperlink>
+    </w:p>
     <w:sectPr>
-      <w:footerReference w:type="first" r:id="rId32"/>
+      <w:footerReference w:type="first" r:id="rId33"/>
       <w:type w:val="continuous"/>
       <w:pgSz w:w="11906" w:h="16838"/>
       <w:pgMar w:top="1417" w:right="1417" w:bottom="1417" w:left="1417" w:header="708" w:footer="708" w:gutter="0"/>
@@ -24833,7 +25204,7 @@
   <w:abstractNum w:abstractNumId="16" w15:restartNumberingAfterBreak="0">
     <w:nsid w:val="452B5311"/>
     <w:multiLevelType w:val="hybridMultilevel"/>
-    <w:tmpl w:val="0950845C"/>
+    <w:tmpl w:val="CD0AAE06"/>
     <w:lvl w:ilvl="0" w:tplc="100C0001">
       <w:start w:val="1"/>
       <w:numFmt w:val="bullet"/>

</xml_diff>

<commit_message>
doc(rapport): Ajout d'un annexe
</commit_message>
<xml_diff>
--- a/DOC/annexes/AugustoRomain-P_DB_GestionAeroport-Rapport.docx
+++ b/DOC/annexes/AugustoRomain-P_DB_GestionAeroport-Rapport.docx
@@ -23085,18 +23085,62 @@
           <w:ilvl w:val="0"/>
           <w:numId w:val="33"/>
         </w:numPr>
+      </w:pPr>
+      <w:r>
         <w:rPr>
           <w:rFonts w:ascii="Calibri" w:hAnsi="Calibri" w:cs="Calibri"/>
           <w:b/>
           <w:bCs/>
         </w:rPr>
-      </w:pPr>
-      <w:r>
+        <w:t>Cahier des charges</w:t>
+      </w:r>
+    </w:p>
+    <w:p>
+      <w:pPr>
+        <w:pStyle w:val="Paragraphedeliste"/>
+      </w:pPr>
+      <w:r>
+        <w:rPr>
+          <w:rFonts w:ascii="Calibri" w:hAnsi="Calibri" w:cs="Calibri"/>
+        </w:rPr>
+        <w:t>Source :</w:t>
+      </w:r>
+      <w:r>
+        <w:t xml:space="preserve"> </w:t>
+      </w:r>
+      <w:hyperlink r:id="rId32" w:history="1">
+        <w:r>
+          <w:rPr>
+            <w:rStyle w:val="Lienhypertexte"/>
+          </w:rPr>
+          <w:t>..\E-P_DB-GCR001-CdC-2026.pdf</w:t>
+        </w:r>
+      </w:hyperlink>
+    </w:p>
+    <w:p>
+      <w:pPr>
+        <w:pStyle w:val="Paragraphedeliste"/>
+      </w:pPr>
+    </w:p>
+    <w:p>
+      <w:pPr>
+        <w:pStyle w:val="Paragraphedeliste"/>
+        <w:numPr>
+          <w:ilvl w:val="0"/>
+          <w:numId w:val="33"/>
+        </w:numPr>
         <w:rPr>
           <w:rFonts w:ascii="Calibri" w:hAnsi="Calibri" w:cs="Calibri"/>
           <w:b/>
           <w:bCs/>
         </w:rPr>
+      </w:pPr>
+      <w:r>
+        <w:rPr>
+          <w:rFonts w:ascii="Calibri" w:hAnsi="Calibri" w:cs="Calibri"/>
+          <w:b/>
+          <w:bCs/>
+        </w:rPr>
         <w:t>MCD / MLD</w:t>
       </w:r>
     </w:p>
@@ -23119,7 +23163,7 @@
         </w:rPr>
         <w:t xml:space="preserve"> </w:t>
       </w:r>
-      <w:hyperlink r:id="rId32" w:history="1">
+      <w:hyperlink r:id="rId33" w:history="1">
         <w:r>
           <w:rPr>
             <w:rStyle w:val="Lienhypertexte"/>
@@ -23130,7 +23174,7 @@
       </w:hyperlink>
     </w:p>
     <w:sectPr>
-      <w:footerReference w:type="first" r:id="rId33"/>
+      <w:footerReference w:type="first" r:id="rId34"/>
       <w:type w:val="continuous"/>
       <w:pgSz w:w="11906" w:h="16838"/>
       <w:pgMar w:top="1417" w:right="1417" w:bottom="1417" w:left="1417" w:header="708" w:footer="708" w:gutter="0"/>
@@ -25204,7 +25248,7 @@
   <w:abstractNum w:abstractNumId="16" w15:restartNumberingAfterBreak="0">
     <w:nsid w:val="452B5311"/>
     <w:multiLevelType w:val="hybridMultilevel"/>
-    <w:tmpl w:val="CD0AAE06"/>
+    <w:tmpl w:val="36F47E8A"/>
     <w:lvl w:ilvl="0" w:tplc="100C0001">
       <w:start w:val="1"/>
       <w:numFmt w:val="bullet"/>

</xml_diff>

<commit_message>
doc(rapport): Amélioration du texte de la création des tables
</commit_message>
<xml_diff>
--- a/DOC/annexes/AugustoRomain-P_DB_GestionAeroport-Rapport.docx
+++ b/DOC/annexes/AugustoRomain-P_DB_GestionAeroport-Rapport.docx
@@ -9817,6 +9817,27 @@
     </w:p>
     <w:p>
       <w:pPr>
+        <w:ind w:left="142"/>
+        <w:jc w:val="both"/>
+        <w:rPr>
+          <w:rFonts w:ascii="Calibri" w:hAnsi="Calibri" w:cs="Calibri"/>
+        </w:rPr>
+      </w:pPr>
+      <w:r>
+        <w:rPr>
+          <w:rFonts w:ascii="Calibri" w:hAnsi="Calibri" w:cs="Calibri"/>
+        </w:rPr>
+        <w:t>Sur la capture d’écran ci-dessous on peut voir que la base de données a été créer avec succès sans erreur.</w:t>
+      </w:r>
+      <w:r>
+        <w:rPr>
+          <w:rFonts w:ascii="Calibri" w:hAnsi="Calibri" w:cs="Calibri"/>
+        </w:rPr>
+        <w:t xml:space="preserve"> Ainsi que le contenu de la base de données.</w:t>
+      </w:r>
+    </w:p>
+    <w:p>
+      <w:pPr>
         <w:keepNext/>
         <w:ind w:left="142"/>
         <w:jc w:val="both"/>
@@ -9878,36 +9899,6 @@
           <w:rFonts w:ascii="Calibri" w:hAnsi="Calibri" w:cs="Calibri"/>
         </w:rPr>
       </w:pPr>
-      <w:r>
-        <w:rPr>
-          <w:rFonts w:ascii="Calibri" w:hAnsi="Calibri" w:cs="Calibri"/>
-        </w:rPr>
-        <w:t xml:space="preserve">Sur la capture d’écran on </w:t>
-      </w:r>
-      <w:r>
-        <w:rPr>
-          <w:rFonts w:ascii="Calibri" w:hAnsi="Calibri" w:cs="Calibri"/>
-        </w:rPr>
-        <w:t>peut</w:t>
-      </w:r>
-      <w:r>
-        <w:rPr>
-          <w:rFonts w:ascii="Calibri" w:hAnsi="Calibri" w:cs="Calibri"/>
-        </w:rPr>
-        <w:t xml:space="preserve"> voir que la base de données </w:t>
-      </w:r>
-      <w:r>
-        <w:rPr>
-          <w:rFonts w:ascii="Calibri" w:hAnsi="Calibri" w:cs="Calibri"/>
-        </w:rPr>
-        <w:t>a</w:t>
-      </w:r>
-      <w:r>
-        <w:rPr>
-          <w:rFonts w:ascii="Calibri" w:hAnsi="Calibri" w:cs="Calibri"/>
-        </w:rPr>
-        <w:t xml:space="preserve"> été créer avec succès sans erreur.</w:t>
-      </w:r>
     </w:p>
     <w:p>
       <w:pPr>
@@ -9972,24 +9963,6 @@
           <w:rFonts w:ascii="Calibri" w:hAnsi="Calibri" w:cs="Calibri"/>
         </w:rPr>
       </w:pPr>
-      <w:r>
-        <w:rPr>
-          <w:rFonts w:ascii="Calibri" w:hAnsi="Calibri" w:cs="Calibri"/>
-        </w:rPr>
-        <w:t xml:space="preserve">Sur la capture d’écran on </w:t>
-      </w:r>
-      <w:r>
-        <w:rPr>
-          <w:rFonts w:ascii="Calibri" w:hAnsi="Calibri" w:cs="Calibri"/>
-        </w:rPr>
-        <w:t>peut</w:t>
-      </w:r>
-      <w:r>
-        <w:rPr>
-          <w:rFonts w:ascii="Calibri" w:hAnsi="Calibri" w:cs="Calibri"/>
-        </w:rPr>
-        <w:t xml:space="preserve"> voir que toutes les tables sont présente.</w:t>
-      </w:r>
     </w:p>
     <w:p>
       <w:pPr>

</xml_diff>

<commit_message>
doc(rapport): Ajout d'une description aux LOAD DATA
</commit_message>
<xml_diff>
--- a/DOC/annexes/AugustoRomain-P_DB_GestionAeroport-Rapport.docx
+++ b/DOC/annexes/AugustoRomain-P_DB_GestionAeroport-Rapport.docx
@@ -4443,15 +4443,7 @@
         <w:ind w:left="284"/>
       </w:pPr>
       <w:r>
-        <w:t xml:space="preserve">Pour comprendre ce que la méthode MERISE et quelles sont les étapes de construction d’un MCD, j’ai utilisé </w:t>
-      </w:r>
-      <w:proofErr w:type="spellStart"/>
-      <w:r>
-        <w:t>ChatGPT</w:t>
-      </w:r>
-      <w:proofErr w:type="spellEnd"/>
-      <w:r>
-        <w:t xml:space="preserve"> ce qui m’a permis de bien comprendre cette méthode et de l’utiliser. </w:t>
+        <w:t xml:space="preserve">Pour comprendre ce que la méthode MERISE et quelles sont les étapes de construction d’un MCD, j’ai utilisé ChatGPT ce qui m’a permis de bien comprendre cette méthode et de l’utiliser. </w:t>
       </w:r>
     </w:p>
     <w:p>
@@ -4479,15 +4471,7 @@
         <w:ind w:left="284"/>
       </w:pPr>
       <w:r>
-        <w:t xml:space="preserve">Prompt </w:t>
-      </w:r>
-      <w:proofErr w:type="spellStart"/>
-      <w:r>
-        <w:t>ChatGPT</w:t>
-      </w:r>
-      <w:proofErr w:type="spellEnd"/>
-      <w:r>
-        <w:t xml:space="preserve"> : </w:t>
+        <w:t xml:space="preserve">Prompt ChatGPT : </w:t>
       </w:r>
     </w:p>
     <w:p>
@@ -5244,22 +5228,12 @@
                 <w:rFonts w:ascii="Calibri" w:hAnsi="Calibri" w:cs="Calibri"/>
               </w:rPr>
             </w:pPr>
-            <w:proofErr w:type="spellStart"/>
-            <w:proofErr w:type="gramStart"/>
-            <w:r>
-              <w:rPr>
-                <w:rFonts w:ascii="Calibri" w:hAnsi="Calibri" w:cs="Calibri"/>
-              </w:rPr>
-              <w:t>aeroport</w:t>
-            </w:r>
-            <w:proofErr w:type="gramEnd"/>
-            <w:r>
-              <w:rPr>
-                <w:rFonts w:ascii="Calibri" w:hAnsi="Calibri" w:cs="Calibri"/>
-              </w:rPr>
-              <w:t>_id</w:t>
-            </w:r>
-            <w:proofErr w:type="spellEnd"/>
+            <w:r>
+              <w:rPr>
+                <w:rFonts w:ascii="Calibri" w:hAnsi="Calibri" w:cs="Calibri"/>
+              </w:rPr>
+              <w:t>aeroport_id</w:t>
+            </w:r>
           </w:p>
         </w:tc>
         <w:tc>
@@ -5314,19 +5288,11 @@
               </w:rPr>
             </w:pPr>
             <w:proofErr w:type="spellStart"/>
-            <w:proofErr w:type="gramStart"/>
-            <w:r>
-              <w:rPr>
-                <w:rFonts w:ascii="Calibri" w:hAnsi="Calibri" w:cs="Calibri"/>
-              </w:rPr>
-              <w:t>aeroport</w:t>
-            </w:r>
-            <w:proofErr w:type="gramEnd"/>
-            <w:r>
-              <w:rPr>
-                <w:rFonts w:ascii="Calibri" w:hAnsi="Calibri" w:cs="Calibri"/>
-              </w:rPr>
-              <w:t>_nom</w:t>
+            <w:r>
+              <w:rPr>
+                <w:rFonts w:ascii="Calibri" w:hAnsi="Calibri" w:cs="Calibri"/>
+              </w:rPr>
+              <w:t>aeroport_nom</w:t>
             </w:r>
             <w:proofErr w:type="spellEnd"/>
           </w:p>
@@ -5383,19 +5349,11 @@
               </w:rPr>
             </w:pPr>
             <w:proofErr w:type="spellStart"/>
-            <w:proofErr w:type="gramStart"/>
-            <w:r>
-              <w:rPr>
-                <w:rFonts w:ascii="Calibri" w:hAnsi="Calibri" w:cs="Calibri"/>
-              </w:rPr>
-              <w:t>aeroport</w:t>
-            </w:r>
-            <w:proofErr w:type="gramEnd"/>
-            <w:r>
-              <w:rPr>
-                <w:rFonts w:ascii="Calibri" w:hAnsi="Calibri" w:cs="Calibri"/>
-              </w:rPr>
-              <w:t>_code_iata</w:t>
+            <w:r>
+              <w:rPr>
+                <w:rFonts w:ascii="Calibri" w:hAnsi="Calibri" w:cs="Calibri"/>
+              </w:rPr>
+              <w:t>aeroport_code_iata</w:t>
             </w:r>
             <w:proofErr w:type="spellEnd"/>
           </w:p>
@@ -5452,19 +5410,11 @@
               </w:rPr>
             </w:pPr>
             <w:proofErr w:type="spellStart"/>
-            <w:proofErr w:type="gramStart"/>
-            <w:r>
-              <w:rPr>
-                <w:rFonts w:ascii="Calibri" w:hAnsi="Calibri" w:cs="Calibri"/>
-              </w:rPr>
-              <w:t>aeroport</w:t>
-            </w:r>
-            <w:proofErr w:type="gramEnd"/>
-            <w:r>
-              <w:rPr>
-                <w:rFonts w:ascii="Calibri" w:hAnsi="Calibri" w:cs="Calibri"/>
-              </w:rPr>
-              <w:t>_code_icao</w:t>
+            <w:r>
+              <w:rPr>
+                <w:rFonts w:ascii="Calibri" w:hAnsi="Calibri" w:cs="Calibri"/>
+              </w:rPr>
+              <w:t>aeroport_code_icao</w:t>
             </w:r>
             <w:proofErr w:type="spellEnd"/>
           </w:p>
@@ -5598,19 +5548,11 @@
               </w:rPr>
             </w:pPr>
             <w:proofErr w:type="spellStart"/>
-            <w:proofErr w:type="gramStart"/>
-            <w:r>
-              <w:rPr>
-                <w:rFonts w:ascii="Calibri" w:hAnsi="Calibri" w:cs="Calibri"/>
-              </w:rPr>
-              <w:t>compagnie</w:t>
-            </w:r>
-            <w:proofErr w:type="gramEnd"/>
-            <w:r>
-              <w:rPr>
-                <w:rFonts w:ascii="Calibri" w:hAnsi="Calibri" w:cs="Calibri"/>
-              </w:rPr>
-              <w:t>_id</w:t>
+            <w:r>
+              <w:rPr>
+                <w:rFonts w:ascii="Calibri" w:hAnsi="Calibri" w:cs="Calibri"/>
+              </w:rPr>
+              <w:t>compagnie_id</w:t>
             </w:r>
             <w:proofErr w:type="spellEnd"/>
           </w:p>
@@ -5667,19 +5609,11 @@
               </w:rPr>
             </w:pPr>
             <w:proofErr w:type="spellStart"/>
-            <w:proofErr w:type="gramStart"/>
-            <w:r>
-              <w:rPr>
-                <w:rFonts w:ascii="Calibri" w:hAnsi="Calibri" w:cs="Calibri"/>
-              </w:rPr>
-              <w:t>compagnie</w:t>
-            </w:r>
-            <w:proofErr w:type="gramEnd"/>
-            <w:r>
-              <w:rPr>
-                <w:rFonts w:ascii="Calibri" w:hAnsi="Calibri" w:cs="Calibri"/>
-              </w:rPr>
-              <w:t>_nom</w:t>
+            <w:r>
+              <w:rPr>
+                <w:rFonts w:ascii="Calibri" w:hAnsi="Calibri" w:cs="Calibri"/>
+              </w:rPr>
+              <w:t>compagnie_nom</w:t>
             </w:r>
             <w:proofErr w:type="spellEnd"/>
           </w:p>
@@ -5736,19 +5670,11 @@
               </w:rPr>
             </w:pPr>
             <w:proofErr w:type="spellStart"/>
-            <w:proofErr w:type="gramStart"/>
-            <w:r>
-              <w:rPr>
-                <w:rFonts w:ascii="Calibri" w:hAnsi="Calibri" w:cs="Calibri"/>
-              </w:rPr>
-              <w:t>compagnie</w:t>
-            </w:r>
-            <w:proofErr w:type="gramEnd"/>
-            <w:r>
-              <w:rPr>
-                <w:rFonts w:ascii="Calibri" w:hAnsi="Calibri" w:cs="Calibri"/>
-              </w:rPr>
-              <w:t>_code_iata</w:t>
+            <w:r>
+              <w:rPr>
+                <w:rFonts w:ascii="Calibri" w:hAnsi="Calibri" w:cs="Calibri"/>
+              </w:rPr>
+              <w:t>compagnie_code_iata</w:t>
             </w:r>
             <w:proofErr w:type="spellEnd"/>
           </w:p>
@@ -5882,19 +5808,11 @@
               </w:rPr>
             </w:pPr>
             <w:proofErr w:type="spellStart"/>
-            <w:proofErr w:type="gramStart"/>
-            <w:r>
-              <w:rPr>
-                <w:rFonts w:ascii="Calibri" w:hAnsi="Calibri" w:cs="Calibri"/>
-              </w:rPr>
-              <w:t>avion</w:t>
-            </w:r>
-            <w:proofErr w:type="gramEnd"/>
-            <w:r>
-              <w:rPr>
-                <w:rFonts w:ascii="Calibri" w:hAnsi="Calibri" w:cs="Calibri"/>
-              </w:rPr>
-              <w:t>_id</w:t>
+            <w:r>
+              <w:rPr>
+                <w:rFonts w:ascii="Calibri" w:hAnsi="Calibri" w:cs="Calibri"/>
+              </w:rPr>
+              <w:t>avion_id</w:t>
             </w:r>
             <w:proofErr w:type="spellEnd"/>
           </w:p>
@@ -5951,19 +5869,11 @@
               </w:rPr>
             </w:pPr>
             <w:proofErr w:type="spellStart"/>
-            <w:proofErr w:type="gramStart"/>
-            <w:r>
-              <w:rPr>
-                <w:rFonts w:ascii="Calibri" w:hAnsi="Calibri" w:cs="Calibri"/>
-              </w:rPr>
-              <w:t>avion</w:t>
-            </w:r>
-            <w:proofErr w:type="gramEnd"/>
-            <w:r>
-              <w:rPr>
-                <w:rFonts w:ascii="Calibri" w:hAnsi="Calibri" w:cs="Calibri"/>
-              </w:rPr>
-              <w:t>_immatriculation</w:t>
+            <w:r>
+              <w:rPr>
+                <w:rFonts w:ascii="Calibri" w:hAnsi="Calibri" w:cs="Calibri"/>
+              </w:rPr>
+              <w:t>avion_immatriculation</w:t>
             </w:r>
             <w:proofErr w:type="spellEnd"/>
           </w:p>
@@ -6020,19 +5930,11 @@
               </w:rPr>
             </w:pPr>
             <w:proofErr w:type="spellStart"/>
-            <w:proofErr w:type="gramStart"/>
-            <w:r>
-              <w:rPr>
-                <w:rFonts w:ascii="Calibri" w:hAnsi="Calibri" w:cs="Calibri"/>
-              </w:rPr>
-              <w:t>avion</w:t>
-            </w:r>
-            <w:proofErr w:type="gramEnd"/>
-            <w:r>
-              <w:rPr>
-                <w:rFonts w:ascii="Calibri" w:hAnsi="Calibri" w:cs="Calibri"/>
-              </w:rPr>
-              <w:t>_capacite</w:t>
+            <w:r>
+              <w:rPr>
+                <w:rFonts w:ascii="Calibri" w:hAnsi="Calibri" w:cs="Calibri"/>
+              </w:rPr>
+              <w:t>avion_capacite</w:t>
             </w:r>
             <w:proofErr w:type="spellEnd"/>
           </w:p>
@@ -6166,19 +6068,11 @@
               </w:rPr>
             </w:pPr>
             <w:proofErr w:type="spellStart"/>
-            <w:proofErr w:type="gramStart"/>
-            <w:r>
-              <w:rPr>
-                <w:rFonts w:ascii="Calibri" w:hAnsi="Calibri" w:cs="Calibri"/>
-              </w:rPr>
-              <w:t>type</w:t>
-            </w:r>
-            <w:proofErr w:type="gramEnd"/>
-            <w:r>
-              <w:rPr>
-                <w:rFonts w:ascii="Calibri" w:hAnsi="Calibri" w:cs="Calibri"/>
-              </w:rPr>
-              <w:t>_avion_id</w:t>
+            <w:r>
+              <w:rPr>
+                <w:rFonts w:ascii="Calibri" w:hAnsi="Calibri" w:cs="Calibri"/>
+              </w:rPr>
+              <w:t>type_avion_id</w:t>
             </w:r>
             <w:proofErr w:type="spellEnd"/>
           </w:p>
@@ -6235,19 +6129,11 @@
               </w:rPr>
             </w:pPr>
             <w:proofErr w:type="spellStart"/>
-            <w:proofErr w:type="gramStart"/>
-            <w:r>
-              <w:rPr>
-                <w:rFonts w:ascii="Calibri" w:hAnsi="Calibri" w:cs="Calibri"/>
-              </w:rPr>
-              <w:t>type</w:t>
-            </w:r>
-            <w:proofErr w:type="gramEnd"/>
-            <w:r>
-              <w:rPr>
-                <w:rFonts w:ascii="Calibri" w:hAnsi="Calibri" w:cs="Calibri"/>
-              </w:rPr>
-              <w:t>_avion_nom</w:t>
+            <w:r>
+              <w:rPr>
+                <w:rFonts w:ascii="Calibri" w:hAnsi="Calibri" w:cs="Calibri"/>
+              </w:rPr>
+              <w:t>type_avion_nom</w:t>
             </w:r>
             <w:proofErr w:type="spellEnd"/>
           </w:p>
@@ -6304,19 +6190,11 @@
               </w:rPr>
             </w:pPr>
             <w:proofErr w:type="spellStart"/>
-            <w:proofErr w:type="gramStart"/>
-            <w:r>
-              <w:rPr>
-                <w:rFonts w:ascii="Calibri" w:hAnsi="Calibri" w:cs="Calibri"/>
-              </w:rPr>
-              <w:t>type</w:t>
-            </w:r>
-            <w:proofErr w:type="gramEnd"/>
-            <w:r>
-              <w:rPr>
-                <w:rFonts w:ascii="Calibri" w:hAnsi="Calibri" w:cs="Calibri"/>
-              </w:rPr>
-              <w:t>_avion_description</w:t>
+            <w:r>
+              <w:rPr>
+                <w:rFonts w:ascii="Calibri" w:hAnsi="Calibri" w:cs="Calibri"/>
+              </w:rPr>
+              <w:t>type_avion_description</w:t>
             </w:r>
             <w:proofErr w:type="spellEnd"/>
           </w:p>
@@ -6450,19 +6328,11 @@
               </w:rPr>
             </w:pPr>
             <w:proofErr w:type="spellStart"/>
-            <w:proofErr w:type="gramStart"/>
-            <w:r>
-              <w:rPr>
-                <w:rFonts w:ascii="Calibri" w:hAnsi="Calibri" w:cs="Calibri"/>
-              </w:rPr>
-              <w:t>programme</w:t>
-            </w:r>
-            <w:proofErr w:type="gramEnd"/>
-            <w:r>
-              <w:rPr>
-                <w:rFonts w:ascii="Calibri" w:hAnsi="Calibri" w:cs="Calibri"/>
-              </w:rPr>
-              <w:t>_vol_id</w:t>
+            <w:r>
+              <w:rPr>
+                <w:rFonts w:ascii="Calibri" w:hAnsi="Calibri" w:cs="Calibri"/>
+              </w:rPr>
+              <w:t>programme_vol_id</w:t>
             </w:r>
             <w:proofErr w:type="spellEnd"/>
           </w:p>
@@ -6519,19 +6389,11 @@
               </w:rPr>
             </w:pPr>
             <w:proofErr w:type="spellStart"/>
-            <w:proofErr w:type="gramStart"/>
-            <w:r>
-              <w:rPr>
-                <w:rFonts w:ascii="Calibri" w:hAnsi="Calibri" w:cs="Calibri"/>
-              </w:rPr>
-              <w:t>vol</w:t>
-            </w:r>
-            <w:proofErr w:type="gramEnd"/>
-            <w:r>
-              <w:rPr>
-                <w:rFonts w:ascii="Calibri" w:hAnsi="Calibri" w:cs="Calibri"/>
-              </w:rPr>
-              <w:t>_numero</w:t>
+            <w:r>
+              <w:rPr>
+                <w:rFonts w:ascii="Calibri" w:hAnsi="Calibri" w:cs="Calibri"/>
+              </w:rPr>
+              <w:t>vol_numero</w:t>
             </w:r>
             <w:proofErr w:type="spellEnd"/>
           </w:p>
@@ -6588,19 +6450,11 @@
               </w:rPr>
             </w:pPr>
             <w:proofErr w:type="spellStart"/>
-            <w:proofErr w:type="gramStart"/>
-            <w:r>
-              <w:rPr>
-                <w:rFonts w:ascii="Calibri" w:hAnsi="Calibri" w:cs="Calibri"/>
-              </w:rPr>
-              <w:t>programme</w:t>
-            </w:r>
-            <w:proofErr w:type="gramEnd"/>
-            <w:r>
-              <w:rPr>
-                <w:rFonts w:ascii="Calibri" w:hAnsi="Calibri" w:cs="Calibri"/>
-              </w:rPr>
-              <w:t>_heure_depart</w:t>
+            <w:r>
+              <w:rPr>
+                <w:rFonts w:ascii="Calibri" w:hAnsi="Calibri" w:cs="Calibri"/>
+              </w:rPr>
+              <w:t>programme_heure_depart</w:t>
             </w:r>
             <w:proofErr w:type="spellEnd"/>
           </w:p>
@@ -6657,19 +6511,11 @@
               </w:rPr>
             </w:pPr>
             <w:proofErr w:type="spellStart"/>
-            <w:proofErr w:type="gramStart"/>
-            <w:r>
-              <w:rPr>
-                <w:rFonts w:ascii="Calibri" w:hAnsi="Calibri" w:cs="Calibri"/>
-              </w:rPr>
-              <w:t>programme</w:t>
-            </w:r>
-            <w:proofErr w:type="gramEnd"/>
-            <w:r>
-              <w:rPr>
-                <w:rFonts w:ascii="Calibri" w:hAnsi="Calibri" w:cs="Calibri"/>
-              </w:rPr>
-              <w:t>_heure_arrivee</w:t>
+            <w:r>
+              <w:rPr>
+                <w:rFonts w:ascii="Calibri" w:hAnsi="Calibri" w:cs="Calibri"/>
+              </w:rPr>
+              <w:t>programme_heure_arrivee</w:t>
             </w:r>
             <w:proofErr w:type="spellEnd"/>
           </w:p>
@@ -6803,19 +6649,11 @@
               </w:rPr>
             </w:pPr>
             <w:proofErr w:type="spellStart"/>
-            <w:proofErr w:type="gramStart"/>
-            <w:r>
-              <w:rPr>
-                <w:rFonts w:ascii="Calibri" w:hAnsi="Calibri" w:cs="Calibri"/>
-              </w:rPr>
-              <w:t>jour</w:t>
-            </w:r>
-            <w:proofErr w:type="gramEnd"/>
-            <w:r>
-              <w:rPr>
-                <w:rFonts w:ascii="Calibri" w:hAnsi="Calibri" w:cs="Calibri"/>
-              </w:rPr>
-              <w:t>_semaine_id</w:t>
+            <w:r>
+              <w:rPr>
+                <w:rFonts w:ascii="Calibri" w:hAnsi="Calibri" w:cs="Calibri"/>
+              </w:rPr>
+              <w:t>jour_semaine_id</w:t>
             </w:r>
             <w:proofErr w:type="spellEnd"/>
           </w:p>
@@ -6872,19 +6710,11 @@
               </w:rPr>
             </w:pPr>
             <w:proofErr w:type="spellStart"/>
-            <w:proofErr w:type="gramStart"/>
-            <w:r>
-              <w:rPr>
-                <w:rFonts w:ascii="Calibri" w:hAnsi="Calibri" w:cs="Calibri"/>
-              </w:rPr>
-              <w:t>jour</w:t>
-            </w:r>
-            <w:proofErr w:type="gramEnd"/>
-            <w:r>
-              <w:rPr>
-                <w:rFonts w:ascii="Calibri" w:hAnsi="Calibri" w:cs="Calibri"/>
-              </w:rPr>
-              <w:t>_semaine_libelle</w:t>
+            <w:r>
+              <w:rPr>
+                <w:rFonts w:ascii="Calibri" w:hAnsi="Calibri" w:cs="Calibri"/>
+              </w:rPr>
+              <w:t>jour_semaine_libelle</w:t>
             </w:r>
             <w:proofErr w:type="spellEnd"/>
           </w:p>
@@ -7018,19 +6848,11 @@
               </w:rPr>
             </w:pPr>
             <w:proofErr w:type="spellStart"/>
-            <w:proofErr w:type="gramStart"/>
-            <w:r>
-              <w:rPr>
-                <w:rFonts w:ascii="Calibri" w:hAnsi="Calibri" w:cs="Calibri"/>
-              </w:rPr>
-              <w:t>vol</w:t>
-            </w:r>
-            <w:proofErr w:type="gramEnd"/>
-            <w:r>
-              <w:rPr>
-                <w:rFonts w:ascii="Calibri" w:hAnsi="Calibri" w:cs="Calibri"/>
-              </w:rPr>
-              <w:t>_id</w:t>
+            <w:r>
+              <w:rPr>
+                <w:rFonts w:ascii="Calibri" w:hAnsi="Calibri" w:cs="Calibri"/>
+              </w:rPr>
+              <w:t>vol_id</w:t>
             </w:r>
             <w:proofErr w:type="spellEnd"/>
           </w:p>
@@ -7087,19 +6909,11 @@
               </w:rPr>
             </w:pPr>
             <w:proofErr w:type="spellStart"/>
-            <w:proofErr w:type="gramStart"/>
-            <w:r>
-              <w:rPr>
-                <w:rFonts w:ascii="Calibri" w:hAnsi="Calibri" w:cs="Calibri"/>
-              </w:rPr>
-              <w:t>vol</w:t>
-            </w:r>
-            <w:proofErr w:type="gramEnd"/>
-            <w:r>
-              <w:rPr>
-                <w:rFonts w:ascii="Calibri" w:hAnsi="Calibri" w:cs="Calibri"/>
-              </w:rPr>
-              <w:t>_date</w:t>
+            <w:r>
+              <w:rPr>
+                <w:rFonts w:ascii="Calibri" w:hAnsi="Calibri" w:cs="Calibri"/>
+              </w:rPr>
+              <w:t>vol_date</w:t>
             </w:r>
             <w:proofErr w:type="spellEnd"/>
           </w:p>
@@ -7156,19 +6970,11 @@
               </w:rPr>
             </w:pPr>
             <w:proofErr w:type="spellStart"/>
-            <w:proofErr w:type="gramStart"/>
-            <w:r>
-              <w:rPr>
-                <w:rFonts w:ascii="Calibri" w:hAnsi="Calibri" w:cs="Calibri"/>
-              </w:rPr>
-              <w:t>vol</w:t>
-            </w:r>
-            <w:proofErr w:type="gramEnd"/>
-            <w:r>
-              <w:rPr>
-                <w:rFonts w:ascii="Calibri" w:hAnsi="Calibri" w:cs="Calibri"/>
-              </w:rPr>
-              <w:t>_heure_depart</w:t>
+            <w:r>
+              <w:rPr>
+                <w:rFonts w:ascii="Calibri" w:hAnsi="Calibri" w:cs="Calibri"/>
+              </w:rPr>
+              <w:t>vol_heure_depart</w:t>
             </w:r>
             <w:proofErr w:type="spellEnd"/>
           </w:p>
@@ -7225,19 +7031,11 @@
               </w:rPr>
             </w:pPr>
             <w:proofErr w:type="spellStart"/>
-            <w:proofErr w:type="gramStart"/>
-            <w:r>
-              <w:rPr>
-                <w:rFonts w:ascii="Calibri" w:hAnsi="Calibri" w:cs="Calibri"/>
-              </w:rPr>
-              <w:t>vol</w:t>
-            </w:r>
-            <w:proofErr w:type="gramEnd"/>
-            <w:r>
-              <w:rPr>
-                <w:rFonts w:ascii="Calibri" w:hAnsi="Calibri" w:cs="Calibri"/>
-              </w:rPr>
-              <w:t>_heure_arrivee</w:t>
+            <w:r>
+              <w:rPr>
+                <w:rFonts w:ascii="Calibri" w:hAnsi="Calibri" w:cs="Calibri"/>
+              </w:rPr>
+              <w:t>vol_heure_arrivee</w:t>
             </w:r>
             <w:proofErr w:type="spellEnd"/>
           </w:p>
@@ -7371,19 +7169,11 @@
               </w:rPr>
             </w:pPr>
             <w:proofErr w:type="spellStart"/>
-            <w:proofErr w:type="gramStart"/>
-            <w:r>
-              <w:rPr>
-                <w:rFonts w:ascii="Calibri" w:hAnsi="Calibri" w:cs="Calibri"/>
-              </w:rPr>
-              <w:t>passager</w:t>
-            </w:r>
-            <w:proofErr w:type="gramEnd"/>
-            <w:r>
-              <w:rPr>
-                <w:rFonts w:ascii="Calibri" w:hAnsi="Calibri" w:cs="Calibri"/>
-              </w:rPr>
-              <w:t>_id</w:t>
+            <w:r>
+              <w:rPr>
+                <w:rFonts w:ascii="Calibri" w:hAnsi="Calibri" w:cs="Calibri"/>
+              </w:rPr>
+              <w:t>passager_id</w:t>
             </w:r>
             <w:proofErr w:type="spellEnd"/>
           </w:p>
@@ -7440,19 +7230,11 @@
               </w:rPr>
             </w:pPr>
             <w:proofErr w:type="spellStart"/>
-            <w:proofErr w:type="gramStart"/>
-            <w:r>
-              <w:rPr>
-                <w:rFonts w:ascii="Calibri" w:hAnsi="Calibri" w:cs="Calibri"/>
-              </w:rPr>
-              <w:t>passager</w:t>
-            </w:r>
-            <w:proofErr w:type="gramEnd"/>
-            <w:r>
-              <w:rPr>
-                <w:rFonts w:ascii="Calibri" w:hAnsi="Calibri" w:cs="Calibri"/>
-              </w:rPr>
-              <w:t>_numero_passeport</w:t>
+            <w:r>
+              <w:rPr>
+                <w:rFonts w:ascii="Calibri" w:hAnsi="Calibri" w:cs="Calibri"/>
+              </w:rPr>
+              <w:t>passager_numero_passeport</w:t>
             </w:r>
             <w:proofErr w:type="spellEnd"/>
           </w:p>
@@ -7509,19 +7291,11 @@
               </w:rPr>
             </w:pPr>
             <w:proofErr w:type="spellStart"/>
-            <w:proofErr w:type="gramStart"/>
-            <w:r>
-              <w:rPr>
-                <w:rFonts w:ascii="Calibri" w:hAnsi="Calibri" w:cs="Calibri"/>
-              </w:rPr>
-              <w:t>passager</w:t>
-            </w:r>
-            <w:proofErr w:type="gramEnd"/>
-            <w:r>
-              <w:rPr>
-                <w:rFonts w:ascii="Calibri" w:hAnsi="Calibri" w:cs="Calibri"/>
-              </w:rPr>
-              <w:t>_nom</w:t>
+            <w:r>
+              <w:rPr>
+                <w:rFonts w:ascii="Calibri" w:hAnsi="Calibri" w:cs="Calibri"/>
+              </w:rPr>
+              <w:t>passager_nom</w:t>
             </w:r>
             <w:proofErr w:type="spellEnd"/>
           </w:p>
@@ -7578,19 +7352,11 @@
               </w:rPr>
             </w:pPr>
             <w:proofErr w:type="spellStart"/>
-            <w:proofErr w:type="gramStart"/>
-            <w:r>
-              <w:rPr>
-                <w:rFonts w:ascii="Calibri" w:hAnsi="Calibri" w:cs="Calibri"/>
-              </w:rPr>
-              <w:t>passager</w:t>
-            </w:r>
-            <w:proofErr w:type="gramEnd"/>
-            <w:r>
-              <w:rPr>
-                <w:rFonts w:ascii="Calibri" w:hAnsi="Calibri" w:cs="Calibri"/>
-              </w:rPr>
-              <w:t>_prenom</w:t>
+            <w:r>
+              <w:rPr>
+                <w:rFonts w:ascii="Calibri" w:hAnsi="Calibri" w:cs="Calibri"/>
+              </w:rPr>
+              <w:t>passager_prenom</w:t>
             </w:r>
             <w:proofErr w:type="spellEnd"/>
           </w:p>
@@ -7724,19 +7490,11 @@
               </w:rPr>
             </w:pPr>
             <w:proofErr w:type="spellStart"/>
-            <w:proofErr w:type="gramStart"/>
-            <w:r>
-              <w:rPr>
-                <w:rFonts w:ascii="Calibri" w:hAnsi="Calibri" w:cs="Calibri"/>
-              </w:rPr>
-              <w:t>reservation</w:t>
-            </w:r>
-            <w:proofErr w:type="gramEnd"/>
-            <w:r>
-              <w:rPr>
-                <w:rFonts w:ascii="Calibri" w:hAnsi="Calibri" w:cs="Calibri"/>
-              </w:rPr>
-              <w:t>_id</w:t>
+            <w:r>
+              <w:rPr>
+                <w:rFonts w:ascii="Calibri" w:hAnsi="Calibri" w:cs="Calibri"/>
+              </w:rPr>
+              <w:t>reservation_id</w:t>
             </w:r>
             <w:proofErr w:type="spellEnd"/>
           </w:p>
@@ -7793,19 +7551,11 @@
               </w:rPr>
             </w:pPr>
             <w:proofErr w:type="spellStart"/>
-            <w:proofErr w:type="gramStart"/>
-            <w:r>
-              <w:rPr>
-                <w:rFonts w:ascii="Calibri" w:hAnsi="Calibri" w:cs="Calibri"/>
-              </w:rPr>
-              <w:t>reservation</w:t>
-            </w:r>
-            <w:proofErr w:type="gramEnd"/>
-            <w:r>
-              <w:rPr>
-                <w:rFonts w:ascii="Calibri" w:hAnsi="Calibri" w:cs="Calibri"/>
-              </w:rPr>
-              <w:t>_siege</w:t>
+            <w:r>
+              <w:rPr>
+                <w:rFonts w:ascii="Calibri" w:hAnsi="Calibri" w:cs="Calibri"/>
+              </w:rPr>
+              <w:t>reservation_siege</w:t>
             </w:r>
             <w:proofErr w:type="spellEnd"/>
           </w:p>
@@ -7862,19 +7612,11 @@
               </w:rPr>
             </w:pPr>
             <w:proofErr w:type="spellStart"/>
-            <w:proofErr w:type="gramStart"/>
-            <w:r>
-              <w:rPr>
-                <w:rFonts w:ascii="Calibri" w:hAnsi="Calibri" w:cs="Calibri"/>
-              </w:rPr>
-              <w:t>reservation</w:t>
-            </w:r>
-            <w:proofErr w:type="gramEnd"/>
-            <w:r>
-              <w:rPr>
-                <w:rFonts w:ascii="Calibri" w:hAnsi="Calibri" w:cs="Calibri"/>
-              </w:rPr>
-              <w:t>_prix</w:t>
+            <w:r>
+              <w:rPr>
+                <w:rFonts w:ascii="Calibri" w:hAnsi="Calibri" w:cs="Calibri"/>
+              </w:rPr>
+              <w:t>reservation_prix</w:t>
             </w:r>
             <w:proofErr w:type="spellEnd"/>
           </w:p>
@@ -9990,6 +9732,8 @@
         </w:rPr>
       </w:pPr>
       <w:bookmarkStart w:id="13" w:name="_Toc244069785"/>
+      <w:bookmarkStart w:id="14" w:name="_3.3_Chargement_des"/>
+      <w:bookmarkEnd w:id="14"/>
       <w:r>
         <w:rPr>
           <w:rFonts w:ascii="Calibri" w:hAnsi="Calibri" w:cs="Calibri"/>
@@ -10009,7 +9753,6 @@
         <w:jc w:val="both"/>
         <w:rPr>
           <w:rFonts w:ascii="Calibri" w:hAnsi="Calibri" w:cs="Calibri"/>
-          <w:noProof/>
         </w:rPr>
       </w:pPr>
       <w:r>
@@ -10046,6 +9789,12 @@
         <w:rPr>
           <w:rFonts w:ascii="Calibri" w:hAnsi="Calibri" w:cs="Calibri"/>
         </w:rPr>
+        <w:t xml:space="preserve">Au-dessus de chaque tableau, un texte est présent afin d’expliquer comment c’est passé l’insertion, si j’ai rencontré des erreurs ou des complications et comment elles ont été résolues. </w:t>
+      </w:r>
+      <w:r>
+        <w:rPr>
+          <w:rFonts w:ascii="Calibri" w:hAnsi="Calibri" w:cs="Calibri"/>
+        </w:rPr>
         <w:t xml:space="preserve">En dessous de chaque tableau il y a une </w:t>
       </w:r>
       <w:r>
@@ -10064,45 +9813,45 @@
         <w:rPr>
           <w:rFonts w:ascii="Calibri" w:hAnsi="Calibri" w:cs="Calibri"/>
         </w:rPr>
-        <w:t xml:space="preserve">. Les fichiers TSV sont placés dans le dossier « </w:t>
+        <w:t xml:space="preserve">. Les fichiers TSV sont placés dans le dossier « mysql-files », car s’ils ne sont pas dans ce dossier, </w:t>
+      </w:r>
+      <w:r>
+        <w:rPr>
+          <w:rFonts w:ascii="Calibri" w:hAnsi="Calibri" w:cs="Calibri"/>
+        </w:rPr>
+        <w:t>au chargement des fichiers</w:t>
+      </w:r>
+      <w:r>
+        <w:rPr>
+          <w:rFonts w:ascii="Calibri" w:hAnsi="Calibri" w:cs="Calibri"/>
+        </w:rPr>
+        <w:t xml:space="preserve"> </w:t>
+      </w:r>
+      <w:r>
+        <w:rPr>
+          <w:rFonts w:ascii="Calibri" w:hAnsi="Calibri" w:cs="Calibri"/>
+        </w:rPr>
+        <w:t>ça créer</w:t>
+      </w:r>
+      <w:r>
+        <w:rPr>
+          <w:rFonts w:ascii="Calibri" w:hAnsi="Calibri" w:cs="Calibri"/>
+        </w:rPr>
+        <w:t xml:space="preserve"> une erreur liée à « </w:t>
       </w:r>
       <w:proofErr w:type="spellStart"/>
       <w:r>
         <w:rPr>
           <w:rFonts w:ascii="Calibri" w:hAnsi="Calibri" w:cs="Calibri"/>
         </w:rPr>
-        <w:t>mysql</w:t>
+        <w:t>secure_file_priv</w:t>
       </w:r>
       <w:proofErr w:type="spellEnd"/>
       <w:r>
         <w:rPr>
           <w:rFonts w:ascii="Calibri" w:hAnsi="Calibri" w:cs="Calibri"/>
         </w:rPr>
-        <w:t xml:space="preserve">-files », car s’ils ne sont pas dans ce dossier, </w:t>
-      </w:r>
-      <w:r>
-        <w:rPr>
-          <w:rFonts w:ascii="Calibri" w:hAnsi="Calibri" w:cs="Calibri"/>
-        </w:rPr>
-        <w:t>au chargement des fichiers</w:t>
-      </w:r>
-      <w:r>
-        <w:rPr>
-          <w:rFonts w:ascii="Calibri" w:hAnsi="Calibri" w:cs="Calibri"/>
-        </w:rPr>
-        <w:t xml:space="preserve"> </w:t>
-      </w:r>
-      <w:r>
-        <w:rPr>
-          <w:rFonts w:ascii="Calibri" w:hAnsi="Calibri" w:cs="Calibri"/>
-        </w:rPr>
-        <w:t>ça créer</w:t>
-      </w:r>
-      <w:r>
-        <w:rPr>
-          <w:rFonts w:ascii="Calibri" w:hAnsi="Calibri" w:cs="Calibri"/>
-        </w:rPr>
-        <w:t xml:space="preserve"> une erreur liée à « </w:t>
+        <w:t xml:space="preserve"> ». La commande « SHOW VARIABLES LIKE '</w:t>
       </w:r>
       <w:proofErr w:type="spellStart"/>
       <w:r>
@@ -10116,20 +9865,6 @@
         <w:rPr>
           <w:rFonts w:ascii="Calibri" w:hAnsi="Calibri" w:cs="Calibri"/>
         </w:rPr>
-        <w:t xml:space="preserve"> ». La commande « SHOW VARIABLES LIKE '</w:t>
-      </w:r>
-      <w:proofErr w:type="spellStart"/>
-      <w:r>
-        <w:rPr>
-          <w:rFonts w:ascii="Calibri" w:hAnsi="Calibri" w:cs="Calibri"/>
-        </w:rPr>
-        <w:t>secure_file_priv</w:t>
-      </w:r>
-      <w:proofErr w:type="spellEnd"/>
-      <w:r>
-        <w:rPr>
-          <w:rFonts w:ascii="Calibri" w:hAnsi="Calibri" w:cs="Calibri"/>
-        </w:rPr>
         <w:t xml:space="preserve">'; » permet de vérifier le dossier autorisé. Dans </w:t>
       </w:r>
       <w:r>
@@ -10154,21 +9889,20 @@
         <w:rPr>
           <w:rFonts w:ascii="Calibri" w:hAnsi="Calibri" w:cs="Calibri"/>
         </w:rPr>
-        <w:t>« /var/lib/</w:t>
-      </w:r>
-      <w:proofErr w:type="spellStart"/>
-      <w:r>
-        <w:rPr>
-          <w:rFonts w:ascii="Calibri" w:hAnsi="Calibri" w:cs="Calibri"/>
-        </w:rPr>
-        <w:t>mysql</w:t>
-      </w:r>
-      <w:proofErr w:type="spellEnd"/>
-      <w:r>
-        <w:rPr>
-          <w:rFonts w:ascii="Calibri" w:hAnsi="Calibri" w:cs="Calibri"/>
-        </w:rPr>
-        <w:t>-files/ ».</w:t>
+        <w:t>« /var/lib/mysql-files/ ».</w:t>
+      </w:r>
+    </w:p>
+    <w:p>
+      <w:pPr>
+        <w:rPr>
+          <w:rFonts w:ascii="Calibri" w:hAnsi="Calibri" w:cs="Calibri"/>
+        </w:rPr>
+      </w:pPr>
+      <w:r>
+        <w:rPr>
+          <w:rFonts w:ascii="Calibri" w:hAnsi="Calibri" w:cs="Calibri"/>
+        </w:rPr>
+        <w:br w:type="page"/>
       </w:r>
     </w:p>
     <w:p>
@@ -10188,7 +9922,526 @@
           <w:color w:val="000000"/>
           <w:sz w:val="28"/>
         </w:rPr>
+        <w:lastRenderedPageBreak/>
         <w:t>01 Aéroports</w:t>
+      </w:r>
+    </w:p>
+    <w:p>
+      <w:pPr>
+        <w:ind w:left="142"/>
+        <w:rPr>
+          <w:rFonts w:ascii="Calibri" w:hAnsi="Calibri"/>
+          <w:b/>
+          <w:color w:val="000000"/>
+        </w:rPr>
+      </w:pPr>
+      <w:r>
+        <w:rPr>
+          <w:rFonts w:ascii="Calibri" w:hAnsi="Calibri"/>
+          <w:b/>
+          <w:color w:val="000000"/>
+        </w:rPr>
+        <w:t>Déroulement de l’insertion</w:t>
+      </w:r>
+    </w:p>
+    <w:p>
+      <w:pPr>
+        <w:ind w:left="142"/>
+        <w:rPr>
+          <w:rFonts w:ascii="Calibri" w:hAnsi="Calibri" w:cs="Calibri"/>
+        </w:rPr>
+      </w:pPr>
+      <w:r>
+        <w:rPr>
+          <w:rFonts w:ascii="Calibri" w:hAnsi="Calibri" w:cs="Calibri"/>
+        </w:rPr>
+        <w:t xml:space="preserve">L’insertion du fichier t_aeroport à été la plus dure des insertions. </w:t>
+      </w:r>
+    </w:p>
+    <w:p>
+      <w:pPr>
+        <w:ind w:left="142"/>
+        <w:rPr>
+          <w:rFonts w:ascii="Calibri" w:hAnsi="Calibri" w:cs="Calibri"/>
+        </w:rPr>
+      </w:pPr>
+      <w:r>
+        <w:rPr>
+          <w:rFonts w:ascii="Calibri" w:hAnsi="Calibri" w:cs="Calibri"/>
+        </w:rPr>
+        <w:t xml:space="preserve">J’ai tout d’abord eu un premier problème du fait que les fichiers tsv n’étaient pas dans le dossier « mysql-files » et donc cela déclenchait une erreur, </w:t>
+      </w:r>
+      <w:r>
+        <w:rPr>
+          <w:rFonts w:ascii="Calibri" w:hAnsi="Calibri" w:cs="Calibri"/>
+        </w:rPr>
+        <w:t xml:space="preserve">l’explication de la correction de l’erreur est décrite dans le </w:t>
+      </w:r>
+      <w:hyperlink w:anchor="_3.3_Chargement_des" w:history="1">
+        <w:r>
+          <w:rPr>
+            <w:rStyle w:val="Lienhypertexte"/>
+            <w:rFonts w:ascii="Calibri" w:hAnsi="Calibri" w:cs="Calibri"/>
+          </w:rPr>
+          <w:t>cha</w:t>
+        </w:r>
+        <w:r>
+          <w:rPr>
+            <w:rStyle w:val="Lienhypertexte"/>
+            <w:rFonts w:ascii="Calibri" w:hAnsi="Calibri" w:cs="Calibri"/>
+          </w:rPr>
+          <w:t>p</w:t>
+        </w:r>
+        <w:r>
+          <w:rPr>
+            <w:rStyle w:val="Lienhypertexte"/>
+            <w:rFonts w:ascii="Calibri" w:hAnsi="Calibri" w:cs="Calibri"/>
+          </w:rPr>
+          <w:t>itre 3.3.</w:t>
+        </w:r>
+      </w:hyperlink>
+    </w:p>
+    <w:p>
+      <w:pPr>
+        <w:ind w:left="142"/>
+        <w:jc w:val="both"/>
+        <w:rPr>
+          <w:rFonts w:ascii="Calibri" w:hAnsi="Calibri" w:cs="Calibri"/>
+        </w:rPr>
+      </w:pPr>
+      <w:r>
+        <w:rPr>
+          <w:rFonts w:ascii="Calibri" w:hAnsi="Calibri" w:cs="Calibri"/>
+        </w:rPr>
+        <w:t xml:space="preserve">Puis, j’ai eu un second problème : j’avais dans mon code uniquement les lignes 1 à 6 du tableau, ce qui m’a créé cette erreur : </w:t>
+      </w:r>
+      <w:r>
+        <w:rPr>
+          <w:rFonts w:ascii="Calibri" w:hAnsi="Calibri" w:cs="Calibri"/>
+        </w:rPr>
+        <w:t xml:space="preserve">« </w:t>
+      </w:r>
+      <w:r>
+        <w:rPr>
+          <w:rFonts w:ascii="Calibri" w:hAnsi="Calibri" w:cs="Calibri"/>
+          <w:color w:val="EE0000"/>
+        </w:rPr>
+        <w:t>#1406 - Data too long for column 'code_iata' at row 2</w:t>
+      </w:r>
+      <w:r>
+        <w:rPr>
+          <w:rFonts w:ascii="Calibri" w:hAnsi="Calibri" w:cs="Calibri"/>
+        </w:rPr>
+        <w:t xml:space="preserve"> ». </w:t>
+      </w:r>
+      <w:r>
+        <w:rPr>
+          <w:rFonts w:ascii="Calibri" w:hAnsi="Calibri" w:cs="Calibri"/>
+        </w:rPr>
+        <w:t xml:space="preserve">Afin de corriger cette erreur, j’ai donc ouvert le fichier TSV et j’ai vu qu’une valeur de la colonne </w:t>
+      </w:r>
+      <w:r>
+        <w:rPr>
+          <w:rFonts w:ascii="Calibri" w:hAnsi="Calibri" w:cs="Calibri"/>
+        </w:rPr>
+        <w:t>« </w:t>
+      </w:r>
+      <w:r>
+        <w:rPr>
+          <w:rFonts w:ascii="Calibri" w:hAnsi="Calibri" w:cs="Calibri"/>
+        </w:rPr>
+        <w:t>code_iata</w:t>
+      </w:r>
+      <w:r>
+        <w:rPr>
+          <w:rFonts w:ascii="Calibri" w:hAnsi="Calibri" w:cs="Calibri"/>
+        </w:rPr>
+        <w:t> »</w:t>
+      </w:r>
+      <w:r>
+        <w:rPr>
+          <w:rFonts w:ascii="Calibri" w:hAnsi="Calibri" w:cs="Calibri"/>
+        </w:rPr>
+        <w:t xml:space="preserve"> avait pour texte </w:t>
+      </w:r>
+      <w:r>
+        <w:rPr>
+          <w:rFonts w:ascii="Calibri" w:hAnsi="Calibri" w:cs="Calibri"/>
+        </w:rPr>
+        <w:t>« </w:t>
+      </w:r>
+      <w:r>
+        <w:rPr>
+          <w:rFonts w:ascii="Calibri" w:hAnsi="Calibri" w:cs="Calibri"/>
+        </w:rPr>
+        <w:t>NULL</w:t>
+      </w:r>
+      <w:r>
+        <w:rPr>
+          <w:rFonts w:ascii="Calibri" w:hAnsi="Calibri" w:cs="Calibri"/>
+        </w:rPr>
+        <w:t> »</w:t>
+      </w:r>
+      <w:r>
+        <w:rPr>
+          <w:rFonts w:ascii="Calibri" w:hAnsi="Calibri" w:cs="Calibri"/>
+        </w:rPr>
+        <w:t xml:space="preserve">, qui fait 4 caractères, alors que la colonne n’en accepte que 3. MySQL lisait donc le texte </w:t>
+      </w:r>
+      <w:r>
+        <w:rPr>
+          <w:rFonts w:ascii="Calibri" w:hAnsi="Calibri" w:cs="Calibri"/>
+        </w:rPr>
+        <w:t>« </w:t>
+      </w:r>
+      <w:r>
+        <w:rPr>
+          <w:rFonts w:ascii="Calibri" w:hAnsi="Calibri" w:cs="Calibri"/>
+        </w:rPr>
+        <w:t>NULL</w:t>
+      </w:r>
+      <w:r>
+        <w:rPr>
+          <w:rFonts w:ascii="Calibri" w:hAnsi="Calibri" w:cs="Calibri"/>
+        </w:rPr>
+        <w:t> »</w:t>
+      </w:r>
+      <w:r>
+        <w:rPr>
+          <w:rFonts w:ascii="Calibri" w:hAnsi="Calibri" w:cs="Calibri"/>
+        </w:rPr>
+        <w:t xml:space="preserve"> au lieu d’une valeur SQL </w:t>
+      </w:r>
+      <w:r>
+        <w:rPr>
+          <w:rFonts w:ascii="Calibri" w:hAnsi="Calibri" w:cs="Calibri"/>
+        </w:rPr>
+        <w:t>'</w:t>
+      </w:r>
+      <w:r>
+        <w:rPr>
+          <w:rFonts w:ascii="Calibri" w:hAnsi="Calibri" w:cs="Calibri"/>
+        </w:rPr>
+        <w:t>NULL</w:t>
+      </w:r>
+      <w:r>
+        <w:rPr>
+          <w:rFonts w:ascii="Calibri" w:hAnsi="Calibri" w:cs="Calibri"/>
+        </w:rPr>
+        <w:t>'</w:t>
+      </w:r>
+      <w:r>
+        <w:rPr>
+          <w:rFonts w:ascii="Calibri" w:hAnsi="Calibri" w:cs="Calibri"/>
+        </w:rPr>
+        <w:t>.</w:t>
+      </w:r>
+    </w:p>
+    <w:p>
+      <w:pPr>
+        <w:ind w:left="142"/>
+        <w:jc w:val="both"/>
+        <w:rPr>
+          <w:rFonts w:ascii="Calibri" w:hAnsi="Calibri" w:cs="Calibri"/>
+        </w:rPr>
+      </w:pPr>
+      <w:r>
+        <w:rPr>
+          <w:rFonts w:ascii="Calibri" w:hAnsi="Calibri" w:cs="Calibri"/>
+        </w:rPr>
+        <w:t xml:space="preserve">Suite à l’identification du problème, j’ai donc été me renseigner sur ChatGPT en lui expliquant mon problème et en lui demandant de me fournir une documentation claire qui pouvait me donner la correction de ce problème. Il m’a fourni deux documentations : la première est la documentation de MySQL sur « </w:t>
+      </w:r>
+      <w:hyperlink r:id="rId18" w:history="1">
+        <w:r>
+          <w:rPr>
+            <w:rStyle w:val="Lienhypertexte"/>
+            <w:rFonts w:ascii="Calibri" w:hAnsi="Calibri" w:cs="Calibri"/>
+          </w:rPr>
+          <w:t>LOAD DATA Statement</w:t>
+        </w:r>
+      </w:hyperlink>
+      <w:r>
+        <w:rPr>
+          <w:rFonts w:ascii="Calibri" w:hAnsi="Calibri" w:cs="Calibri"/>
+        </w:rPr>
+        <w:t xml:space="preserve"> », dans laquelle j’ai pu comprendre les possibilités de code sur un LOAD DATA, notamment comment utiliser des variables et un SET pour modifier les valeurs avant de les mettre dans les colonnes. La deuxième est également la documentation de MySQL, mais sur « </w:t>
+      </w:r>
+      <w:hyperlink r:id="rId19" w:anchor="function_nullif" w:history="1">
+        <w:r>
+          <w:rPr>
+            <w:rStyle w:val="Lienhypertexte"/>
+            <w:rFonts w:ascii="Calibri" w:hAnsi="Calibri" w:cs="Calibri"/>
+          </w:rPr>
+          <w:t>Flow Control Functions</w:t>
+        </w:r>
+      </w:hyperlink>
+      <w:r>
+        <w:rPr>
+          <w:rFonts w:ascii="Calibri" w:hAnsi="Calibri" w:cs="Calibri"/>
+        </w:rPr>
+        <w:t xml:space="preserve"> », qui m’a permis de savoir quelle fonction utiliser et comment utiliser cette fonction pour convertir le texte </w:t>
+      </w:r>
+      <w:r>
+        <w:rPr>
+          <w:rFonts w:ascii="Calibri" w:hAnsi="Calibri" w:cs="Calibri"/>
+        </w:rPr>
+        <w:t>« </w:t>
+      </w:r>
+      <w:r>
+        <w:rPr>
+          <w:rFonts w:ascii="Calibri" w:hAnsi="Calibri" w:cs="Calibri"/>
+        </w:rPr>
+        <w:t>NULL</w:t>
+      </w:r>
+      <w:r>
+        <w:rPr>
+          <w:rFonts w:ascii="Calibri" w:hAnsi="Calibri" w:cs="Calibri"/>
+        </w:rPr>
+        <w:t> »</w:t>
+      </w:r>
+      <w:r>
+        <w:rPr>
+          <w:rFonts w:ascii="Calibri" w:hAnsi="Calibri" w:cs="Calibri"/>
+        </w:rPr>
+        <w:t xml:space="preserve"> en valeur SQL 'NULL'.</w:t>
+      </w:r>
+    </w:p>
+    <w:p>
+      <w:pPr>
+        <w:ind w:left="142"/>
+        <w:jc w:val="both"/>
+        <w:rPr>
+          <w:rFonts w:ascii="Calibri" w:hAnsi="Calibri" w:cs="Calibri"/>
+        </w:rPr>
+      </w:pPr>
+      <w:r>
+        <w:rPr>
+          <w:rFonts w:ascii="Calibri" w:hAnsi="Calibri" w:cs="Calibri"/>
+        </w:rPr>
+        <w:t xml:space="preserve">J’ai donc ajouté </w:t>
+      </w:r>
+      <w:r>
+        <w:rPr>
+          <w:rFonts w:ascii="Calibri" w:hAnsi="Calibri" w:cs="Calibri"/>
+        </w:rPr>
+        <w:t>« </w:t>
+      </w:r>
+      <w:r>
+        <w:rPr>
+          <w:rFonts w:ascii="Calibri" w:hAnsi="Calibri" w:cs="Calibri"/>
+        </w:rPr>
+        <w:t>(aeroport_id, @iata, @icao, nom)</w:t>
+      </w:r>
+      <w:r>
+        <w:rPr>
+          <w:rFonts w:ascii="Calibri" w:hAnsi="Calibri" w:cs="Calibri"/>
+        </w:rPr>
+        <w:t> »</w:t>
+      </w:r>
+      <w:r>
+        <w:rPr>
+          <w:rFonts w:ascii="Calibri" w:hAnsi="Calibri" w:cs="Calibri"/>
+        </w:rPr>
+        <w:t xml:space="preserve"> pour indiquer l’ordre des valeurs du fichier et récupérer les codes dans les variables </w:t>
+      </w:r>
+      <w:r>
+        <w:rPr>
+          <w:rFonts w:ascii="Calibri" w:hAnsi="Calibri" w:cs="Calibri"/>
+        </w:rPr>
+        <w:t>« </w:t>
+      </w:r>
+      <w:r>
+        <w:rPr>
+          <w:rFonts w:ascii="Calibri" w:hAnsi="Calibri" w:cs="Calibri"/>
+        </w:rPr>
+        <w:t>@iata</w:t>
+      </w:r>
+      <w:r>
+        <w:rPr>
+          <w:rFonts w:ascii="Calibri" w:hAnsi="Calibri" w:cs="Calibri"/>
+        </w:rPr>
+        <w:t> »</w:t>
+      </w:r>
+      <w:r>
+        <w:rPr>
+          <w:rFonts w:ascii="Calibri" w:hAnsi="Calibri" w:cs="Calibri"/>
+        </w:rPr>
+        <w:t xml:space="preserve"> et </w:t>
+      </w:r>
+      <w:r>
+        <w:rPr>
+          <w:rFonts w:ascii="Calibri" w:hAnsi="Calibri" w:cs="Calibri"/>
+        </w:rPr>
+        <w:t>« </w:t>
+      </w:r>
+      <w:r>
+        <w:rPr>
+          <w:rFonts w:ascii="Calibri" w:hAnsi="Calibri" w:cs="Calibri"/>
+        </w:rPr>
+        <w:t>@icao</w:t>
+      </w:r>
+      <w:r>
+        <w:rPr>
+          <w:rFonts w:ascii="Calibri" w:hAnsi="Calibri" w:cs="Calibri"/>
+        </w:rPr>
+        <w:t> »</w:t>
+      </w:r>
+      <w:r>
+        <w:rPr>
+          <w:rFonts w:ascii="Calibri" w:hAnsi="Calibri" w:cs="Calibri"/>
+        </w:rPr>
+        <w:t xml:space="preserve">. Ensuite, avec </w:t>
+      </w:r>
+      <w:r>
+        <w:rPr>
+          <w:rFonts w:ascii="Calibri" w:hAnsi="Calibri" w:cs="Calibri"/>
+        </w:rPr>
+        <w:t>« </w:t>
+      </w:r>
+      <w:r>
+        <w:rPr>
+          <w:rFonts w:ascii="Calibri" w:hAnsi="Calibri" w:cs="Calibri"/>
+        </w:rPr>
+        <w:t>SET code_iata = NULLIF(@iata, 'NULL'), code_icao = NULLIF(@icao, 'NULL')</w:t>
+      </w:r>
+      <w:r>
+        <w:rPr>
+          <w:rFonts w:ascii="Calibri" w:hAnsi="Calibri" w:cs="Calibri"/>
+        </w:rPr>
+        <w:t> »</w:t>
+      </w:r>
+      <w:r>
+        <w:rPr>
+          <w:rFonts w:ascii="Calibri" w:hAnsi="Calibri" w:cs="Calibri"/>
+        </w:rPr>
+        <w:t xml:space="preserve">, le texte </w:t>
+      </w:r>
+      <w:r>
+        <w:rPr>
+          <w:rFonts w:ascii="Calibri" w:hAnsi="Calibri" w:cs="Calibri"/>
+        </w:rPr>
+        <w:t>« </w:t>
+      </w:r>
+      <w:r>
+        <w:rPr>
+          <w:rFonts w:ascii="Calibri" w:hAnsi="Calibri" w:cs="Calibri"/>
+        </w:rPr>
+        <w:t>NULL</w:t>
+      </w:r>
+      <w:r>
+        <w:rPr>
+          <w:rFonts w:ascii="Calibri" w:hAnsi="Calibri" w:cs="Calibri"/>
+        </w:rPr>
+        <w:t xml:space="preserve"> » </w:t>
+      </w:r>
+      <w:r>
+        <w:rPr>
+          <w:rFonts w:ascii="Calibri" w:hAnsi="Calibri" w:cs="Calibri"/>
+        </w:rPr>
+        <w:t xml:space="preserve">est remplacé par une valeur SQL 'NULL', </w:t>
+      </w:r>
+      <w:r>
+        <w:rPr>
+          <w:rFonts w:ascii="Calibri" w:hAnsi="Calibri" w:cs="Calibri"/>
+        </w:rPr>
+        <w:t>alors</w:t>
+      </w:r>
+      <w:r>
+        <w:rPr>
+          <w:rFonts w:ascii="Calibri" w:hAnsi="Calibri" w:cs="Calibri"/>
+        </w:rPr>
+        <w:t xml:space="preserve"> que les autres codes</w:t>
+      </w:r>
+      <w:r>
+        <w:rPr>
+          <w:rFonts w:ascii="Calibri" w:hAnsi="Calibri" w:cs="Calibri"/>
+        </w:rPr>
+        <w:t xml:space="preserve"> (iata et icao)</w:t>
+      </w:r>
+      <w:r>
+        <w:rPr>
+          <w:rFonts w:ascii="Calibri" w:hAnsi="Calibri" w:cs="Calibri"/>
+        </w:rPr>
+        <w:t xml:space="preserve"> sont </w:t>
+      </w:r>
+      <w:r>
+        <w:rPr>
+          <w:rFonts w:ascii="Calibri" w:hAnsi="Calibri" w:cs="Calibri"/>
+        </w:rPr>
+        <w:t>gardés</w:t>
+      </w:r>
+      <w:r>
+        <w:rPr>
+          <w:rFonts w:ascii="Calibri" w:hAnsi="Calibri" w:cs="Calibri"/>
+        </w:rPr>
+        <w:t xml:space="preserve">. Les colonnes </w:t>
+      </w:r>
+      <w:r>
+        <w:rPr>
+          <w:rFonts w:ascii="Calibri" w:hAnsi="Calibri" w:cs="Calibri"/>
+        </w:rPr>
+        <w:t>« code_iata » et « code_icao » doivent</w:t>
+      </w:r>
+      <w:r>
+        <w:rPr>
+          <w:rFonts w:ascii="Calibri" w:hAnsi="Calibri" w:cs="Calibri"/>
+        </w:rPr>
+        <w:t xml:space="preserve"> accepter les valeurs SQL 'NULL'</w:t>
+      </w:r>
+      <w:r>
+        <w:rPr>
+          <w:rFonts w:ascii="Calibri" w:hAnsi="Calibri" w:cs="Calibri"/>
+        </w:rPr>
+        <w:t xml:space="preserve"> </w:t>
+      </w:r>
+      <w:r>
+        <w:rPr>
+          <w:rFonts w:ascii="Calibri" w:hAnsi="Calibri" w:cs="Calibri"/>
+        </w:rPr>
+        <w:t xml:space="preserve">pour que </w:t>
+      </w:r>
+      <w:r>
+        <w:rPr>
+          <w:rFonts w:ascii="Calibri" w:hAnsi="Calibri" w:cs="Calibri"/>
+        </w:rPr>
+        <w:t>ç</w:t>
+      </w:r>
+      <w:r>
+        <w:rPr>
+          <w:rFonts w:ascii="Calibri" w:hAnsi="Calibri" w:cs="Calibri"/>
+        </w:rPr>
+        <w:t>a</w:t>
+      </w:r>
+      <w:r>
+        <w:rPr>
+          <w:rFonts w:ascii="Calibri" w:hAnsi="Calibri" w:cs="Calibri"/>
+        </w:rPr>
+        <w:t xml:space="preserve"> fonctionne. C’est </w:t>
+      </w:r>
+      <w:r>
+        <w:rPr>
+          <w:rFonts w:ascii="Calibri" w:hAnsi="Calibri" w:cs="Calibri"/>
+        </w:rPr>
+        <w:t>comme ça</w:t>
+      </w:r>
+      <w:r>
+        <w:rPr>
+          <w:rFonts w:ascii="Calibri" w:hAnsi="Calibri" w:cs="Calibri"/>
+        </w:rPr>
+        <w:t xml:space="preserve"> que j’ai pu corriger cette deuxième erreur.</w:t>
+      </w:r>
+    </w:p>
+    <w:p>
+      <w:pPr>
+        <w:rPr>
+          <w:rFonts w:ascii="Calibri" w:hAnsi="Calibri" w:cs="Calibri"/>
+        </w:rPr>
+      </w:pPr>
+      <w:r>
+        <w:rPr>
+          <w:rFonts w:ascii="Calibri" w:hAnsi="Calibri" w:cs="Calibri"/>
+        </w:rPr>
+        <w:br w:type="page"/>
       </w:r>
     </w:p>
     <w:tbl>
@@ -10243,6 +10496,7 @@
                 <w:color w:val="FFFFFF"/>
                 <w:sz w:val="20"/>
               </w:rPr>
+              <w:lastRenderedPageBreak/>
               <w:t xml:space="preserve">SQL   /   </w:t>
             </w:r>
             <w:proofErr w:type="spellStart"/>
@@ -10374,25 +10628,7 @@
                 <w:color w:val="06734E"/>
                 <w:sz w:val="18"/>
               </w:rPr>
-              <w:t>'/var/lib/</w:t>
-            </w:r>
-            <w:proofErr w:type="spellStart"/>
-            <w:r>
-              <w:rPr>
-                <w:rFonts w:ascii="DejaVu Sans Mono" w:hAnsi="DejaVu Sans Mono"/>
-                <w:color w:val="06734E"/>
-                <w:sz w:val="18"/>
-              </w:rPr>
-              <w:t>mysql</w:t>
-            </w:r>
-            <w:proofErr w:type="spellEnd"/>
-            <w:r>
-              <w:rPr>
-                <w:rFonts w:ascii="DejaVu Sans Mono" w:hAnsi="DejaVu Sans Mono"/>
-                <w:color w:val="06734E"/>
-                <w:sz w:val="18"/>
-              </w:rPr>
-              <w:t>-files/</w:t>
+              <w:t>'/var/lib/mysql-files/</w:t>
             </w:r>
             <w:proofErr w:type="spellStart"/>
             <w:r>
@@ -10522,18 +10758,8 @@
                 <w:color w:val="25364B"/>
                 <w:sz w:val="18"/>
               </w:rPr>
-              <w:t xml:space="preserve"> </w:t>
-            </w:r>
-            <w:proofErr w:type="spellStart"/>
-            <w:r>
-              <w:rPr>
-                <w:rFonts w:ascii="DejaVu Sans Mono" w:hAnsi="DejaVu Sans Mono"/>
-                <w:color w:val="25364B"/>
-                <w:sz w:val="18"/>
-              </w:rPr>
-              <w:t>t_aeroport</w:t>
-            </w:r>
-            <w:proofErr w:type="spellEnd"/>
+              <w:t xml:space="preserve"> t_aeroport</w:t>
+            </w:r>
           </w:p>
         </w:tc>
       </w:tr>
@@ -11043,35 +11269,7 @@
                 <w:color w:val="25364B"/>
                 <w:sz w:val="18"/>
               </w:rPr>
-              <w:t>(</w:t>
-            </w:r>
-            <w:proofErr w:type="spellStart"/>
-            <w:proofErr w:type="gramStart"/>
-            <w:r>
-              <w:rPr>
-                <w:rFonts w:ascii="DejaVu Sans Mono" w:hAnsi="DejaVu Sans Mono"/>
-                <w:color w:val="25364B"/>
-                <w:sz w:val="18"/>
-              </w:rPr>
-              <w:t>aeroport</w:t>
-            </w:r>
-            <w:proofErr w:type="gramEnd"/>
-            <w:r>
-              <w:rPr>
-                <w:rFonts w:ascii="DejaVu Sans Mono" w:hAnsi="DejaVu Sans Mono"/>
-                <w:color w:val="25364B"/>
-                <w:sz w:val="18"/>
-              </w:rPr>
-              <w:t>_id</w:t>
-            </w:r>
-            <w:proofErr w:type="spellEnd"/>
-            <w:r>
-              <w:rPr>
-                <w:rFonts w:ascii="DejaVu Sans Mono" w:hAnsi="DejaVu Sans Mono"/>
-                <w:color w:val="25364B"/>
-                <w:sz w:val="18"/>
-              </w:rPr>
-              <w:t xml:space="preserve">, </w:t>
+              <w:t xml:space="preserve">(aeroport_id, </w:t>
             </w:r>
             <w:r>
               <w:rPr>
@@ -11242,35 +11440,7 @@
                 <w:color w:val="25364B"/>
                 <w:sz w:val="18"/>
               </w:rPr>
-              <w:t xml:space="preserve">    </w:t>
-            </w:r>
-            <w:proofErr w:type="spellStart"/>
-            <w:proofErr w:type="gramStart"/>
-            <w:r>
-              <w:rPr>
-                <w:rFonts w:ascii="DejaVu Sans Mono" w:hAnsi="DejaVu Sans Mono"/>
-                <w:color w:val="25364B"/>
-                <w:sz w:val="18"/>
-              </w:rPr>
-              <w:t>code</w:t>
-            </w:r>
-            <w:proofErr w:type="gramEnd"/>
-            <w:r>
-              <w:rPr>
-                <w:rFonts w:ascii="DejaVu Sans Mono" w:hAnsi="DejaVu Sans Mono"/>
-                <w:color w:val="25364B"/>
-                <w:sz w:val="18"/>
-              </w:rPr>
-              <w:t>_iata</w:t>
-            </w:r>
-            <w:proofErr w:type="spellEnd"/>
-            <w:r>
-              <w:rPr>
-                <w:rFonts w:ascii="DejaVu Sans Mono" w:hAnsi="DejaVu Sans Mono"/>
-                <w:color w:val="25364B"/>
-                <w:sz w:val="18"/>
-              </w:rPr>
-              <w:t xml:space="preserve"> = </w:t>
+              <w:t xml:space="preserve">    code_iata = </w:t>
             </w:r>
             <w:r>
               <w:rPr>
@@ -11388,35 +11558,7 @@
                 <w:color w:val="25364B"/>
                 <w:sz w:val="18"/>
               </w:rPr>
-              <w:t xml:space="preserve">    </w:t>
-            </w:r>
-            <w:proofErr w:type="spellStart"/>
-            <w:proofErr w:type="gramStart"/>
-            <w:r>
-              <w:rPr>
-                <w:rFonts w:ascii="DejaVu Sans Mono" w:hAnsi="DejaVu Sans Mono"/>
-                <w:color w:val="25364B"/>
-                <w:sz w:val="18"/>
-              </w:rPr>
-              <w:t>code</w:t>
-            </w:r>
-            <w:proofErr w:type="gramEnd"/>
-            <w:r>
-              <w:rPr>
-                <w:rFonts w:ascii="DejaVu Sans Mono" w:hAnsi="DejaVu Sans Mono"/>
-                <w:color w:val="25364B"/>
-                <w:sz w:val="18"/>
-              </w:rPr>
-              <w:t>_icao</w:t>
-            </w:r>
-            <w:proofErr w:type="spellEnd"/>
-            <w:r>
-              <w:rPr>
-                <w:rFonts w:ascii="DejaVu Sans Mono" w:hAnsi="DejaVu Sans Mono"/>
-                <w:color w:val="25364B"/>
-                <w:sz w:val="18"/>
-              </w:rPr>
-              <w:t xml:space="preserve"> = </w:t>
+              <w:t xml:space="preserve">    code_icao = </w:t>
             </w:r>
             <w:r>
               <w:rPr>
@@ -11471,10 +11613,8 @@
         </w:tc>
       </w:tr>
     </w:tbl>
-    <w:p/>
     <w:p>
       <w:pPr>
-        <w:ind w:left="142"/>
         <w:rPr>
           <w:rFonts w:ascii="Calibri" w:hAnsi="Calibri"/>
           <w:b/>
@@ -11482,15 +11622,6 @@
           <w:sz w:val="22"/>
         </w:rPr>
       </w:pPr>
-      <w:r>
-        <w:rPr>
-          <w:rFonts w:ascii="Calibri" w:hAnsi="Calibri"/>
-          <w:b/>
-          <w:color w:val="000000"/>
-          <w:sz w:val="22"/>
-        </w:rPr>
-        <w:t>Capture de l’exécution</w:t>
-      </w:r>
     </w:p>
     <w:tbl>
       <w:tblPr>
@@ -11555,18 +11686,8 @@
                 <w:color w:val="25364B"/>
                 <w:sz w:val="20"/>
               </w:rPr>
-              <w:t xml:space="preserve">   /   </w:t>
-            </w:r>
-            <w:proofErr w:type="spellStart"/>
-            <w:r>
-              <w:rPr>
-                <w:rFonts w:ascii="Calibri" w:hAnsi="Calibri"/>
-                <w:color w:val="25364B"/>
-                <w:sz w:val="20"/>
-              </w:rPr>
-              <w:t>t_aeroport</w:t>
-            </w:r>
-            <w:proofErr w:type="spellEnd"/>
+              <w:t xml:space="preserve">   /   t_aeroport</w:t>
+            </w:r>
           </w:p>
         </w:tc>
       </w:tr>
@@ -11621,7 +11742,7 @@
                           <pic:cNvPicPr/>
                         </pic:nvPicPr>
                         <pic:blipFill>
-                          <a:blip r:embed="rId18"/>
+                          <a:blip r:embed="rId20"/>
                           <a:stretch>
                             <a:fillRect/>
                           </a:stretch>
@@ -11861,25 +11982,7 @@
                 <w:color w:val="06734E"/>
                 <w:sz w:val="18"/>
               </w:rPr>
-              <w:t>'/var/lib/</w:t>
-            </w:r>
-            <w:proofErr w:type="spellStart"/>
-            <w:r>
-              <w:rPr>
-                <w:rFonts w:ascii="DejaVu Sans Mono" w:hAnsi="DejaVu Sans Mono"/>
-                <w:color w:val="06734E"/>
-                <w:sz w:val="18"/>
-              </w:rPr>
-              <w:t>mysql</w:t>
-            </w:r>
-            <w:proofErr w:type="spellEnd"/>
-            <w:r>
-              <w:rPr>
-                <w:rFonts w:ascii="DejaVu Sans Mono" w:hAnsi="DejaVu Sans Mono"/>
-                <w:color w:val="06734E"/>
-                <w:sz w:val="18"/>
-              </w:rPr>
-              <w:t>-files/</w:t>
+              <w:t>'/var/lib/mysql-files/</w:t>
             </w:r>
             <w:proofErr w:type="spellStart"/>
             <w:r>
@@ -12688,7 +12791,7 @@
                           <pic:cNvPicPr/>
                         </pic:nvPicPr>
                         <pic:blipFill>
-                          <a:blip r:embed="rId19"/>
+                          <a:blip r:embed="rId21"/>
                           <a:stretch>
                             <a:fillRect/>
                           </a:stretch>
@@ -12979,25 +13082,7 @@
                 <w:color w:val="06734E"/>
                 <w:sz w:val="18"/>
               </w:rPr>
-              <w:t>'/var/lib/</w:t>
-            </w:r>
-            <w:proofErr w:type="spellStart"/>
-            <w:r>
-              <w:rPr>
-                <w:rFonts w:ascii="DejaVu Sans Mono" w:hAnsi="DejaVu Sans Mono"/>
-                <w:color w:val="06734E"/>
-                <w:sz w:val="18"/>
-              </w:rPr>
-              <w:t>mysql</w:t>
-            </w:r>
-            <w:proofErr w:type="spellEnd"/>
-            <w:r>
-              <w:rPr>
-                <w:rFonts w:ascii="DejaVu Sans Mono" w:hAnsi="DejaVu Sans Mono"/>
-                <w:color w:val="06734E"/>
-                <w:sz w:val="18"/>
-              </w:rPr>
-              <w:t>-files/</w:t>
+              <w:t>'/var/lib/mysql-files/</w:t>
             </w:r>
             <w:proofErr w:type="spellStart"/>
             <w:r>
@@ -13823,7 +13908,7 @@
                           <pic:cNvPicPr/>
                         </pic:nvPicPr>
                         <pic:blipFill>
-                          <a:blip r:embed="rId20"/>
+                          <a:blip r:embed="rId22"/>
                           <a:stretch>
                             <a:fillRect/>
                           </a:stretch>
@@ -14114,25 +14199,7 @@
                 <w:color w:val="06734E"/>
                 <w:sz w:val="18"/>
               </w:rPr>
-              <w:t>'/var/lib/</w:t>
-            </w:r>
-            <w:proofErr w:type="spellStart"/>
-            <w:r>
-              <w:rPr>
-                <w:rFonts w:ascii="DejaVu Sans Mono" w:hAnsi="DejaVu Sans Mono"/>
-                <w:color w:val="06734E"/>
-                <w:sz w:val="18"/>
-              </w:rPr>
-              <w:t>mysql</w:t>
-            </w:r>
-            <w:proofErr w:type="spellEnd"/>
-            <w:r>
-              <w:rPr>
-                <w:rFonts w:ascii="DejaVu Sans Mono" w:hAnsi="DejaVu Sans Mono"/>
-                <w:color w:val="06734E"/>
-                <w:sz w:val="18"/>
-              </w:rPr>
-              <w:t>-files/</w:t>
+              <w:t>'/var/lib/mysql-files/</w:t>
             </w:r>
             <w:proofErr w:type="spellStart"/>
             <w:r>
@@ -14941,7 +15008,7 @@
                           <pic:cNvPicPr/>
                         </pic:nvPicPr>
                         <pic:blipFill>
-                          <a:blip r:embed="rId21"/>
+                          <a:blip r:embed="rId23"/>
                           <a:stretch>
                             <a:fillRect/>
                           </a:stretch>
@@ -15232,25 +15299,7 @@
                 <w:color w:val="06734E"/>
                 <w:sz w:val="18"/>
               </w:rPr>
-              <w:t>'/var/lib/</w:t>
-            </w:r>
-            <w:proofErr w:type="spellStart"/>
-            <w:r>
-              <w:rPr>
-                <w:rFonts w:ascii="DejaVu Sans Mono" w:hAnsi="DejaVu Sans Mono"/>
-                <w:color w:val="06734E"/>
-                <w:sz w:val="18"/>
-              </w:rPr>
-              <w:t>mysql</w:t>
-            </w:r>
-            <w:proofErr w:type="spellEnd"/>
-            <w:r>
-              <w:rPr>
-                <w:rFonts w:ascii="DejaVu Sans Mono" w:hAnsi="DejaVu Sans Mono"/>
-                <w:color w:val="06734E"/>
-                <w:sz w:val="18"/>
-              </w:rPr>
-              <w:t>-files/</w:t>
+              <w:t>'/var/lib/mysql-files/</w:t>
             </w:r>
             <w:proofErr w:type="spellStart"/>
             <w:r>
@@ -16059,7 +16108,7 @@
                           <pic:cNvPicPr/>
                         </pic:nvPicPr>
                         <pic:blipFill>
-                          <a:blip r:embed="rId22"/>
+                          <a:blip r:embed="rId24"/>
                           <a:stretch>
                             <a:fillRect/>
                           </a:stretch>
@@ -16368,25 +16417,7 @@
                 <w:color w:val="06734E"/>
                 <w:sz w:val="18"/>
               </w:rPr>
-              <w:t>'/var/lib/</w:t>
-            </w:r>
-            <w:proofErr w:type="spellStart"/>
-            <w:r>
-              <w:rPr>
-                <w:rFonts w:ascii="DejaVu Sans Mono" w:hAnsi="DejaVu Sans Mono"/>
-                <w:color w:val="06734E"/>
-                <w:sz w:val="18"/>
-              </w:rPr>
-              <w:t>mysql</w:t>
-            </w:r>
-            <w:proofErr w:type="spellEnd"/>
-            <w:r>
-              <w:rPr>
-                <w:rFonts w:ascii="DejaVu Sans Mono" w:hAnsi="DejaVu Sans Mono"/>
-                <w:color w:val="06734E"/>
-                <w:sz w:val="18"/>
-              </w:rPr>
-              <w:t>-files/</w:t>
+              <w:t>'/var/lib/mysql-files/</w:t>
             </w:r>
             <w:proofErr w:type="spellStart"/>
             <w:r>
@@ -17237,7 +17268,7 @@
                           <pic:cNvPicPr/>
                         </pic:nvPicPr>
                         <pic:blipFill>
-                          <a:blip r:embed="rId23"/>
+                          <a:blip r:embed="rId25"/>
                           <a:stretch>
                             <a:fillRect/>
                           </a:stretch>
@@ -17528,25 +17559,7 @@
                 <w:color w:val="06734E"/>
                 <w:sz w:val="18"/>
               </w:rPr>
-              <w:t>'/var/lib/</w:t>
-            </w:r>
-            <w:proofErr w:type="spellStart"/>
-            <w:r>
-              <w:rPr>
-                <w:rFonts w:ascii="DejaVu Sans Mono" w:hAnsi="DejaVu Sans Mono"/>
-                <w:color w:val="06734E"/>
-                <w:sz w:val="18"/>
-              </w:rPr>
-              <w:t>mysql</w:t>
-            </w:r>
-            <w:proofErr w:type="spellEnd"/>
-            <w:r>
-              <w:rPr>
-                <w:rFonts w:ascii="DejaVu Sans Mono" w:hAnsi="DejaVu Sans Mono"/>
-                <w:color w:val="06734E"/>
-                <w:sz w:val="18"/>
-              </w:rPr>
-              <w:t>-files/</w:t>
+              <w:t>'/var/lib/mysql-files/</w:t>
             </w:r>
             <w:proofErr w:type="spellStart"/>
             <w:r>
@@ -18334,7 +18347,7 @@
                           <pic:cNvPicPr/>
                         </pic:nvPicPr>
                         <pic:blipFill>
-                          <a:blip r:embed="rId24"/>
+                          <a:blip r:embed="rId26"/>
                           <a:stretch>
                             <a:fillRect/>
                           </a:stretch>
@@ -18625,25 +18638,7 @@
                 <w:color w:val="06734E"/>
                 <w:sz w:val="18"/>
               </w:rPr>
-              <w:t>'/var/lib/</w:t>
-            </w:r>
-            <w:proofErr w:type="spellStart"/>
-            <w:r>
-              <w:rPr>
-                <w:rFonts w:ascii="DejaVu Sans Mono" w:hAnsi="DejaVu Sans Mono"/>
-                <w:color w:val="06734E"/>
-                <w:sz w:val="18"/>
-              </w:rPr>
-              <w:t>mysql</w:t>
-            </w:r>
-            <w:proofErr w:type="spellEnd"/>
-            <w:r>
-              <w:rPr>
-                <w:rFonts w:ascii="DejaVu Sans Mono" w:hAnsi="DejaVu Sans Mono"/>
-                <w:color w:val="06734E"/>
-                <w:sz w:val="18"/>
-              </w:rPr>
-              <w:t>-files/</w:t>
+              <w:t>'/var/lib/mysql-files/</w:t>
             </w:r>
             <w:proofErr w:type="spellStart"/>
             <w:r>
@@ -19431,7 +19426,7 @@
                           <pic:cNvPicPr/>
                         </pic:nvPicPr>
                         <pic:blipFill>
-                          <a:blip r:embed="rId25"/>
+                          <a:blip r:embed="rId27"/>
                           <a:stretch>
                             <a:fillRect/>
                           </a:stretch>
@@ -19503,7 +19498,7 @@
           <w:szCs w:val="36"/>
         </w:rPr>
       </w:pPr>
-      <w:bookmarkStart w:id="14" w:name="_Toc244069786"/>
+      <w:bookmarkStart w:id="15" w:name="_Toc244069786"/>
       <w:r>
         <w:rPr>
           <w:rFonts w:ascii="Calibri" w:hAnsi="Calibri" w:cs="Calibri"/>
@@ -19515,7 +19510,7 @@
         <w:lastRenderedPageBreak/>
         <w:t>3.4 Requêtes SQL</w:t>
       </w:r>
-      <w:bookmarkEnd w:id="14"/>
+      <w:bookmarkEnd w:id="15"/>
     </w:p>
     <w:p>
       <w:pPr>
@@ -20094,7 +20089,7 @@
                     <pic:cNvPicPr/>
                   </pic:nvPicPr>
                   <pic:blipFill>
-                    <a:blip r:embed="rId26"/>
+                    <a:blip r:embed="rId28"/>
                     <a:stretch>
                       <a:fillRect/>
                     </a:stretch>
@@ -20595,7 +20590,7 @@
                     <pic:cNvPicPr/>
                   </pic:nvPicPr>
                   <pic:blipFill>
-                    <a:blip r:embed="rId27"/>
+                    <a:blip r:embed="rId29"/>
                     <a:stretch>
                       <a:fillRect/>
                     </a:stretch>
@@ -21135,7 +21130,7 @@
                     <pic:cNvPicPr/>
                   </pic:nvPicPr>
                   <pic:blipFill>
-                    <a:blip r:embed="rId28"/>
+                    <a:blip r:embed="rId30"/>
                     <a:stretch>
                       <a:fillRect/>
                     </a:stretch>
@@ -21342,7 +21337,6 @@
               <w:t xml:space="preserve">, </w:t>
             </w:r>
             <w:proofErr w:type="spellStart"/>
-            <w:proofErr w:type="gramStart"/>
             <w:r>
               <w:rPr>
                 <w:lang w:val="en-US"/>
@@ -21350,7 +21344,6 @@
               <w:t>P.prenom</w:t>
             </w:r>
             <w:proofErr w:type="spellEnd"/>
-            <w:proofErr w:type="gramEnd"/>
             <w:r>
               <w:rPr>
                 <w:lang w:val="en-US"/>
@@ -21358,19 +21351,11 @@
               <w:t xml:space="preserve">, </w:t>
             </w:r>
             <w:proofErr w:type="spellStart"/>
-            <w:proofErr w:type="gramStart"/>
             <w:r>
               <w:rPr>
                 <w:lang w:val="en-US"/>
               </w:rPr>
-              <w:t>P.numero</w:t>
-            </w:r>
-            <w:proofErr w:type="gramEnd"/>
-            <w:r>
-              <w:rPr>
-                <w:lang w:val="en-US"/>
-              </w:rPr>
-              <w:t>_passeport</w:t>
+              <w:t>P.numero_passeport</w:t>
             </w:r>
             <w:proofErr w:type="spellEnd"/>
             <w:r>
@@ -21556,41 +21541,25 @@
               <w:t xml:space="preserve">JOIN t_reservation AS R ON </w:t>
             </w:r>
             <w:proofErr w:type="spellStart"/>
-            <w:proofErr w:type="gramStart"/>
             <w:r>
               <w:rPr>
                 <w:lang w:val="en-US"/>
               </w:rPr>
-              <w:t>R.passager</w:t>
-            </w:r>
-            <w:proofErr w:type="gramEnd"/>
+              <w:t>R.passager_fk</w:t>
+            </w:r>
+            <w:proofErr w:type="spellEnd"/>
             <w:r>
               <w:rPr>
                 <w:lang w:val="en-US"/>
               </w:rPr>
-              <w:t>_fk</w:t>
-            </w:r>
-            <w:proofErr w:type="spellEnd"/>
+              <w:t xml:space="preserve"> = </w:t>
+            </w:r>
+            <w:proofErr w:type="spellStart"/>
             <w:r>
               <w:rPr>
                 <w:lang w:val="en-US"/>
               </w:rPr>
-              <w:t xml:space="preserve"> = </w:t>
-            </w:r>
-            <w:proofErr w:type="spellStart"/>
-            <w:proofErr w:type="gramStart"/>
-            <w:r>
-              <w:rPr>
-                <w:lang w:val="en-US"/>
-              </w:rPr>
-              <w:t>P.passager</w:t>
-            </w:r>
-            <w:proofErr w:type="gramEnd"/>
-            <w:r>
-              <w:rPr>
-                <w:lang w:val="en-US"/>
-              </w:rPr>
-              <w:t>_id</w:t>
+              <w:t>P.passager_id</w:t>
             </w:r>
             <w:proofErr w:type="spellEnd"/>
           </w:p>
@@ -21775,41 +21744,25 @@
               <w:t xml:space="preserve"> AS A ON </w:t>
             </w:r>
             <w:proofErr w:type="spellStart"/>
-            <w:proofErr w:type="gramStart"/>
             <w:r>
               <w:rPr>
                 <w:lang w:val="en-US"/>
               </w:rPr>
-              <w:t>A.aeroport</w:t>
-            </w:r>
-            <w:proofErr w:type="gramEnd"/>
+              <w:t>A.aeroport_id</w:t>
+            </w:r>
+            <w:proofErr w:type="spellEnd"/>
             <w:r>
               <w:rPr>
                 <w:lang w:val="en-US"/>
               </w:rPr>
-              <w:t>_id</w:t>
-            </w:r>
-            <w:proofErr w:type="spellEnd"/>
+              <w:t xml:space="preserve"> = </w:t>
+            </w:r>
+            <w:proofErr w:type="spellStart"/>
             <w:r>
               <w:rPr>
                 <w:lang w:val="en-US"/>
               </w:rPr>
-              <w:t xml:space="preserve"> = </w:t>
-            </w:r>
-            <w:proofErr w:type="spellStart"/>
-            <w:proofErr w:type="gramStart"/>
-            <w:r>
-              <w:rPr>
-                <w:lang w:val="en-US"/>
-              </w:rPr>
-              <w:t>V.aeroport</w:t>
-            </w:r>
-            <w:proofErr w:type="gramEnd"/>
-            <w:r>
-              <w:rPr>
-                <w:lang w:val="en-US"/>
-              </w:rPr>
-              <w:t>_depart_fk</w:t>
+              <w:t>V.aeroport_depart_fk</w:t>
             </w:r>
             <w:proofErr w:type="spellEnd"/>
             <w:r>
@@ -21858,7 +21811,7 @@
                     <pic:cNvPicPr/>
                   </pic:nvPicPr>
                   <pic:blipFill>
-                    <a:blip r:embed="rId29"/>
+                    <a:blip r:embed="rId31"/>
                     <a:stretch>
                       <a:fillRect/>
                     </a:stretch>
@@ -22236,19 +22189,11 @@
                 <w:lang w:val="en-US"/>
               </w:rPr>
             </w:pPr>
-            <w:proofErr w:type="gramStart"/>
             <w:r>
               <w:rPr>
                 <w:lang w:val="en-US"/>
               </w:rPr>
-              <w:t>FROM t</w:t>
-            </w:r>
-            <w:proofErr w:type="gramEnd"/>
-            <w:r>
-              <w:rPr>
-                <w:lang w:val="en-US"/>
-              </w:rPr>
-              <w:t>_reservation</w:t>
+              <w:t>FROM t_reservation</w:t>
             </w:r>
           </w:p>
         </w:tc>
@@ -22450,7 +22395,7 @@
                     <pic:cNvPicPr/>
                   </pic:nvPicPr>
                   <pic:blipFill>
-                    <a:blip r:embed="rId30"/>
+                    <a:blip r:embed="rId32"/>
                     <a:stretch>
                       <a:fillRect/>
                     </a:stretch>
@@ -22838,7 +22783,7 @@
           <w:szCs w:val="36"/>
         </w:rPr>
       </w:pPr>
-      <w:bookmarkStart w:id="15" w:name="_Toc244069787"/>
+      <w:bookmarkStart w:id="16" w:name="_Toc244069787"/>
       <w:r>
         <w:rPr>
           <w:rFonts w:ascii="Calibri" w:hAnsi="Calibri" w:cs="Calibri"/>
@@ -22849,7 +22794,7 @@
         </w:rPr>
         <w:t>3.5 Index</w:t>
       </w:r>
-      <w:bookmarkEnd w:id="15"/>
+      <w:bookmarkEnd w:id="16"/>
     </w:p>
     <w:p>
       <w:pPr>
@@ -22863,7 +22808,7 @@
           <w:szCs w:val="36"/>
         </w:rPr>
       </w:pPr>
-      <w:bookmarkStart w:id="16" w:name="_Toc244069788"/>
+      <w:bookmarkStart w:id="17" w:name="_Toc244069788"/>
       <w:r>
         <w:rPr>
           <w:rFonts w:ascii="Calibri" w:hAnsi="Calibri" w:cs="Calibri"/>
@@ -22874,7 +22819,7 @@
         </w:rPr>
         <w:t>3.6 Utilisateurs et rôles</w:t>
       </w:r>
-      <w:bookmarkEnd w:id="16"/>
+      <w:bookmarkEnd w:id="17"/>
     </w:p>
     <w:p>
       <w:pPr>
@@ -22888,7 +22833,7 @@
           <w:szCs w:val="36"/>
         </w:rPr>
       </w:pPr>
-      <w:bookmarkStart w:id="17" w:name="_Toc244069789"/>
+      <w:bookmarkStart w:id="18" w:name="_Toc244069789"/>
       <w:r>
         <w:rPr>
           <w:rFonts w:ascii="Calibri" w:hAnsi="Calibri" w:cs="Calibri"/>
@@ -22899,54 +22844,34 @@
         </w:rPr>
         <w:t>3.7 Transaction</w:t>
       </w:r>
-      <w:bookmarkEnd w:id="17"/>
-    </w:p>
-    <w:p>
-      <w:pPr>
-        <w:pStyle w:val="Titre1"/>
-        <w:spacing w:after="0" w:line="240" w:lineRule="auto"/>
-        <w:rPr>
-          <w:rFonts w:ascii="Calibri" w:hAnsi="Calibri" w:cs="Calibri"/>
-          <w:b/>
-          <w:bCs/>
-        </w:rPr>
-      </w:pPr>
-      <w:bookmarkStart w:id="18" w:name="_Toc244069790"/>
-      <w:r>
-        <w:rPr>
-          <w:rFonts w:ascii="Calibri" w:hAnsi="Calibri" w:cs="Calibri"/>
-          <w:b/>
-          <w:bCs/>
-        </w:rPr>
-        <w:t xml:space="preserve">4. </w:t>
-      </w:r>
-      <w:r>
-        <w:rPr>
-          <w:rFonts w:ascii="Calibri" w:hAnsi="Calibri" w:cs="Calibri"/>
-          <w:b/>
-          <w:bCs/>
-        </w:rPr>
-        <w:t>Utilisation de l’IA</w:t>
-      </w:r>
       <w:bookmarkEnd w:id="18"/>
     </w:p>
     <w:p>
       <w:pPr>
         <w:pStyle w:val="Titre1"/>
+        <w:spacing w:after="0" w:line="240" w:lineRule="auto"/>
         <w:rPr>
           <w:rFonts w:ascii="Calibri" w:hAnsi="Calibri" w:cs="Calibri"/>
           <w:b/>
           <w:bCs/>
         </w:rPr>
       </w:pPr>
-      <w:bookmarkStart w:id="19" w:name="_Toc244069791"/>
+      <w:bookmarkStart w:id="19" w:name="_Toc244069790"/>
       <w:r>
         <w:rPr>
           <w:rFonts w:ascii="Calibri" w:hAnsi="Calibri" w:cs="Calibri"/>
           <w:b/>
           <w:bCs/>
         </w:rPr>
-        <w:t>5. Conclusion</w:t>
+        <w:t xml:space="preserve">4. </w:t>
+      </w:r>
+      <w:r>
+        <w:rPr>
+          <w:rFonts w:ascii="Calibri" w:hAnsi="Calibri" w:cs="Calibri"/>
+          <w:b/>
+          <w:bCs/>
+        </w:rPr>
+        <w:t>Utilisation de l’IA</w:t>
       </w:r>
       <w:bookmarkEnd w:id="19"/>
     </w:p>
@@ -22959,16 +22884,36 @@
           <w:bCs/>
         </w:rPr>
       </w:pPr>
-      <w:bookmarkStart w:id="20" w:name="_Toc244069792"/>
+      <w:bookmarkStart w:id="20" w:name="_Toc244069791"/>
       <w:r>
         <w:rPr>
           <w:rFonts w:ascii="Calibri" w:hAnsi="Calibri" w:cs="Calibri"/>
           <w:b/>
           <w:bCs/>
         </w:rPr>
+        <w:t>5. Conclusion</w:t>
+      </w:r>
+      <w:bookmarkEnd w:id="20"/>
+    </w:p>
+    <w:p>
+      <w:pPr>
+        <w:pStyle w:val="Titre1"/>
+        <w:rPr>
+          <w:rFonts w:ascii="Calibri" w:hAnsi="Calibri" w:cs="Calibri"/>
+          <w:b/>
+          <w:bCs/>
+        </w:rPr>
+      </w:pPr>
+      <w:bookmarkStart w:id="21" w:name="_Toc244069792"/>
+      <w:r>
+        <w:rPr>
+          <w:rFonts w:ascii="Calibri" w:hAnsi="Calibri" w:cs="Calibri"/>
+          <w:b/>
+          <w:bCs/>
+        </w:rPr>
         <w:t>6. Sources</w:t>
       </w:r>
-      <w:bookmarkEnd w:id="20"/>
+      <w:bookmarkEnd w:id="21"/>
     </w:p>
     <w:p>
       <w:pPr>
@@ -23022,7 +22967,7 @@
       <w:r>
         <w:t xml:space="preserve"> </w:t>
       </w:r>
-      <w:hyperlink r:id="rId31" w:history="1">
+      <w:hyperlink r:id="rId33" w:history="1">
         <w:r>
           <w:rPr>
             <w:rStyle w:val="Lienhypertexte"/>
@@ -23040,7 +22985,7 @@
           <w:bCs/>
         </w:rPr>
       </w:pPr>
-      <w:bookmarkStart w:id="21" w:name="_Toc244069793"/>
+      <w:bookmarkStart w:id="22" w:name="_Toc244069793"/>
       <w:r>
         <w:rPr>
           <w:rFonts w:ascii="Calibri" w:hAnsi="Calibri" w:cs="Calibri"/>
@@ -23049,7 +22994,7 @@
         </w:rPr>
         <w:t>7. Annexes</w:t>
       </w:r>
-      <w:bookmarkEnd w:id="21"/>
+      <w:bookmarkEnd w:id="22"/>
     </w:p>
     <w:p>
       <w:pPr>
@@ -23081,7 +23026,7 @@
       <w:r>
         <w:t xml:space="preserve"> </w:t>
       </w:r>
-      <w:hyperlink r:id="rId32" w:history="1">
+      <w:hyperlink r:id="rId34" w:history="1">
         <w:r>
           <w:rPr>
             <w:rStyle w:val="Lienhypertexte"/>
@@ -23133,7 +23078,7 @@
         </w:rPr>
         <w:t xml:space="preserve"> </w:t>
       </w:r>
-      <w:hyperlink r:id="rId33" w:history="1">
+      <w:hyperlink r:id="rId35" w:history="1">
         <w:r>
           <w:rPr>
             <w:rStyle w:val="Lienhypertexte"/>
@@ -23183,7 +23128,7 @@
       <w:r>
         <w:t xml:space="preserve"> </w:t>
       </w:r>
-      <w:hyperlink r:id="rId34" w:history="1">
+      <w:hyperlink r:id="rId36" w:history="1">
         <w:r>
           <w:rPr>
             <w:rStyle w:val="Lienhypertexte"/>
@@ -23232,7 +23177,7 @@
       <w:r>
         <w:t xml:space="preserve"> </w:t>
       </w:r>
-      <w:hyperlink r:id="rId35" w:history="1">
+      <w:hyperlink r:id="rId37" w:history="1">
         <w:r>
           <w:rPr>
             <w:rStyle w:val="Lienhypertexte"/>
@@ -23242,7 +23187,7 @@
       </w:hyperlink>
     </w:p>
     <w:sectPr>
-      <w:footerReference w:type="first" r:id="rId36"/>
+      <w:footerReference w:type="first" r:id="rId38"/>
       <w:type w:val="continuous"/>
       <w:pgSz w:w="11906" w:h="16838"/>
       <w:pgMar w:top="1417" w:right="1417" w:bottom="1417" w:left="1417" w:header="708" w:footer="708" w:gutter="0"/>
@@ -27886,7 +27831,6 @@
   <w:style w:type="character" w:default="1" w:styleId="Policepardfaut">
     <w:name w:val="Default Paragraph Font"/>
     <w:uiPriority w:val="1"/>
-    <w:semiHidden/>
     <w:unhideWhenUsed/>
   </w:style>
   <w:style w:type="table" w:default="1" w:styleId="TableauNormal">

</xml_diff>

<commit_message>
doc(rapport): Mise à jours de la table des matières
</commit_message>
<xml_diff>
--- a/DOC/annexes/AugustoRomain-P_DB_GestionAeroport-Rapport.docx
+++ b/DOC/annexes/AugustoRomain-P_DB_GestionAeroport-Rapport.docx
@@ -1840,7 +1840,7 @@
           <w:r>
             <w:fldChar w:fldCharType="separate"/>
           </w:r>
-          <w:hyperlink w:anchor="_Toc244069772" w:history="1">
+          <w:hyperlink w:anchor="_Toc244075378" w:history="1">
             <w:r>
               <w:rPr>
                 <w:rStyle w:val="Lienhypertexte"/>
@@ -1864,7 +1864,7 @@
               <w:rPr>
                 <w:webHidden/>
               </w:rPr>
-              <w:instrText xml:space="preserve"> PAGEREF _Toc244069772 \h </w:instrText>
+              <w:instrText xml:space="preserve"> PAGEREF _Toc244075378 \h </w:instrText>
             </w:r>
             <w:r>
               <w:rPr>
@@ -1901,7 +1901,7 @@
               <w:lang w:eastAsia="fr-CH"/>
             </w:rPr>
           </w:pPr>
-          <w:hyperlink w:anchor="_Toc244069773" w:history="1">
+          <w:hyperlink w:anchor="_Toc244075379" w:history="1">
             <w:r>
               <w:rPr>
                 <w:rStyle w:val="Lienhypertexte"/>
@@ -1925,7 +1925,7 @@
               <w:rPr>
                 <w:webHidden/>
               </w:rPr>
-              <w:instrText xml:space="preserve"> PAGEREF _Toc244069773 \h </w:instrText>
+              <w:instrText xml:space="preserve"> PAGEREF _Toc244075379 \h </w:instrText>
             </w:r>
             <w:r>
               <w:rPr>
@@ -1962,7 +1962,7 @@
               <w:lang w:eastAsia="fr-CH"/>
             </w:rPr>
           </w:pPr>
-          <w:hyperlink w:anchor="_Toc244069774" w:history="1">
+          <w:hyperlink w:anchor="_Toc244075380" w:history="1">
             <w:r>
               <w:rPr>
                 <w:rStyle w:val="Lienhypertexte"/>
@@ -1986,7 +1986,7 @@
               <w:rPr>
                 <w:webHidden/>
               </w:rPr>
-              <w:instrText xml:space="preserve"> PAGEREF _Toc244069774 \h </w:instrText>
+              <w:instrText xml:space="preserve"> PAGEREF _Toc244075380 \h </w:instrText>
             </w:r>
             <w:r>
               <w:rPr>
@@ -2025,7 +2025,7 @@
               <w:lang w:eastAsia="fr-CH"/>
             </w:rPr>
           </w:pPr>
-          <w:hyperlink w:anchor="_Toc244069775" w:history="1">
+          <w:hyperlink w:anchor="_Toc244075381" w:history="1">
             <w:r>
               <w:rPr>
                 <w:rStyle w:val="Lienhypertexte"/>
@@ -2055,7 +2055,7 @@
                 <w:noProof/>
                 <w:webHidden/>
               </w:rPr>
-              <w:instrText xml:space="preserve"> PAGEREF _Toc244069775 \h </w:instrText>
+              <w:instrText xml:space="preserve"> PAGEREF _Toc244075381 \h </w:instrText>
             </w:r>
             <w:r>
               <w:rPr>
@@ -2098,7 +2098,7 @@
               <w:lang w:eastAsia="fr-CH"/>
             </w:rPr>
           </w:pPr>
-          <w:hyperlink w:anchor="_Toc244069776" w:history="1">
+          <w:hyperlink w:anchor="_Toc244075382" w:history="1">
             <w:r>
               <w:rPr>
                 <w:rStyle w:val="Lienhypertexte"/>
@@ -2128,7 +2128,7 @@
                 <w:noProof/>
                 <w:webHidden/>
               </w:rPr>
-              <w:instrText xml:space="preserve"> PAGEREF _Toc244069776 \h </w:instrText>
+              <w:instrText xml:space="preserve"> PAGEREF _Toc244075382 \h </w:instrText>
             </w:r>
             <w:r>
               <w:rPr>
@@ -2171,7 +2171,7 @@
               <w:lang w:eastAsia="fr-CH"/>
             </w:rPr>
           </w:pPr>
-          <w:hyperlink w:anchor="_Toc244069777" w:history="1">
+          <w:hyperlink w:anchor="_Toc244075383" w:history="1">
             <w:r>
               <w:rPr>
                 <w:rStyle w:val="Lienhypertexte"/>
@@ -2201,7 +2201,7 @@
                 <w:noProof/>
                 <w:webHidden/>
               </w:rPr>
-              <w:instrText xml:space="preserve"> PAGEREF _Toc244069777 \h </w:instrText>
+              <w:instrText xml:space="preserve"> PAGEREF _Toc244075383 \h </w:instrText>
             </w:r>
             <w:r>
               <w:rPr>
@@ -2244,7 +2244,7 @@
               <w:lang w:eastAsia="fr-CH"/>
             </w:rPr>
           </w:pPr>
-          <w:hyperlink w:anchor="_Toc244069778" w:history="1">
+          <w:hyperlink w:anchor="_Toc244075384" w:history="1">
             <w:r>
               <w:rPr>
                 <w:rStyle w:val="Lienhypertexte"/>
@@ -2274,7 +2274,7 @@
                 <w:noProof/>
                 <w:webHidden/>
               </w:rPr>
-              <w:instrText xml:space="preserve"> PAGEREF _Toc244069778 \h </w:instrText>
+              <w:instrText xml:space="preserve"> PAGEREF _Toc244075384 \h </w:instrText>
             </w:r>
             <w:r>
               <w:rPr>
@@ -2317,7 +2317,7 @@
               <w:lang w:eastAsia="fr-CH"/>
             </w:rPr>
           </w:pPr>
-          <w:hyperlink w:anchor="_Toc244069779" w:history="1">
+          <w:hyperlink w:anchor="_Toc244075385" w:history="1">
             <w:r>
               <w:rPr>
                 <w:rStyle w:val="Lienhypertexte"/>
@@ -2347,7 +2347,7 @@
                 <w:noProof/>
                 <w:webHidden/>
               </w:rPr>
-              <w:instrText xml:space="preserve"> PAGEREF _Toc244069779 \h </w:instrText>
+              <w:instrText xml:space="preserve"> PAGEREF _Toc244075385 \h </w:instrText>
             </w:r>
             <w:r>
               <w:rPr>
@@ -2390,7 +2390,7 @@
               <w:lang w:eastAsia="fr-CH"/>
             </w:rPr>
           </w:pPr>
-          <w:hyperlink w:anchor="_Toc244069780" w:history="1">
+          <w:hyperlink w:anchor="_Toc244075386" w:history="1">
             <w:r>
               <w:rPr>
                 <w:rStyle w:val="Lienhypertexte"/>
@@ -2420,7 +2420,7 @@
                 <w:noProof/>
                 <w:webHidden/>
               </w:rPr>
-              <w:instrText xml:space="preserve"> PAGEREF _Toc244069780 \h </w:instrText>
+              <w:instrText xml:space="preserve"> PAGEREF _Toc244075386 \h </w:instrText>
             </w:r>
             <w:r>
               <w:rPr>
@@ -2463,7 +2463,7 @@
               <w:lang w:eastAsia="fr-CH"/>
             </w:rPr>
           </w:pPr>
-          <w:hyperlink w:anchor="_Toc244069781" w:history="1">
+          <w:hyperlink w:anchor="_Toc244075387" w:history="1">
             <w:r>
               <w:rPr>
                 <w:rStyle w:val="Lienhypertexte"/>
@@ -2493,7 +2493,7 @@
                 <w:noProof/>
                 <w:webHidden/>
               </w:rPr>
-              <w:instrText xml:space="preserve"> PAGEREF _Toc244069781 \h </w:instrText>
+              <w:instrText xml:space="preserve"> PAGEREF _Toc244075387 \h </w:instrText>
             </w:r>
             <w:r>
               <w:rPr>
@@ -2536,7 +2536,7 @@
               <w:lang w:eastAsia="fr-CH"/>
             </w:rPr>
           </w:pPr>
-          <w:hyperlink w:anchor="_Toc244069782" w:history="1">
+          <w:hyperlink w:anchor="_Toc244075388" w:history="1">
             <w:r>
               <w:rPr>
                 <w:rStyle w:val="Lienhypertexte"/>
@@ -2566,7 +2566,7 @@
                 <w:noProof/>
                 <w:webHidden/>
               </w:rPr>
-              <w:instrText xml:space="preserve"> PAGEREF _Toc244069782 \h </w:instrText>
+              <w:instrText xml:space="preserve"> PAGEREF _Toc244075388 \h </w:instrText>
             </w:r>
             <w:r>
               <w:rPr>
@@ -2609,7 +2609,7 @@
               <w:lang w:eastAsia="fr-CH"/>
             </w:rPr>
           </w:pPr>
-          <w:hyperlink w:anchor="_Toc244069783" w:history="1">
+          <w:hyperlink w:anchor="_Toc244075389" w:history="1">
             <w:r>
               <w:rPr>
                 <w:rStyle w:val="Lienhypertexte"/>
@@ -2639,7 +2639,7 @@
                 <w:noProof/>
                 <w:webHidden/>
               </w:rPr>
-              <w:instrText xml:space="preserve"> PAGEREF _Toc244069783 \h </w:instrText>
+              <w:instrText xml:space="preserve"> PAGEREF _Toc244075389 \h </w:instrText>
             </w:r>
             <w:r>
               <w:rPr>
@@ -2682,7 +2682,7 @@
               <w:lang w:eastAsia="fr-CH"/>
             </w:rPr>
           </w:pPr>
-          <w:hyperlink w:anchor="_Toc244069784" w:history="1">
+          <w:hyperlink w:anchor="_Toc244075390" w:history="1">
             <w:r>
               <w:rPr>
                 <w:rStyle w:val="Lienhypertexte"/>
@@ -2712,7 +2712,7 @@
                 <w:noProof/>
                 <w:webHidden/>
               </w:rPr>
-              <w:instrText xml:space="preserve"> PAGEREF _Toc244069784 \h </w:instrText>
+              <w:instrText xml:space="preserve"> PAGEREF _Toc244075390 \h </w:instrText>
             </w:r>
             <w:r>
               <w:rPr>
@@ -2755,7 +2755,7 @@
               <w:lang w:eastAsia="fr-CH"/>
             </w:rPr>
           </w:pPr>
-          <w:hyperlink w:anchor="_Toc244069785" w:history="1">
+          <w:hyperlink w:anchor="_Toc244075391" w:history="1">
             <w:r>
               <w:rPr>
                 <w:rStyle w:val="Lienhypertexte"/>
@@ -2785,7 +2785,7 @@
                 <w:noProof/>
                 <w:webHidden/>
               </w:rPr>
-              <w:instrText xml:space="preserve"> PAGEREF _Toc244069785 \h </w:instrText>
+              <w:instrText xml:space="preserve"> PAGEREF _Toc244075391 \h </w:instrText>
             </w:r>
             <w:r>
               <w:rPr>
@@ -2828,7 +2828,7 @@
               <w:lang w:eastAsia="fr-CH"/>
             </w:rPr>
           </w:pPr>
-          <w:hyperlink w:anchor="_Toc244069786" w:history="1">
+          <w:hyperlink w:anchor="_Toc244075392" w:history="1">
             <w:r>
               <w:rPr>
                 <w:rStyle w:val="Lienhypertexte"/>
@@ -2858,7 +2858,7 @@
                 <w:noProof/>
                 <w:webHidden/>
               </w:rPr>
-              <w:instrText xml:space="preserve"> PAGEREF _Toc244069786 \h </w:instrText>
+              <w:instrText xml:space="preserve"> PAGEREF _Toc244075392 \h </w:instrText>
             </w:r>
             <w:r>
               <w:rPr>
@@ -2878,7 +2878,7 @@
                 <w:noProof/>
                 <w:webHidden/>
               </w:rPr>
-              <w:t>20</w:t>
+              <w:t>22</w:t>
             </w:r>
             <w:r>
               <w:rPr>
@@ -2901,7 +2901,7 @@
               <w:lang w:eastAsia="fr-CH"/>
             </w:rPr>
           </w:pPr>
-          <w:hyperlink w:anchor="_Toc244069787" w:history="1">
+          <w:hyperlink w:anchor="_Toc244075393" w:history="1">
             <w:r>
               <w:rPr>
                 <w:rStyle w:val="Lienhypertexte"/>
@@ -2931,7 +2931,7 @@
                 <w:noProof/>
                 <w:webHidden/>
               </w:rPr>
-              <w:instrText xml:space="preserve"> PAGEREF _Toc244069787 \h </w:instrText>
+              <w:instrText xml:space="preserve"> PAGEREF _Toc244075393 \h </w:instrText>
             </w:r>
             <w:r>
               <w:rPr>
@@ -2951,7 +2951,7 @@
                 <w:noProof/>
                 <w:webHidden/>
               </w:rPr>
-              <w:t>24</w:t>
+              <w:t>26</w:t>
             </w:r>
             <w:r>
               <w:rPr>
@@ -2974,7 +2974,7 @@
               <w:lang w:eastAsia="fr-CH"/>
             </w:rPr>
           </w:pPr>
-          <w:hyperlink w:anchor="_Toc244069788" w:history="1">
+          <w:hyperlink w:anchor="_Toc244075394" w:history="1">
             <w:r>
               <w:rPr>
                 <w:rStyle w:val="Lienhypertexte"/>
@@ -3004,7 +3004,7 @@
                 <w:noProof/>
                 <w:webHidden/>
               </w:rPr>
-              <w:instrText xml:space="preserve"> PAGEREF _Toc244069788 \h </w:instrText>
+              <w:instrText xml:space="preserve"> PAGEREF _Toc244075394 \h </w:instrText>
             </w:r>
             <w:r>
               <w:rPr>
@@ -3024,7 +3024,7 @@
                 <w:noProof/>
                 <w:webHidden/>
               </w:rPr>
-              <w:t>24</w:t>
+              <w:t>26</w:t>
             </w:r>
             <w:r>
               <w:rPr>
@@ -3047,7 +3047,7 @@
               <w:lang w:eastAsia="fr-CH"/>
             </w:rPr>
           </w:pPr>
-          <w:hyperlink w:anchor="_Toc244069789" w:history="1">
+          <w:hyperlink w:anchor="_Toc244075395" w:history="1">
             <w:r>
               <w:rPr>
                 <w:rStyle w:val="Lienhypertexte"/>
@@ -3077,7 +3077,7 @@
                 <w:noProof/>
                 <w:webHidden/>
               </w:rPr>
-              <w:instrText xml:space="preserve"> PAGEREF _Toc244069789 \h </w:instrText>
+              <w:instrText xml:space="preserve"> PAGEREF _Toc244075395 \h </w:instrText>
             </w:r>
             <w:r>
               <w:rPr>
@@ -3097,7 +3097,7 @@
                 <w:noProof/>
                 <w:webHidden/>
               </w:rPr>
-              <w:t>24</w:t>
+              <w:t>26</w:t>
             </w:r>
             <w:r>
               <w:rPr>
@@ -3118,7 +3118,7 @@
               <w:lang w:eastAsia="fr-CH"/>
             </w:rPr>
           </w:pPr>
-          <w:hyperlink w:anchor="_Toc244069790" w:history="1">
+          <w:hyperlink w:anchor="_Toc244075396" w:history="1">
             <w:r>
               <w:rPr>
                 <w:rStyle w:val="Lienhypertexte"/>
@@ -3142,7 +3142,7 @@
               <w:rPr>
                 <w:webHidden/>
               </w:rPr>
-              <w:instrText xml:space="preserve"> PAGEREF _Toc244069790 \h </w:instrText>
+              <w:instrText xml:space="preserve"> PAGEREF _Toc244075396 \h </w:instrText>
             </w:r>
             <w:r>
               <w:rPr>
@@ -3159,7 +3159,7 @@
               <w:rPr>
                 <w:webHidden/>
               </w:rPr>
-              <w:t>24</w:t>
+              <w:t>26</w:t>
             </w:r>
             <w:r>
               <w:rPr>
@@ -3179,7 +3179,7 @@
               <w:lang w:eastAsia="fr-CH"/>
             </w:rPr>
           </w:pPr>
-          <w:hyperlink w:anchor="_Toc244069791" w:history="1">
+          <w:hyperlink w:anchor="_Toc244075397" w:history="1">
             <w:r>
               <w:rPr>
                 <w:rStyle w:val="Lienhypertexte"/>
@@ -3203,7 +3203,7 @@
               <w:rPr>
                 <w:webHidden/>
               </w:rPr>
-              <w:instrText xml:space="preserve"> PAGEREF _Toc244069791 \h </w:instrText>
+              <w:instrText xml:space="preserve"> PAGEREF _Toc244075397 \h </w:instrText>
             </w:r>
             <w:r>
               <w:rPr>
@@ -3220,7 +3220,7 @@
               <w:rPr>
                 <w:webHidden/>
               </w:rPr>
-              <w:t>24</w:t>
+              <w:t>26</w:t>
             </w:r>
             <w:r>
               <w:rPr>
@@ -3240,7 +3240,7 @@
               <w:lang w:eastAsia="fr-CH"/>
             </w:rPr>
           </w:pPr>
-          <w:hyperlink w:anchor="_Toc244069792" w:history="1">
+          <w:hyperlink w:anchor="_Toc244075398" w:history="1">
             <w:r>
               <w:rPr>
                 <w:rStyle w:val="Lienhypertexte"/>
@@ -3264,7 +3264,7 @@
               <w:rPr>
                 <w:webHidden/>
               </w:rPr>
-              <w:instrText xml:space="preserve"> PAGEREF _Toc244069792 \h </w:instrText>
+              <w:instrText xml:space="preserve"> PAGEREF _Toc244075398 \h </w:instrText>
             </w:r>
             <w:r>
               <w:rPr>
@@ -3281,7 +3281,7 @@
               <w:rPr>
                 <w:webHidden/>
               </w:rPr>
-              <w:t>24</w:t>
+              <w:t>26</w:t>
             </w:r>
             <w:r>
               <w:rPr>
@@ -3301,7 +3301,7 @@
               <w:lang w:eastAsia="fr-CH"/>
             </w:rPr>
           </w:pPr>
-          <w:hyperlink w:anchor="_Toc244069793" w:history="1">
+          <w:hyperlink w:anchor="_Toc244075399" w:history="1">
             <w:r>
               <w:rPr>
                 <w:rStyle w:val="Lienhypertexte"/>
@@ -3325,7 +3325,7 @@
               <w:rPr>
                 <w:webHidden/>
               </w:rPr>
-              <w:instrText xml:space="preserve"> PAGEREF _Toc244069793 \h </w:instrText>
+              <w:instrText xml:space="preserve"> PAGEREF _Toc244075399 \h </w:instrText>
             </w:r>
             <w:r>
               <w:rPr>
@@ -3342,7 +3342,7 @@
               <w:rPr>
                 <w:webHidden/>
               </w:rPr>
-              <w:t>24</w:t>
+              <w:t>26</w:t>
             </w:r>
             <w:r>
               <w:rPr>
@@ -3469,7 +3469,7 @@
           <w:bCs/>
         </w:rPr>
       </w:pPr>
-      <w:bookmarkStart w:id="0" w:name="_Toc244069772"/>
+      <w:bookmarkStart w:id="0" w:name="_Toc244075378"/>
       <w:r>
         <w:rPr>
           <w:rFonts w:ascii="Calibri" w:hAnsi="Calibri" w:cs="Calibri"/>
@@ -3536,7 +3536,7 @@
           <w:bCs/>
         </w:rPr>
       </w:pPr>
-      <w:bookmarkStart w:id="1" w:name="_Toc244069773"/>
+      <w:bookmarkStart w:id="1" w:name="_Toc244075379"/>
       <w:r>
         <w:rPr>
           <w:rFonts w:ascii="Calibri" w:hAnsi="Calibri" w:cs="Calibri"/>
@@ -4319,7 +4319,7 @@
           <w:bCs/>
         </w:rPr>
       </w:pPr>
-      <w:bookmarkStart w:id="2" w:name="_Toc244069774"/>
+      <w:bookmarkStart w:id="2" w:name="_Toc244075380"/>
       <w:r>
         <w:rPr>
           <w:rFonts w:ascii="Calibri" w:hAnsi="Calibri" w:cs="Calibri"/>
@@ -4350,7 +4350,7 @@
           <w:szCs w:val="36"/>
         </w:rPr>
       </w:pPr>
-      <w:bookmarkStart w:id="3" w:name="_Toc244069775"/>
+      <w:bookmarkStart w:id="3" w:name="_Toc244075381"/>
       <w:r>
         <w:rPr>
           <w:rFonts w:ascii="Calibri" w:hAnsi="Calibri" w:cs="Calibri"/>
@@ -4375,7 +4375,7 @@
           <w:szCs w:val="32"/>
         </w:rPr>
       </w:pPr>
-      <w:bookmarkStart w:id="4" w:name="_Toc244069776"/>
+      <w:bookmarkStart w:id="4" w:name="_Toc244075382"/>
       <w:r>
         <w:rPr>
           <w:rFonts w:ascii="Calibri" w:hAnsi="Calibri" w:cs="Calibri"/>
@@ -4425,7 +4425,7 @@
           <w:szCs w:val="32"/>
         </w:rPr>
       </w:pPr>
-      <w:bookmarkStart w:id="5" w:name="_Toc244069777"/>
+      <w:bookmarkStart w:id="5" w:name="_Toc244075383"/>
       <w:r>
         <w:rPr>
           <w:rFonts w:ascii="Calibri" w:hAnsi="Calibri" w:cs="Calibri"/>
@@ -4656,7 +4656,7 @@
       <w:r>
         <w:br w:type="page"/>
       </w:r>
-      <w:bookmarkStart w:id="6" w:name="_Toc244069778"/>
+      <w:bookmarkStart w:id="6" w:name="_Toc244075384"/>
       <w:r>
         <w:rPr>
           <w:rFonts w:ascii="Calibri" w:hAnsi="Calibri" w:cs="Calibri"/>
@@ -5119,7 +5119,7 @@
           <w:szCs w:val="32"/>
         </w:rPr>
       </w:pPr>
-      <w:bookmarkStart w:id="7" w:name="_Toc244069779"/>
+      <w:bookmarkStart w:id="7" w:name="_Toc244075385"/>
       <w:r>
         <w:rPr>
           <w:rFonts w:ascii="Calibri" w:hAnsi="Calibri" w:cs="Calibri"/>
@@ -5228,11 +5228,19 @@
                 <w:rFonts w:ascii="Calibri" w:hAnsi="Calibri" w:cs="Calibri"/>
               </w:rPr>
             </w:pPr>
-            <w:r>
-              <w:rPr>
-                <w:rFonts w:ascii="Calibri" w:hAnsi="Calibri" w:cs="Calibri"/>
-              </w:rPr>
-              <w:t>aeroport_id</w:t>
+            <w:proofErr w:type="gramStart"/>
+            <w:r>
+              <w:rPr>
+                <w:rFonts w:ascii="Calibri" w:hAnsi="Calibri" w:cs="Calibri"/>
+              </w:rPr>
+              <w:t>aeroport</w:t>
+            </w:r>
+            <w:proofErr w:type="gramEnd"/>
+            <w:r>
+              <w:rPr>
+                <w:rFonts w:ascii="Calibri" w:hAnsi="Calibri" w:cs="Calibri"/>
+              </w:rPr>
+              <w:t>_id</w:t>
             </w:r>
           </w:p>
         </w:tc>
@@ -5288,11 +5296,19 @@
               </w:rPr>
             </w:pPr>
             <w:proofErr w:type="spellStart"/>
-            <w:r>
-              <w:rPr>
-                <w:rFonts w:ascii="Calibri" w:hAnsi="Calibri" w:cs="Calibri"/>
-              </w:rPr>
-              <w:t>aeroport_nom</w:t>
+            <w:proofErr w:type="gramStart"/>
+            <w:r>
+              <w:rPr>
+                <w:rFonts w:ascii="Calibri" w:hAnsi="Calibri" w:cs="Calibri"/>
+              </w:rPr>
+              <w:t>aeroport</w:t>
+            </w:r>
+            <w:proofErr w:type="gramEnd"/>
+            <w:r>
+              <w:rPr>
+                <w:rFonts w:ascii="Calibri" w:hAnsi="Calibri" w:cs="Calibri"/>
+              </w:rPr>
+              <w:t>_nom</w:t>
             </w:r>
             <w:proofErr w:type="spellEnd"/>
           </w:p>
@@ -5349,11 +5365,19 @@
               </w:rPr>
             </w:pPr>
             <w:proofErr w:type="spellStart"/>
-            <w:r>
-              <w:rPr>
-                <w:rFonts w:ascii="Calibri" w:hAnsi="Calibri" w:cs="Calibri"/>
-              </w:rPr>
-              <w:t>aeroport_code_iata</w:t>
+            <w:proofErr w:type="gramStart"/>
+            <w:r>
+              <w:rPr>
+                <w:rFonts w:ascii="Calibri" w:hAnsi="Calibri" w:cs="Calibri"/>
+              </w:rPr>
+              <w:t>aeroport</w:t>
+            </w:r>
+            <w:proofErr w:type="gramEnd"/>
+            <w:r>
+              <w:rPr>
+                <w:rFonts w:ascii="Calibri" w:hAnsi="Calibri" w:cs="Calibri"/>
+              </w:rPr>
+              <w:t>_code_iata</w:t>
             </w:r>
             <w:proofErr w:type="spellEnd"/>
           </w:p>
@@ -5410,11 +5434,19 @@
               </w:rPr>
             </w:pPr>
             <w:proofErr w:type="spellStart"/>
-            <w:r>
-              <w:rPr>
-                <w:rFonts w:ascii="Calibri" w:hAnsi="Calibri" w:cs="Calibri"/>
-              </w:rPr>
-              <w:t>aeroport_code_icao</w:t>
+            <w:proofErr w:type="gramStart"/>
+            <w:r>
+              <w:rPr>
+                <w:rFonts w:ascii="Calibri" w:hAnsi="Calibri" w:cs="Calibri"/>
+              </w:rPr>
+              <w:t>aeroport</w:t>
+            </w:r>
+            <w:proofErr w:type="gramEnd"/>
+            <w:r>
+              <w:rPr>
+                <w:rFonts w:ascii="Calibri" w:hAnsi="Calibri" w:cs="Calibri"/>
+              </w:rPr>
+              <w:t>_code_icao</w:t>
             </w:r>
             <w:proofErr w:type="spellEnd"/>
           </w:p>
@@ -5548,11 +5580,19 @@
               </w:rPr>
             </w:pPr>
             <w:proofErr w:type="spellStart"/>
-            <w:r>
-              <w:rPr>
-                <w:rFonts w:ascii="Calibri" w:hAnsi="Calibri" w:cs="Calibri"/>
-              </w:rPr>
-              <w:t>compagnie_id</w:t>
+            <w:proofErr w:type="gramStart"/>
+            <w:r>
+              <w:rPr>
+                <w:rFonts w:ascii="Calibri" w:hAnsi="Calibri" w:cs="Calibri"/>
+              </w:rPr>
+              <w:t>compagnie</w:t>
+            </w:r>
+            <w:proofErr w:type="gramEnd"/>
+            <w:r>
+              <w:rPr>
+                <w:rFonts w:ascii="Calibri" w:hAnsi="Calibri" w:cs="Calibri"/>
+              </w:rPr>
+              <w:t>_id</w:t>
             </w:r>
             <w:proofErr w:type="spellEnd"/>
           </w:p>
@@ -5609,11 +5649,19 @@
               </w:rPr>
             </w:pPr>
             <w:proofErr w:type="spellStart"/>
-            <w:r>
-              <w:rPr>
-                <w:rFonts w:ascii="Calibri" w:hAnsi="Calibri" w:cs="Calibri"/>
-              </w:rPr>
-              <w:t>compagnie_nom</w:t>
+            <w:proofErr w:type="gramStart"/>
+            <w:r>
+              <w:rPr>
+                <w:rFonts w:ascii="Calibri" w:hAnsi="Calibri" w:cs="Calibri"/>
+              </w:rPr>
+              <w:t>compagnie</w:t>
+            </w:r>
+            <w:proofErr w:type="gramEnd"/>
+            <w:r>
+              <w:rPr>
+                <w:rFonts w:ascii="Calibri" w:hAnsi="Calibri" w:cs="Calibri"/>
+              </w:rPr>
+              <w:t>_nom</w:t>
             </w:r>
             <w:proofErr w:type="spellEnd"/>
           </w:p>
@@ -5670,11 +5718,19 @@
               </w:rPr>
             </w:pPr>
             <w:proofErr w:type="spellStart"/>
-            <w:r>
-              <w:rPr>
-                <w:rFonts w:ascii="Calibri" w:hAnsi="Calibri" w:cs="Calibri"/>
-              </w:rPr>
-              <w:t>compagnie_code_iata</w:t>
+            <w:proofErr w:type="gramStart"/>
+            <w:r>
+              <w:rPr>
+                <w:rFonts w:ascii="Calibri" w:hAnsi="Calibri" w:cs="Calibri"/>
+              </w:rPr>
+              <w:t>compagnie</w:t>
+            </w:r>
+            <w:proofErr w:type="gramEnd"/>
+            <w:r>
+              <w:rPr>
+                <w:rFonts w:ascii="Calibri" w:hAnsi="Calibri" w:cs="Calibri"/>
+              </w:rPr>
+              <w:t>_code_iata</w:t>
             </w:r>
             <w:proofErr w:type="spellEnd"/>
           </w:p>
@@ -5808,11 +5864,19 @@
               </w:rPr>
             </w:pPr>
             <w:proofErr w:type="spellStart"/>
-            <w:r>
-              <w:rPr>
-                <w:rFonts w:ascii="Calibri" w:hAnsi="Calibri" w:cs="Calibri"/>
-              </w:rPr>
-              <w:t>avion_id</w:t>
+            <w:proofErr w:type="gramStart"/>
+            <w:r>
+              <w:rPr>
+                <w:rFonts w:ascii="Calibri" w:hAnsi="Calibri" w:cs="Calibri"/>
+              </w:rPr>
+              <w:t>avion</w:t>
+            </w:r>
+            <w:proofErr w:type="gramEnd"/>
+            <w:r>
+              <w:rPr>
+                <w:rFonts w:ascii="Calibri" w:hAnsi="Calibri" w:cs="Calibri"/>
+              </w:rPr>
+              <w:t>_id</w:t>
             </w:r>
             <w:proofErr w:type="spellEnd"/>
           </w:p>
@@ -5869,11 +5933,19 @@
               </w:rPr>
             </w:pPr>
             <w:proofErr w:type="spellStart"/>
-            <w:r>
-              <w:rPr>
-                <w:rFonts w:ascii="Calibri" w:hAnsi="Calibri" w:cs="Calibri"/>
-              </w:rPr>
-              <w:t>avion_immatriculation</w:t>
+            <w:proofErr w:type="gramStart"/>
+            <w:r>
+              <w:rPr>
+                <w:rFonts w:ascii="Calibri" w:hAnsi="Calibri" w:cs="Calibri"/>
+              </w:rPr>
+              <w:t>avion</w:t>
+            </w:r>
+            <w:proofErr w:type="gramEnd"/>
+            <w:r>
+              <w:rPr>
+                <w:rFonts w:ascii="Calibri" w:hAnsi="Calibri" w:cs="Calibri"/>
+              </w:rPr>
+              <w:t>_immatriculation</w:t>
             </w:r>
             <w:proofErr w:type="spellEnd"/>
           </w:p>
@@ -5930,11 +6002,19 @@
               </w:rPr>
             </w:pPr>
             <w:proofErr w:type="spellStart"/>
-            <w:r>
-              <w:rPr>
-                <w:rFonts w:ascii="Calibri" w:hAnsi="Calibri" w:cs="Calibri"/>
-              </w:rPr>
-              <w:t>avion_capacite</w:t>
+            <w:proofErr w:type="gramStart"/>
+            <w:r>
+              <w:rPr>
+                <w:rFonts w:ascii="Calibri" w:hAnsi="Calibri" w:cs="Calibri"/>
+              </w:rPr>
+              <w:t>avion</w:t>
+            </w:r>
+            <w:proofErr w:type="gramEnd"/>
+            <w:r>
+              <w:rPr>
+                <w:rFonts w:ascii="Calibri" w:hAnsi="Calibri" w:cs="Calibri"/>
+              </w:rPr>
+              <w:t>_capacite</w:t>
             </w:r>
             <w:proofErr w:type="spellEnd"/>
           </w:p>
@@ -6068,11 +6148,19 @@
               </w:rPr>
             </w:pPr>
             <w:proofErr w:type="spellStart"/>
-            <w:r>
-              <w:rPr>
-                <w:rFonts w:ascii="Calibri" w:hAnsi="Calibri" w:cs="Calibri"/>
-              </w:rPr>
-              <w:t>type_avion_id</w:t>
+            <w:proofErr w:type="gramStart"/>
+            <w:r>
+              <w:rPr>
+                <w:rFonts w:ascii="Calibri" w:hAnsi="Calibri" w:cs="Calibri"/>
+              </w:rPr>
+              <w:t>type</w:t>
+            </w:r>
+            <w:proofErr w:type="gramEnd"/>
+            <w:r>
+              <w:rPr>
+                <w:rFonts w:ascii="Calibri" w:hAnsi="Calibri" w:cs="Calibri"/>
+              </w:rPr>
+              <w:t>_avion_id</w:t>
             </w:r>
             <w:proofErr w:type="spellEnd"/>
           </w:p>
@@ -6129,11 +6217,19 @@
               </w:rPr>
             </w:pPr>
             <w:proofErr w:type="spellStart"/>
-            <w:r>
-              <w:rPr>
-                <w:rFonts w:ascii="Calibri" w:hAnsi="Calibri" w:cs="Calibri"/>
-              </w:rPr>
-              <w:t>type_avion_nom</w:t>
+            <w:proofErr w:type="gramStart"/>
+            <w:r>
+              <w:rPr>
+                <w:rFonts w:ascii="Calibri" w:hAnsi="Calibri" w:cs="Calibri"/>
+              </w:rPr>
+              <w:t>type</w:t>
+            </w:r>
+            <w:proofErr w:type="gramEnd"/>
+            <w:r>
+              <w:rPr>
+                <w:rFonts w:ascii="Calibri" w:hAnsi="Calibri" w:cs="Calibri"/>
+              </w:rPr>
+              <w:t>_avion_nom</w:t>
             </w:r>
             <w:proofErr w:type="spellEnd"/>
           </w:p>
@@ -6190,11 +6286,19 @@
               </w:rPr>
             </w:pPr>
             <w:proofErr w:type="spellStart"/>
-            <w:r>
-              <w:rPr>
-                <w:rFonts w:ascii="Calibri" w:hAnsi="Calibri" w:cs="Calibri"/>
-              </w:rPr>
-              <w:t>type_avion_description</w:t>
+            <w:proofErr w:type="gramStart"/>
+            <w:r>
+              <w:rPr>
+                <w:rFonts w:ascii="Calibri" w:hAnsi="Calibri" w:cs="Calibri"/>
+              </w:rPr>
+              <w:t>type</w:t>
+            </w:r>
+            <w:proofErr w:type="gramEnd"/>
+            <w:r>
+              <w:rPr>
+                <w:rFonts w:ascii="Calibri" w:hAnsi="Calibri" w:cs="Calibri"/>
+              </w:rPr>
+              <w:t>_avion_description</w:t>
             </w:r>
             <w:proofErr w:type="spellEnd"/>
           </w:p>
@@ -6328,11 +6432,19 @@
               </w:rPr>
             </w:pPr>
             <w:proofErr w:type="spellStart"/>
-            <w:r>
-              <w:rPr>
-                <w:rFonts w:ascii="Calibri" w:hAnsi="Calibri" w:cs="Calibri"/>
-              </w:rPr>
-              <w:t>programme_vol_id</w:t>
+            <w:proofErr w:type="gramStart"/>
+            <w:r>
+              <w:rPr>
+                <w:rFonts w:ascii="Calibri" w:hAnsi="Calibri" w:cs="Calibri"/>
+              </w:rPr>
+              <w:t>programme</w:t>
+            </w:r>
+            <w:proofErr w:type="gramEnd"/>
+            <w:r>
+              <w:rPr>
+                <w:rFonts w:ascii="Calibri" w:hAnsi="Calibri" w:cs="Calibri"/>
+              </w:rPr>
+              <w:t>_vol_id</w:t>
             </w:r>
             <w:proofErr w:type="spellEnd"/>
           </w:p>
@@ -6389,11 +6501,19 @@
               </w:rPr>
             </w:pPr>
             <w:proofErr w:type="spellStart"/>
-            <w:r>
-              <w:rPr>
-                <w:rFonts w:ascii="Calibri" w:hAnsi="Calibri" w:cs="Calibri"/>
-              </w:rPr>
-              <w:t>vol_numero</w:t>
+            <w:proofErr w:type="gramStart"/>
+            <w:r>
+              <w:rPr>
+                <w:rFonts w:ascii="Calibri" w:hAnsi="Calibri" w:cs="Calibri"/>
+              </w:rPr>
+              <w:t>vol</w:t>
+            </w:r>
+            <w:proofErr w:type="gramEnd"/>
+            <w:r>
+              <w:rPr>
+                <w:rFonts w:ascii="Calibri" w:hAnsi="Calibri" w:cs="Calibri"/>
+              </w:rPr>
+              <w:t>_numero</w:t>
             </w:r>
             <w:proofErr w:type="spellEnd"/>
           </w:p>
@@ -6450,11 +6570,19 @@
               </w:rPr>
             </w:pPr>
             <w:proofErr w:type="spellStart"/>
-            <w:r>
-              <w:rPr>
-                <w:rFonts w:ascii="Calibri" w:hAnsi="Calibri" w:cs="Calibri"/>
-              </w:rPr>
-              <w:t>programme_heure_depart</w:t>
+            <w:proofErr w:type="gramStart"/>
+            <w:r>
+              <w:rPr>
+                <w:rFonts w:ascii="Calibri" w:hAnsi="Calibri" w:cs="Calibri"/>
+              </w:rPr>
+              <w:t>programme</w:t>
+            </w:r>
+            <w:proofErr w:type="gramEnd"/>
+            <w:r>
+              <w:rPr>
+                <w:rFonts w:ascii="Calibri" w:hAnsi="Calibri" w:cs="Calibri"/>
+              </w:rPr>
+              <w:t>_heure_depart</w:t>
             </w:r>
             <w:proofErr w:type="spellEnd"/>
           </w:p>
@@ -6511,11 +6639,19 @@
               </w:rPr>
             </w:pPr>
             <w:proofErr w:type="spellStart"/>
-            <w:r>
-              <w:rPr>
-                <w:rFonts w:ascii="Calibri" w:hAnsi="Calibri" w:cs="Calibri"/>
-              </w:rPr>
-              <w:t>programme_heure_arrivee</w:t>
+            <w:proofErr w:type="gramStart"/>
+            <w:r>
+              <w:rPr>
+                <w:rFonts w:ascii="Calibri" w:hAnsi="Calibri" w:cs="Calibri"/>
+              </w:rPr>
+              <w:t>programme</w:t>
+            </w:r>
+            <w:proofErr w:type="gramEnd"/>
+            <w:r>
+              <w:rPr>
+                <w:rFonts w:ascii="Calibri" w:hAnsi="Calibri" w:cs="Calibri"/>
+              </w:rPr>
+              <w:t>_heure_arrivee</w:t>
             </w:r>
             <w:proofErr w:type="spellEnd"/>
           </w:p>
@@ -6649,11 +6785,19 @@
               </w:rPr>
             </w:pPr>
             <w:proofErr w:type="spellStart"/>
-            <w:r>
-              <w:rPr>
-                <w:rFonts w:ascii="Calibri" w:hAnsi="Calibri" w:cs="Calibri"/>
-              </w:rPr>
-              <w:t>jour_semaine_id</w:t>
+            <w:proofErr w:type="gramStart"/>
+            <w:r>
+              <w:rPr>
+                <w:rFonts w:ascii="Calibri" w:hAnsi="Calibri" w:cs="Calibri"/>
+              </w:rPr>
+              <w:t>jour</w:t>
+            </w:r>
+            <w:proofErr w:type="gramEnd"/>
+            <w:r>
+              <w:rPr>
+                <w:rFonts w:ascii="Calibri" w:hAnsi="Calibri" w:cs="Calibri"/>
+              </w:rPr>
+              <w:t>_semaine_id</w:t>
             </w:r>
             <w:proofErr w:type="spellEnd"/>
           </w:p>
@@ -6710,11 +6854,19 @@
               </w:rPr>
             </w:pPr>
             <w:proofErr w:type="spellStart"/>
-            <w:r>
-              <w:rPr>
-                <w:rFonts w:ascii="Calibri" w:hAnsi="Calibri" w:cs="Calibri"/>
-              </w:rPr>
-              <w:t>jour_semaine_libelle</w:t>
+            <w:proofErr w:type="gramStart"/>
+            <w:r>
+              <w:rPr>
+                <w:rFonts w:ascii="Calibri" w:hAnsi="Calibri" w:cs="Calibri"/>
+              </w:rPr>
+              <w:t>jour</w:t>
+            </w:r>
+            <w:proofErr w:type="gramEnd"/>
+            <w:r>
+              <w:rPr>
+                <w:rFonts w:ascii="Calibri" w:hAnsi="Calibri" w:cs="Calibri"/>
+              </w:rPr>
+              <w:t>_semaine_libelle</w:t>
             </w:r>
             <w:proofErr w:type="spellEnd"/>
           </w:p>
@@ -6848,11 +7000,19 @@
               </w:rPr>
             </w:pPr>
             <w:proofErr w:type="spellStart"/>
-            <w:r>
-              <w:rPr>
-                <w:rFonts w:ascii="Calibri" w:hAnsi="Calibri" w:cs="Calibri"/>
-              </w:rPr>
-              <w:t>vol_id</w:t>
+            <w:proofErr w:type="gramStart"/>
+            <w:r>
+              <w:rPr>
+                <w:rFonts w:ascii="Calibri" w:hAnsi="Calibri" w:cs="Calibri"/>
+              </w:rPr>
+              <w:t>vol</w:t>
+            </w:r>
+            <w:proofErr w:type="gramEnd"/>
+            <w:r>
+              <w:rPr>
+                <w:rFonts w:ascii="Calibri" w:hAnsi="Calibri" w:cs="Calibri"/>
+              </w:rPr>
+              <w:t>_id</w:t>
             </w:r>
             <w:proofErr w:type="spellEnd"/>
           </w:p>
@@ -6909,11 +7069,19 @@
               </w:rPr>
             </w:pPr>
             <w:proofErr w:type="spellStart"/>
-            <w:r>
-              <w:rPr>
-                <w:rFonts w:ascii="Calibri" w:hAnsi="Calibri" w:cs="Calibri"/>
-              </w:rPr>
-              <w:t>vol_date</w:t>
+            <w:proofErr w:type="gramStart"/>
+            <w:r>
+              <w:rPr>
+                <w:rFonts w:ascii="Calibri" w:hAnsi="Calibri" w:cs="Calibri"/>
+              </w:rPr>
+              <w:t>vol</w:t>
+            </w:r>
+            <w:proofErr w:type="gramEnd"/>
+            <w:r>
+              <w:rPr>
+                <w:rFonts w:ascii="Calibri" w:hAnsi="Calibri" w:cs="Calibri"/>
+              </w:rPr>
+              <w:t>_date</w:t>
             </w:r>
             <w:proofErr w:type="spellEnd"/>
           </w:p>
@@ -6970,11 +7138,19 @@
               </w:rPr>
             </w:pPr>
             <w:proofErr w:type="spellStart"/>
-            <w:r>
-              <w:rPr>
-                <w:rFonts w:ascii="Calibri" w:hAnsi="Calibri" w:cs="Calibri"/>
-              </w:rPr>
-              <w:t>vol_heure_depart</w:t>
+            <w:proofErr w:type="gramStart"/>
+            <w:r>
+              <w:rPr>
+                <w:rFonts w:ascii="Calibri" w:hAnsi="Calibri" w:cs="Calibri"/>
+              </w:rPr>
+              <w:t>vol</w:t>
+            </w:r>
+            <w:proofErr w:type="gramEnd"/>
+            <w:r>
+              <w:rPr>
+                <w:rFonts w:ascii="Calibri" w:hAnsi="Calibri" w:cs="Calibri"/>
+              </w:rPr>
+              <w:t>_heure_depart</w:t>
             </w:r>
             <w:proofErr w:type="spellEnd"/>
           </w:p>
@@ -7031,11 +7207,19 @@
               </w:rPr>
             </w:pPr>
             <w:proofErr w:type="spellStart"/>
-            <w:r>
-              <w:rPr>
-                <w:rFonts w:ascii="Calibri" w:hAnsi="Calibri" w:cs="Calibri"/>
-              </w:rPr>
-              <w:t>vol_heure_arrivee</w:t>
+            <w:proofErr w:type="gramStart"/>
+            <w:r>
+              <w:rPr>
+                <w:rFonts w:ascii="Calibri" w:hAnsi="Calibri" w:cs="Calibri"/>
+              </w:rPr>
+              <w:t>vol</w:t>
+            </w:r>
+            <w:proofErr w:type="gramEnd"/>
+            <w:r>
+              <w:rPr>
+                <w:rFonts w:ascii="Calibri" w:hAnsi="Calibri" w:cs="Calibri"/>
+              </w:rPr>
+              <w:t>_heure_arrivee</w:t>
             </w:r>
             <w:proofErr w:type="spellEnd"/>
           </w:p>
@@ -7169,11 +7353,19 @@
               </w:rPr>
             </w:pPr>
             <w:proofErr w:type="spellStart"/>
-            <w:r>
-              <w:rPr>
-                <w:rFonts w:ascii="Calibri" w:hAnsi="Calibri" w:cs="Calibri"/>
-              </w:rPr>
-              <w:t>passager_id</w:t>
+            <w:proofErr w:type="gramStart"/>
+            <w:r>
+              <w:rPr>
+                <w:rFonts w:ascii="Calibri" w:hAnsi="Calibri" w:cs="Calibri"/>
+              </w:rPr>
+              <w:t>passager</w:t>
+            </w:r>
+            <w:proofErr w:type="gramEnd"/>
+            <w:r>
+              <w:rPr>
+                <w:rFonts w:ascii="Calibri" w:hAnsi="Calibri" w:cs="Calibri"/>
+              </w:rPr>
+              <w:t>_id</w:t>
             </w:r>
             <w:proofErr w:type="spellEnd"/>
           </w:p>
@@ -7230,11 +7422,19 @@
               </w:rPr>
             </w:pPr>
             <w:proofErr w:type="spellStart"/>
-            <w:r>
-              <w:rPr>
-                <w:rFonts w:ascii="Calibri" w:hAnsi="Calibri" w:cs="Calibri"/>
-              </w:rPr>
-              <w:t>passager_numero_passeport</w:t>
+            <w:proofErr w:type="gramStart"/>
+            <w:r>
+              <w:rPr>
+                <w:rFonts w:ascii="Calibri" w:hAnsi="Calibri" w:cs="Calibri"/>
+              </w:rPr>
+              <w:t>passager</w:t>
+            </w:r>
+            <w:proofErr w:type="gramEnd"/>
+            <w:r>
+              <w:rPr>
+                <w:rFonts w:ascii="Calibri" w:hAnsi="Calibri" w:cs="Calibri"/>
+              </w:rPr>
+              <w:t>_numero_passeport</w:t>
             </w:r>
             <w:proofErr w:type="spellEnd"/>
           </w:p>
@@ -7291,11 +7491,19 @@
               </w:rPr>
             </w:pPr>
             <w:proofErr w:type="spellStart"/>
-            <w:r>
-              <w:rPr>
-                <w:rFonts w:ascii="Calibri" w:hAnsi="Calibri" w:cs="Calibri"/>
-              </w:rPr>
-              <w:t>passager_nom</w:t>
+            <w:proofErr w:type="gramStart"/>
+            <w:r>
+              <w:rPr>
+                <w:rFonts w:ascii="Calibri" w:hAnsi="Calibri" w:cs="Calibri"/>
+              </w:rPr>
+              <w:t>passager</w:t>
+            </w:r>
+            <w:proofErr w:type="gramEnd"/>
+            <w:r>
+              <w:rPr>
+                <w:rFonts w:ascii="Calibri" w:hAnsi="Calibri" w:cs="Calibri"/>
+              </w:rPr>
+              <w:t>_nom</w:t>
             </w:r>
             <w:proofErr w:type="spellEnd"/>
           </w:p>
@@ -7352,11 +7560,19 @@
               </w:rPr>
             </w:pPr>
             <w:proofErr w:type="spellStart"/>
-            <w:r>
-              <w:rPr>
-                <w:rFonts w:ascii="Calibri" w:hAnsi="Calibri" w:cs="Calibri"/>
-              </w:rPr>
-              <w:t>passager_prenom</w:t>
+            <w:proofErr w:type="gramStart"/>
+            <w:r>
+              <w:rPr>
+                <w:rFonts w:ascii="Calibri" w:hAnsi="Calibri" w:cs="Calibri"/>
+              </w:rPr>
+              <w:t>passager</w:t>
+            </w:r>
+            <w:proofErr w:type="gramEnd"/>
+            <w:r>
+              <w:rPr>
+                <w:rFonts w:ascii="Calibri" w:hAnsi="Calibri" w:cs="Calibri"/>
+              </w:rPr>
+              <w:t>_prenom</w:t>
             </w:r>
             <w:proofErr w:type="spellEnd"/>
           </w:p>
@@ -7490,11 +7706,19 @@
               </w:rPr>
             </w:pPr>
             <w:proofErr w:type="spellStart"/>
-            <w:r>
-              <w:rPr>
-                <w:rFonts w:ascii="Calibri" w:hAnsi="Calibri" w:cs="Calibri"/>
-              </w:rPr>
-              <w:t>reservation_id</w:t>
+            <w:proofErr w:type="gramStart"/>
+            <w:r>
+              <w:rPr>
+                <w:rFonts w:ascii="Calibri" w:hAnsi="Calibri" w:cs="Calibri"/>
+              </w:rPr>
+              <w:t>reservation</w:t>
+            </w:r>
+            <w:proofErr w:type="gramEnd"/>
+            <w:r>
+              <w:rPr>
+                <w:rFonts w:ascii="Calibri" w:hAnsi="Calibri" w:cs="Calibri"/>
+              </w:rPr>
+              <w:t>_id</w:t>
             </w:r>
             <w:proofErr w:type="spellEnd"/>
           </w:p>
@@ -7551,11 +7775,19 @@
               </w:rPr>
             </w:pPr>
             <w:proofErr w:type="spellStart"/>
-            <w:r>
-              <w:rPr>
-                <w:rFonts w:ascii="Calibri" w:hAnsi="Calibri" w:cs="Calibri"/>
-              </w:rPr>
-              <w:t>reservation_siege</w:t>
+            <w:proofErr w:type="gramStart"/>
+            <w:r>
+              <w:rPr>
+                <w:rFonts w:ascii="Calibri" w:hAnsi="Calibri" w:cs="Calibri"/>
+              </w:rPr>
+              <w:t>reservation</w:t>
+            </w:r>
+            <w:proofErr w:type="gramEnd"/>
+            <w:r>
+              <w:rPr>
+                <w:rFonts w:ascii="Calibri" w:hAnsi="Calibri" w:cs="Calibri"/>
+              </w:rPr>
+              <w:t>_siege</w:t>
             </w:r>
             <w:proofErr w:type="spellEnd"/>
           </w:p>
@@ -7612,11 +7844,19 @@
               </w:rPr>
             </w:pPr>
             <w:proofErr w:type="spellStart"/>
-            <w:r>
-              <w:rPr>
-                <w:rFonts w:ascii="Calibri" w:hAnsi="Calibri" w:cs="Calibri"/>
-              </w:rPr>
-              <w:t>reservation_prix</w:t>
+            <w:proofErr w:type="gramStart"/>
+            <w:r>
+              <w:rPr>
+                <w:rFonts w:ascii="Calibri" w:hAnsi="Calibri" w:cs="Calibri"/>
+              </w:rPr>
+              <w:t>reservation</w:t>
+            </w:r>
+            <w:proofErr w:type="gramEnd"/>
+            <w:r>
+              <w:rPr>
+                <w:rFonts w:ascii="Calibri" w:hAnsi="Calibri" w:cs="Calibri"/>
+              </w:rPr>
+              <w:t>_prix</w:t>
             </w:r>
             <w:proofErr w:type="spellEnd"/>
           </w:p>
@@ -7674,7 +7914,7 @@
           <w:szCs w:val="32"/>
         </w:rPr>
       </w:pPr>
-      <w:bookmarkStart w:id="8" w:name="_Toc244069780"/>
+      <w:bookmarkStart w:id="8" w:name="_Toc244075386"/>
       <w:r>
         <w:rPr>
           <w:rFonts w:ascii="Calibri" w:hAnsi="Calibri" w:cs="Calibri"/>
@@ -8206,7 +8446,7 @@
           <w:szCs w:val="32"/>
         </w:rPr>
       </w:pPr>
-      <w:bookmarkStart w:id="9" w:name="_Toc244069781"/>
+      <w:bookmarkStart w:id="9" w:name="_Toc244075387"/>
       <w:r>
         <w:rPr>
           <w:rFonts w:ascii="Calibri" w:hAnsi="Calibri" w:cs="Calibri"/>
@@ -9299,7 +9539,7 @@
           <w:szCs w:val="32"/>
         </w:rPr>
       </w:pPr>
-      <w:bookmarkStart w:id="10" w:name="_Toc244069782"/>
+      <w:bookmarkStart w:id="10" w:name="_Toc244075388"/>
       <w:r>
         <w:rPr>
           <w:rFonts w:ascii="Calibri" w:hAnsi="Calibri" w:cs="Calibri"/>
@@ -9406,7 +9646,7 @@
           <w:szCs w:val="32"/>
         </w:rPr>
       </w:pPr>
-      <w:bookmarkStart w:id="11" w:name="_Toc244069783"/>
+      <w:bookmarkStart w:id="11" w:name="_Toc244075389"/>
       <w:r>
         <w:rPr>
           <w:rFonts w:ascii="Calibri" w:hAnsi="Calibri" w:cs="Calibri"/>
@@ -9496,7 +9736,7 @@
           <w:szCs w:val="36"/>
         </w:rPr>
       </w:pPr>
-      <w:bookmarkStart w:id="12" w:name="_Toc244069784"/>
+      <w:bookmarkStart w:id="12" w:name="_Toc244075390"/>
       <w:r>
         <w:rPr>
           <w:rFonts w:ascii="Calibri" w:hAnsi="Calibri" w:cs="Calibri"/>
@@ -9731,9 +9971,9 @@
           <w:szCs w:val="36"/>
         </w:rPr>
       </w:pPr>
-      <w:bookmarkStart w:id="13" w:name="_Toc244069785"/>
-      <w:bookmarkStart w:id="14" w:name="_3.3_Chargement_des"/>
-      <w:bookmarkEnd w:id="14"/>
+      <w:bookmarkStart w:id="13" w:name="_3.3_Chargement_des"/>
+      <w:bookmarkStart w:id="14" w:name="_Toc244075391"/>
+      <w:bookmarkEnd w:id="13"/>
       <w:r>
         <w:rPr>
           <w:rFonts w:ascii="Calibri" w:hAnsi="Calibri" w:cs="Calibri"/>
@@ -9745,7 +9985,7 @@
         <w:lastRenderedPageBreak/>
         <w:t>3.3 Chargement des données</w:t>
       </w:r>
-      <w:bookmarkEnd w:id="13"/>
+      <w:bookmarkEnd w:id="14"/>
     </w:p>
     <w:p>
       <w:pPr>
@@ -11269,7 +11509,25 @@
                 <w:color w:val="25364B"/>
                 <w:sz w:val="18"/>
               </w:rPr>
-              <w:t xml:space="preserve">(aeroport_id, </w:t>
+              <w:t>(</w:t>
+            </w:r>
+            <w:proofErr w:type="gramStart"/>
+            <w:r>
+              <w:rPr>
+                <w:rFonts w:ascii="DejaVu Sans Mono" w:hAnsi="DejaVu Sans Mono"/>
+                <w:color w:val="25364B"/>
+                <w:sz w:val="18"/>
+              </w:rPr>
+              <w:t>aeroport</w:t>
+            </w:r>
+            <w:proofErr w:type="gramEnd"/>
+            <w:r>
+              <w:rPr>
+                <w:rFonts w:ascii="DejaVu Sans Mono" w:hAnsi="DejaVu Sans Mono"/>
+                <w:color w:val="25364B"/>
+                <w:sz w:val="18"/>
+              </w:rPr>
+              <w:t xml:space="preserve">_id, </w:t>
             </w:r>
             <w:r>
               <w:rPr>
@@ -11440,7 +11698,25 @@
                 <w:color w:val="25364B"/>
                 <w:sz w:val="18"/>
               </w:rPr>
-              <w:t xml:space="preserve">    code_iata = </w:t>
+              <w:t xml:space="preserve">    </w:t>
+            </w:r>
+            <w:proofErr w:type="gramStart"/>
+            <w:r>
+              <w:rPr>
+                <w:rFonts w:ascii="DejaVu Sans Mono" w:hAnsi="DejaVu Sans Mono"/>
+                <w:color w:val="25364B"/>
+                <w:sz w:val="18"/>
+              </w:rPr>
+              <w:t>code</w:t>
+            </w:r>
+            <w:proofErr w:type="gramEnd"/>
+            <w:r>
+              <w:rPr>
+                <w:rFonts w:ascii="DejaVu Sans Mono" w:hAnsi="DejaVu Sans Mono"/>
+                <w:color w:val="25364B"/>
+                <w:sz w:val="18"/>
+              </w:rPr>
+              <w:t xml:space="preserve">_iata = </w:t>
             </w:r>
             <w:r>
               <w:rPr>
@@ -11558,7 +11834,25 @@
                 <w:color w:val="25364B"/>
                 <w:sz w:val="18"/>
               </w:rPr>
-              <w:t xml:space="preserve">    code_icao = </w:t>
+              <w:t xml:space="preserve">    </w:t>
+            </w:r>
+            <w:proofErr w:type="gramStart"/>
+            <w:r>
+              <w:rPr>
+                <w:rFonts w:ascii="DejaVu Sans Mono" w:hAnsi="DejaVu Sans Mono"/>
+                <w:color w:val="25364B"/>
+                <w:sz w:val="18"/>
+              </w:rPr>
+              <w:t>code</w:t>
+            </w:r>
+            <w:proofErr w:type="gramEnd"/>
+            <w:r>
+              <w:rPr>
+                <w:rFonts w:ascii="DejaVu Sans Mono" w:hAnsi="DejaVu Sans Mono"/>
+                <w:color w:val="25364B"/>
+                <w:sz w:val="18"/>
+              </w:rPr>
+              <w:t xml:space="preserve">_icao = </w:t>
             </w:r>
             <w:r>
               <w:rPr>
@@ -19498,7 +19792,7 @@
           <w:szCs w:val="36"/>
         </w:rPr>
       </w:pPr>
-      <w:bookmarkStart w:id="15" w:name="_Toc244069786"/>
+      <w:bookmarkStart w:id="15" w:name="_Toc244075392"/>
       <w:r>
         <w:rPr>
           <w:rFonts w:ascii="Calibri" w:hAnsi="Calibri" w:cs="Calibri"/>
@@ -21337,6 +21631,7 @@
               <w:t xml:space="preserve">, </w:t>
             </w:r>
             <w:proofErr w:type="spellStart"/>
+            <w:proofErr w:type="gramStart"/>
             <w:r>
               <w:rPr>
                 <w:lang w:val="en-US"/>
@@ -21344,6 +21639,7 @@
               <w:t>P.prenom</w:t>
             </w:r>
             <w:proofErr w:type="spellEnd"/>
+            <w:proofErr w:type="gramEnd"/>
             <w:r>
               <w:rPr>
                 <w:lang w:val="en-US"/>
@@ -21351,11 +21647,19 @@
               <w:t xml:space="preserve">, </w:t>
             </w:r>
             <w:proofErr w:type="spellStart"/>
+            <w:proofErr w:type="gramStart"/>
             <w:r>
               <w:rPr>
                 <w:lang w:val="en-US"/>
               </w:rPr>
-              <w:t>P.numero_passeport</w:t>
+              <w:t>P.numero</w:t>
+            </w:r>
+            <w:proofErr w:type="gramEnd"/>
+            <w:r>
+              <w:rPr>
+                <w:lang w:val="en-US"/>
+              </w:rPr>
+              <w:t>_passeport</w:t>
             </w:r>
             <w:proofErr w:type="spellEnd"/>
             <w:r>
@@ -21541,11 +21845,19 @@
               <w:t xml:space="preserve">JOIN t_reservation AS R ON </w:t>
             </w:r>
             <w:proofErr w:type="spellStart"/>
+            <w:proofErr w:type="gramStart"/>
             <w:r>
               <w:rPr>
                 <w:lang w:val="en-US"/>
               </w:rPr>
-              <w:t>R.passager_fk</w:t>
+              <w:t>R.passager</w:t>
+            </w:r>
+            <w:proofErr w:type="gramEnd"/>
+            <w:r>
+              <w:rPr>
+                <w:lang w:val="en-US"/>
+              </w:rPr>
+              <w:t>_fk</w:t>
             </w:r>
             <w:proofErr w:type="spellEnd"/>
             <w:r>
@@ -21555,11 +21867,19 @@
               <w:t xml:space="preserve"> = </w:t>
             </w:r>
             <w:proofErr w:type="spellStart"/>
+            <w:proofErr w:type="gramStart"/>
             <w:r>
               <w:rPr>
                 <w:lang w:val="en-US"/>
               </w:rPr>
-              <w:t>P.passager_id</w:t>
+              <w:t>P.passager</w:t>
+            </w:r>
+            <w:proofErr w:type="gramEnd"/>
+            <w:r>
+              <w:rPr>
+                <w:lang w:val="en-US"/>
+              </w:rPr>
+              <w:t>_id</w:t>
             </w:r>
             <w:proofErr w:type="spellEnd"/>
           </w:p>
@@ -21744,11 +22064,19 @@
               <w:t xml:space="preserve"> AS A ON </w:t>
             </w:r>
             <w:proofErr w:type="spellStart"/>
+            <w:proofErr w:type="gramStart"/>
             <w:r>
               <w:rPr>
                 <w:lang w:val="en-US"/>
               </w:rPr>
-              <w:t>A.aeroport_id</w:t>
+              <w:t>A.aeroport</w:t>
+            </w:r>
+            <w:proofErr w:type="gramEnd"/>
+            <w:r>
+              <w:rPr>
+                <w:lang w:val="en-US"/>
+              </w:rPr>
+              <w:t>_id</w:t>
             </w:r>
             <w:proofErr w:type="spellEnd"/>
             <w:r>
@@ -21758,11 +22086,19 @@
               <w:t xml:space="preserve"> = </w:t>
             </w:r>
             <w:proofErr w:type="spellStart"/>
+            <w:proofErr w:type="gramStart"/>
             <w:r>
               <w:rPr>
                 <w:lang w:val="en-US"/>
               </w:rPr>
-              <w:t>V.aeroport_depart_fk</w:t>
+              <w:t>V.aeroport</w:t>
+            </w:r>
+            <w:proofErr w:type="gramEnd"/>
+            <w:r>
+              <w:rPr>
+                <w:lang w:val="en-US"/>
+              </w:rPr>
+              <w:t>_depart_fk</w:t>
             </w:r>
             <w:proofErr w:type="spellEnd"/>
             <w:r>
@@ -22189,11 +22525,19 @@
                 <w:lang w:val="en-US"/>
               </w:rPr>
             </w:pPr>
+            <w:proofErr w:type="gramStart"/>
             <w:r>
               <w:rPr>
                 <w:lang w:val="en-US"/>
               </w:rPr>
-              <w:t>FROM t_reservation</w:t>
+              <w:t>FROM t</w:t>
+            </w:r>
+            <w:proofErr w:type="gramEnd"/>
+            <w:r>
+              <w:rPr>
+                <w:lang w:val="en-US"/>
+              </w:rPr>
+              <w:t>_reservation</w:t>
             </w:r>
           </w:p>
         </w:tc>
@@ -22783,7 +23127,7 @@
           <w:szCs w:val="36"/>
         </w:rPr>
       </w:pPr>
-      <w:bookmarkStart w:id="16" w:name="_Toc244069787"/>
+      <w:bookmarkStart w:id="16" w:name="_Toc244075393"/>
       <w:r>
         <w:rPr>
           <w:rFonts w:ascii="Calibri" w:hAnsi="Calibri" w:cs="Calibri"/>
@@ -22808,7 +23152,7 @@
           <w:szCs w:val="36"/>
         </w:rPr>
       </w:pPr>
-      <w:bookmarkStart w:id="17" w:name="_Toc244069788"/>
+      <w:bookmarkStart w:id="17" w:name="_Toc244075394"/>
       <w:r>
         <w:rPr>
           <w:rFonts w:ascii="Calibri" w:hAnsi="Calibri" w:cs="Calibri"/>
@@ -22833,7 +23177,7 @@
           <w:szCs w:val="36"/>
         </w:rPr>
       </w:pPr>
-      <w:bookmarkStart w:id="18" w:name="_Toc244069789"/>
+      <w:bookmarkStart w:id="18" w:name="_Toc244075395"/>
       <w:r>
         <w:rPr>
           <w:rFonts w:ascii="Calibri" w:hAnsi="Calibri" w:cs="Calibri"/>
@@ -22856,7 +23200,7 @@
           <w:bCs/>
         </w:rPr>
       </w:pPr>
-      <w:bookmarkStart w:id="19" w:name="_Toc244069790"/>
+      <w:bookmarkStart w:id="19" w:name="_Toc244075396"/>
       <w:r>
         <w:rPr>
           <w:rFonts w:ascii="Calibri" w:hAnsi="Calibri" w:cs="Calibri"/>
@@ -22884,7 +23228,7 @@
           <w:bCs/>
         </w:rPr>
       </w:pPr>
-      <w:bookmarkStart w:id="20" w:name="_Toc244069791"/>
+      <w:bookmarkStart w:id="20" w:name="_Toc244075397"/>
       <w:r>
         <w:rPr>
           <w:rFonts w:ascii="Calibri" w:hAnsi="Calibri" w:cs="Calibri"/>
@@ -22904,7 +23248,7 @@
           <w:bCs/>
         </w:rPr>
       </w:pPr>
-      <w:bookmarkStart w:id="21" w:name="_Toc244069792"/>
+      <w:bookmarkStart w:id="21" w:name="_Toc244075398"/>
       <w:r>
         <w:rPr>
           <w:rFonts w:ascii="Calibri" w:hAnsi="Calibri" w:cs="Calibri"/>
@@ -22985,7 +23329,7 @@
           <w:bCs/>
         </w:rPr>
       </w:pPr>
-      <w:bookmarkStart w:id="22" w:name="_Toc244069793"/>
+      <w:bookmarkStart w:id="22" w:name="_Toc244075399"/>
       <w:r>
         <w:rPr>
           <w:rFonts w:ascii="Calibri" w:hAnsi="Calibri" w:cs="Calibri"/>

</xml_diff>

<commit_message>
doc(rapport): Ajout de 2 sources
</commit_message>
<xml_diff>
--- a/DOC/annexes/AugustoRomain-P_DB_GestionAeroport-Rapport.docx
+++ b/DOC/annexes/AugustoRomain-P_DB_GestionAeroport-Rapport.docx
@@ -5228,19 +5228,11 @@
                 <w:rFonts w:ascii="Calibri" w:hAnsi="Calibri" w:cs="Calibri"/>
               </w:rPr>
             </w:pPr>
-            <w:proofErr w:type="gramStart"/>
-            <w:r>
-              <w:rPr>
-                <w:rFonts w:ascii="Calibri" w:hAnsi="Calibri" w:cs="Calibri"/>
-              </w:rPr>
-              <w:t>aeroport</w:t>
-            </w:r>
-            <w:proofErr w:type="gramEnd"/>
-            <w:r>
-              <w:rPr>
-                <w:rFonts w:ascii="Calibri" w:hAnsi="Calibri" w:cs="Calibri"/>
-              </w:rPr>
-              <w:t>_id</w:t>
+            <w:r>
+              <w:rPr>
+                <w:rFonts w:ascii="Calibri" w:hAnsi="Calibri" w:cs="Calibri"/>
+              </w:rPr>
+              <w:t>aeroport_id</w:t>
             </w:r>
           </w:p>
         </w:tc>
@@ -5296,19 +5288,11 @@
               </w:rPr>
             </w:pPr>
             <w:proofErr w:type="spellStart"/>
-            <w:proofErr w:type="gramStart"/>
-            <w:r>
-              <w:rPr>
-                <w:rFonts w:ascii="Calibri" w:hAnsi="Calibri" w:cs="Calibri"/>
-              </w:rPr>
-              <w:t>aeroport</w:t>
-            </w:r>
-            <w:proofErr w:type="gramEnd"/>
-            <w:r>
-              <w:rPr>
-                <w:rFonts w:ascii="Calibri" w:hAnsi="Calibri" w:cs="Calibri"/>
-              </w:rPr>
-              <w:t>_nom</w:t>
+            <w:r>
+              <w:rPr>
+                <w:rFonts w:ascii="Calibri" w:hAnsi="Calibri" w:cs="Calibri"/>
+              </w:rPr>
+              <w:t>aeroport_nom</w:t>
             </w:r>
             <w:proofErr w:type="spellEnd"/>
           </w:p>
@@ -5365,19 +5349,11 @@
               </w:rPr>
             </w:pPr>
             <w:proofErr w:type="spellStart"/>
-            <w:proofErr w:type="gramStart"/>
-            <w:r>
-              <w:rPr>
-                <w:rFonts w:ascii="Calibri" w:hAnsi="Calibri" w:cs="Calibri"/>
-              </w:rPr>
-              <w:t>aeroport</w:t>
-            </w:r>
-            <w:proofErr w:type="gramEnd"/>
-            <w:r>
-              <w:rPr>
-                <w:rFonts w:ascii="Calibri" w:hAnsi="Calibri" w:cs="Calibri"/>
-              </w:rPr>
-              <w:t>_code_iata</w:t>
+            <w:r>
+              <w:rPr>
+                <w:rFonts w:ascii="Calibri" w:hAnsi="Calibri" w:cs="Calibri"/>
+              </w:rPr>
+              <w:t>aeroport_code_iata</w:t>
             </w:r>
             <w:proofErr w:type="spellEnd"/>
           </w:p>
@@ -5434,19 +5410,11 @@
               </w:rPr>
             </w:pPr>
             <w:proofErr w:type="spellStart"/>
-            <w:proofErr w:type="gramStart"/>
-            <w:r>
-              <w:rPr>
-                <w:rFonts w:ascii="Calibri" w:hAnsi="Calibri" w:cs="Calibri"/>
-              </w:rPr>
-              <w:t>aeroport</w:t>
-            </w:r>
-            <w:proofErr w:type="gramEnd"/>
-            <w:r>
-              <w:rPr>
-                <w:rFonts w:ascii="Calibri" w:hAnsi="Calibri" w:cs="Calibri"/>
-              </w:rPr>
-              <w:t>_code_icao</w:t>
+            <w:r>
+              <w:rPr>
+                <w:rFonts w:ascii="Calibri" w:hAnsi="Calibri" w:cs="Calibri"/>
+              </w:rPr>
+              <w:t>aeroport_code_icao</w:t>
             </w:r>
             <w:proofErr w:type="spellEnd"/>
           </w:p>
@@ -5580,19 +5548,11 @@
               </w:rPr>
             </w:pPr>
             <w:proofErr w:type="spellStart"/>
-            <w:proofErr w:type="gramStart"/>
-            <w:r>
-              <w:rPr>
-                <w:rFonts w:ascii="Calibri" w:hAnsi="Calibri" w:cs="Calibri"/>
-              </w:rPr>
-              <w:t>compagnie</w:t>
-            </w:r>
-            <w:proofErr w:type="gramEnd"/>
-            <w:r>
-              <w:rPr>
-                <w:rFonts w:ascii="Calibri" w:hAnsi="Calibri" w:cs="Calibri"/>
-              </w:rPr>
-              <w:t>_id</w:t>
+            <w:r>
+              <w:rPr>
+                <w:rFonts w:ascii="Calibri" w:hAnsi="Calibri" w:cs="Calibri"/>
+              </w:rPr>
+              <w:t>compagnie_id</w:t>
             </w:r>
             <w:proofErr w:type="spellEnd"/>
           </w:p>
@@ -5649,19 +5609,11 @@
               </w:rPr>
             </w:pPr>
             <w:proofErr w:type="spellStart"/>
-            <w:proofErr w:type="gramStart"/>
-            <w:r>
-              <w:rPr>
-                <w:rFonts w:ascii="Calibri" w:hAnsi="Calibri" w:cs="Calibri"/>
-              </w:rPr>
-              <w:t>compagnie</w:t>
-            </w:r>
-            <w:proofErr w:type="gramEnd"/>
-            <w:r>
-              <w:rPr>
-                <w:rFonts w:ascii="Calibri" w:hAnsi="Calibri" w:cs="Calibri"/>
-              </w:rPr>
-              <w:t>_nom</w:t>
+            <w:r>
+              <w:rPr>
+                <w:rFonts w:ascii="Calibri" w:hAnsi="Calibri" w:cs="Calibri"/>
+              </w:rPr>
+              <w:t>compagnie_nom</w:t>
             </w:r>
             <w:proofErr w:type="spellEnd"/>
           </w:p>
@@ -5718,19 +5670,11 @@
               </w:rPr>
             </w:pPr>
             <w:proofErr w:type="spellStart"/>
-            <w:proofErr w:type="gramStart"/>
-            <w:r>
-              <w:rPr>
-                <w:rFonts w:ascii="Calibri" w:hAnsi="Calibri" w:cs="Calibri"/>
-              </w:rPr>
-              <w:t>compagnie</w:t>
-            </w:r>
-            <w:proofErr w:type="gramEnd"/>
-            <w:r>
-              <w:rPr>
-                <w:rFonts w:ascii="Calibri" w:hAnsi="Calibri" w:cs="Calibri"/>
-              </w:rPr>
-              <w:t>_code_iata</w:t>
+            <w:r>
+              <w:rPr>
+                <w:rFonts w:ascii="Calibri" w:hAnsi="Calibri" w:cs="Calibri"/>
+              </w:rPr>
+              <w:t>compagnie_code_iata</w:t>
             </w:r>
             <w:proofErr w:type="spellEnd"/>
           </w:p>
@@ -5864,19 +5808,11 @@
               </w:rPr>
             </w:pPr>
             <w:proofErr w:type="spellStart"/>
-            <w:proofErr w:type="gramStart"/>
-            <w:r>
-              <w:rPr>
-                <w:rFonts w:ascii="Calibri" w:hAnsi="Calibri" w:cs="Calibri"/>
-              </w:rPr>
-              <w:t>avion</w:t>
-            </w:r>
-            <w:proofErr w:type="gramEnd"/>
-            <w:r>
-              <w:rPr>
-                <w:rFonts w:ascii="Calibri" w:hAnsi="Calibri" w:cs="Calibri"/>
-              </w:rPr>
-              <w:t>_id</w:t>
+            <w:r>
+              <w:rPr>
+                <w:rFonts w:ascii="Calibri" w:hAnsi="Calibri" w:cs="Calibri"/>
+              </w:rPr>
+              <w:t>avion_id</w:t>
             </w:r>
             <w:proofErr w:type="spellEnd"/>
           </w:p>
@@ -5933,19 +5869,11 @@
               </w:rPr>
             </w:pPr>
             <w:proofErr w:type="spellStart"/>
-            <w:proofErr w:type="gramStart"/>
-            <w:r>
-              <w:rPr>
-                <w:rFonts w:ascii="Calibri" w:hAnsi="Calibri" w:cs="Calibri"/>
-              </w:rPr>
-              <w:t>avion</w:t>
-            </w:r>
-            <w:proofErr w:type="gramEnd"/>
-            <w:r>
-              <w:rPr>
-                <w:rFonts w:ascii="Calibri" w:hAnsi="Calibri" w:cs="Calibri"/>
-              </w:rPr>
-              <w:t>_immatriculation</w:t>
+            <w:r>
+              <w:rPr>
+                <w:rFonts w:ascii="Calibri" w:hAnsi="Calibri" w:cs="Calibri"/>
+              </w:rPr>
+              <w:t>avion_immatriculation</w:t>
             </w:r>
             <w:proofErr w:type="spellEnd"/>
           </w:p>
@@ -6002,19 +5930,11 @@
               </w:rPr>
             </w:pPr>
             <w:proofErr w:type="spellStart"/>
-            <w:proofErr w:type="gramStart"/>
-            <w:r>
-              <w:rPr>
-                <w:rFonts w:ascii="Calibri" w:hAnsi="Calibri" w:cs="Calibri"/>
-              </w:rPr>
-              <w:t>avion</w:t>
-            </w:r>
-            <w:proofErr w:type="gramEnd"/>
-            <w:r>
-              <w:rPr>
-                <w:rFonts w:ascii="Calibri" w:hAnsi="Calibri" w:cs="Calibri"/>
-              </w:rPr>
-              <w:t>_capacite</w:t>
+            <w:r>
+              <w:rPr>
+                <w:rFonts w:ascii="Calibri" w:hAnsi="Calibri" w:cs="Calibri"/>
+              </w:rPr>
+              <w:t>avion_capacite</w:t>
             </w:r>
             <w:proofErr w:type="spellEnd"/>
           </w:p>
@@ -6148,19 +6068,11 @@
               </w:rPr>
             </w:pPr>
             <w:proofErr w:type="spellStart"/>
-            <w:proofErr w:type="gramStart"/>
-            <w:r>
-              <w:rPr>
-                <w:rFonts w:ascii="Calibri" w:hAnsi="Calibri" w:cs="Calibri"/>
-              </w:rPr>
-              <w:t>type</w:t>
-            </w:r>
-            <w:proofErr w:type="gramEnd"/>
-            <w:r>
-              <w:rPr>
-                <w:rFonts w:ascii="Calibri" w:hAnsi="Calibri" w:cs="Calibri"/>
-              </w:rPr>
-              <w:t>_avion_id</w:t>
+            <w:r>
+              <w:rPr>
+                <w:rFonts w:ascii="Calibri" w:hAnsi="Calibri" w:cs="Calibri"/>
+              </w:rPr>
+              <w:t>type_avion_id</w:t>
             </w:r>
             <w:proofErr w:type="spellEnd"/>
           </w:p>
@@ -6217,19 +6129,11 @@
               </w:rPr>
             </w:pPr>
             <w:proofErr w:type="spellStart"/>
-            <w:proofErr w:type="gramStart"/>
-            <w:r>
-              <w:rPr>
-                <w:rFonts w:ascii="Calibri" w:hAnsi="Calibri" w:cs="Calibri"/>
-              </w:rPr>
-              <w:t>type</w:t>
-            </w:r>
-            <w:proofErr w:type="gramEnd"/>
-            <w:r>
-              <w:rPr>
-                <w:rFonts w:ascii="Calibri" w:hAnsi="Calibri" w:cs="Calibri"/>
-              </w:rPr>
-              <w:t>_avion_nom</w:t>
+            <w:r>
+              <w:rPr>
+                <w:rFonts w:ascii="Calibri" w:hAnsi="Calibri" w:cs="Calibri"/>
+              </w:rPr>
+              <w:t>type_avion_nom</w:t>
             </w:r>
             <w:proofErr w:type="spellEnd"/>
           </w:p>
@@ -6286,19 +6190,11 @@
               </w:rPr>
             </w:pPr>
             <w:proofErr w:type="spellStart"/>
-            <w:proofErr w:type="gramStart"/>
-            <w:r>
-              <w:rPr>
-                <w:rFonts w:ascii="Calibri" w:hAnsi="Calibri" w:cs="Calibri"/>
-              </w:rPr>
-              <w:t>type</w:t>
-            </w:r>
-            <w:proofErr w:type="gramEnd"/>
-            <w:r>
-              <w:rPr>
-                <w:rFonts w:ascii="Calibri" w:hAnsi="Calibri" w:cs="Calibri"/>
-              </w:rPr>
-              <w:t>_avion_description</w:t>
+            <w:r>
+              <w:rPr>
+                <w:rFonts w:ascii="Calibri" w:hAnsi="Calibri" w:cs="Calibri"/>
+              </w:rPr>
+              <w:t>type_avion_description</w:t>
             </w:r>
             <w:proofErr w:type="spellEnd"/>
           </w:p>
@@ -6432,19 +6328,11 @@
               </w:rPr>
             </w:pPr>
             <w:proofErr w:type="spellStart"/>
-            <w:proofErr w:type="gramStart"/>
-            <w:r>
-              <w:rPr>
-                <w:rFonts w:ascii="Calibri" w:hAnsi="Calibri" w:cs="Calibri"/>
-              </w:rPr>
-              <w:t>programme</w:t>
-            </w:r>
-            <w:proofErr w:type="gramEnd"/>
-            <w:r>
-              <w:rPr>
-                <w:rFonts w:ascii="Calibri" w:hAnsi="Calibri" w:cs="Calibri"/>
-              </w:rPr>
-              <w:t>_vol_id</w:t>
+            <w:r>
+              <w:rPr>
+                <w:rFonts w:ascii="Calibri" w:hAnsi="Calibri" w:cs="Calibri"/>
+              </w:rPr>
+              <w:t>programme_vol_id</w:t>
             </w:r>
             <w:proofErr w:type="spellEnd"/>
           </w:p>
@@ -6501,19 +6389,11 @@
               </w:rPr>
             </w:pPr>
             <w:proofErr w:type="spellStart"/>
-            <w:proofErr w:type="gramStart"/>
-            <w:r>
-              <w:rPr>
-                <w:rFonts w:ascii="Calibri" w:hAnsi="Calibri" w:cs="Calibri"/>
-              </w:rPr>
-              <w:t>vol</w:t>
-            </w:r>
-            <w:proofErr w:type="gramEnd"/>
-            <w:r>
-              <w:rPr>
-                <w:rFonts w:ascii="Calibri" w:hAnsi="Calibri" w:cs="Calibri"/>
-              </w:rPr>
-              <w:t>_numero</w:t>
+            <w:r>
+              <w:rPr>
+                <w:rFonts w:ascii="Calibri" w:hAnsi="Calibri" w:cs="Calibri"/>
+              </w:rPr>
+              <w:t>vol_numero</w:t>
             </w:r>
             <w:proofErr w:type="spellEnd"/>
           </w:p>
@@ -6570,19 +6450,11 @@
               </w:rPr>
             </w:pPr>
             <w:proofErr w:type="spellStart"/>
-            <w:proofErr w:type="gramStart"/>
-            <w:r>
-              <w:rPr>
-                <w:rFonts w:ascii="Calibri" w:hAnsi="Calibri" w:cs="Calibri"/>
-              </w:rPr>
-              <w:t>programme</w:t>
-            </w:r>
-            <w:proofErr w:type="gramEnd"/>
-            <w:r>
-              <w:rPr>
-                <w:rFonts w:ascii="Calibri" w:hAnsi="Calibri" w:cs="Calibri"/>
-              </w:rPr>
-              <w:t>_heure_depart</w:t>
+            <w:r>
+              <w:rPr>
+                <w:rFonts w:ascii="Calibri" w:hAnsi="Calibri" w:cs="Calibri"/>
+              </w:rPr>
+              <w:t>programme_heure_depart</w:t>
             </w:r>
             <w:proofErr w:type="spellEnd"/>
           </w:p>
@@ -6639,19 +6511,11 @@
               </w:rPr>
             </w:pPr>
             <w:proofErr w:type="spellStart"/>
-            <w:proofErr w:type="gramStart"/>
-            <w:r>
-              <w:rPr>
-                <w:rFonts w:ascii="Calibri" w:hAnsi="Calibri" w:cs="Calibri"/>
-              </w:rPr>
-              <w:t>programme</w:t>
-            </w:r>
-            <w:proofErr w:type="gramEnd"/>
-            <w:r>
-              <w:rPr>
-                <w:rFonts w:ascii="Calibri" w:hAnsi="Calibri" w:cs="Calibri"/>
-              </w:rPr>
-              <w:t>_heure_arrivee</w:t>
+            <w:r>
+              <w:rPr>
+                <w:rFonts w:ascii="Calibri" w:hAnsi="Calibri" w:cs="Calibri"/>
+              </w:rPr>
+              <w:t>programme_heure_arrivee</w:t>
             </w:r>
             <w:proofErr w:type="spellEnd"/>
           </w:p>
@@ -6785,19 +6649,11 @@
               </w:rPr>
             </w:pPr>
             <w:proofErr w:type="spellStart"/>
-            <w:proofErr w:type="gramStart"/>
-            <w:r>
-              <w:rPr>
-                <w:rFonts w:ascii="Calibri" w:hAnsi="Calibri" w:cs="Calibri"/>
-              </w:rPr>
-              <w:t>jour</w:t>
-            </w:r>
-            <w:proofErr w:type="gramEnd"/>
-            <w:r>
-              <w:rPr>
-                <w:rFonts w:ascii="Calibri" w:hAnsi="Calibri" w:cs="Calibri"/>
-              </w:rPr>
-              <w:t>_semaine_id</w:t>
+            <w:r>
+              <w:rPr>
+                <w:rFonts w:ascii="Calibri" w:hAnsi="Calibri" w:cs="Calibri"/>
+              </w:rPr>
+              <w:t>jour_semaine_id</w:t>
             </w:r>
             <w:proofErr w:type="spellEnd"/>
           </w:p>
@@ -6854,19 +6710,11 @@
               </w:rPr>
             </w:pPr>
             <w:proofErr w:type="spellStart"/>
-            <w:proofErr w:type="gramStart"/>
-            <w:r>
-              <w:rPr>
-                <w:rFonts w:ascii="Calibri" w:hAnsi="Calibri" w:cs="Calibri"/>
-              </w:rPr>
-              <w:t>jour</w:t>
-            </w:r>
-            <w:proofErr w:type="gramEnd"/>
-            <w:r>
-              <w:rPr>
-                <w:rFonts w:ascii="Calibri" w:hAnsi="Calibri" w:cs="Calibri"/>
-              </w:rPr>
-              <w:t>_semaine_libelle</w:t>
+            <w:r>
+              <w:rPr>
+                <w:rFonts w:ascii="Calibri" w:hAnsi="Calibri" w:cs="Calibri"/>
+              </w:rPr>
+              <w:t>jour_semaine_libelle</w:t>
             </w:r>
             <w:proofErr w:type="spellEnd"/>
           </w:p>
@@ -7000,19 +6848,11 @@
               </w:rPr>
             </w:pPr>
             <w:proofErr w:type="spellStart"/>
-            <w:proofErr w:type="gramStart"/>
-            <w:r>
-              <w:rPr>
-                <w:rFonts w:ascii="Calibri" w:hAnsi="Calibri" w:cs="Calibri"/>
-              </w:rPr>
-              <w:t>vol</w:t>
-            </w:r>
-            <w:proofErr w:type="gramEnd"/>
-            <w:r>
-              <w:rPr>
-                <w:rFonts w:ascii="Calibri" w:hAnsi="Calibri" w:cs="Calibri"/>
-              </w:rPr>
-              <w:t>_id</w:t>
+            <w:r>
+              <w:rPr>
+                <w:rFonts w:ascii="Calibri" w:hAnsi="Calibri" w:cs="Calibri"/>
+              </w:rPr>
+              <w:t>vol_id</w:t>
             </w:r>
             <w:proofErr w:type="spellEnd"/>
           </w:p>
@@ -7069,19 +6909,11 @@
               </w:rPr>
             </w:pPr>
             <w:proofErr w:type="spellStart"/>
-            <w:proofErr w:type="gramStart"/>
-            <w:r>
-              <w:rPr>
-                <w:rFonts w:ascii="Calibri" w:hAnsi="Calibri" w:cs="Calibri"/>
-              </w:rPr>
-              <w:t>vol</w:t>
-            </w:r>
-            <w:proofErr w:type="gramEnd"/>
-            <w:r>
-              <w:rPr>
-                <w:rFonts w:ascii="Calibri" w:hAnsi="Calibri" w:cs="Calibri"/>
-              </w:rPr>
-              <w:t>_date</w:t>
+            <w:r>
+              <w:rPr>
+                <w:rFonts w:ascii="Calibri" w:hAnsi="Calibri" w:cs="Calibri"/>
+              </w:rPr>
+              <w:t>vol_date</w:t>
             </w:r>
             <w:proofErr w:type="spellEnd"/>
           </w:p>
@@ -7138,19 +6970,11 @@
               </w:rPr>
             </w:pPr>
             <w:proofErr w:type="spellStart"/>
-            <w:proofErr w:type="gramStart"/>
-            <w:r>
-              <w:rPr>
-                <w:rFonts w:ascii="Calibri" w:hAnsi="Calibri" w:cs="Calibri"/>
-              </w:rPr>
-              <w:t>vol</w:t>
-            </w:r>
-            <w:proofErr w:type="gramEnd"/>
-            <w:r>
-              <w:rPr>
-                <w:rFonts w:ascii="Calibri" w:hAnsi="Calibri" w:cs="Calibri"/>
-              </w:rPr>
-              <w:t>_heure_depart</w:t>
+            <w:r>
+              <w:rPr>
+                <w:rFonts w:ascii="Calibri" w:hAnsi="Calibri" w:cs="Calibri"/>
+              </w:rPr>
+              <w:t>vol_heure_depart</w:t>
             </w:r>
             <w:proofErr w:type="spellEnd"/>
           </w:p>
@@ -7207,19 +7031,11 @@
               </w:rPr>
             </w:pPr>
             <w:proofErr w:type="spellStart"/>
-            <w:proofErr w:type="gramStart"/>
-            <w:r>
-              <w:rPr>
-                <w:rFonts w:ascii="Calibri" w:hAnsi="Calibri" w:cs="Calibri"/>
-              </w:rPr>
-              <w:t>vol</w:t>
-            </w:r>
-            <w:proofErr w:type="gramEnd"/>
-            <w:r>
-              <w:rPr>
-                <w:rFonts w:ascii="Calibri" w:hAnsi="Calibri" w:cs="Calibri"/>
-              </w:rPr>
-              <w:t>_heure_arrivee</w:t>
+            <w:r>
+              <w:rPr>
+                <w:rFonts w:ascii="Calibri" w:hAnsi="Calibri" w:cs="Calibri"/>
+              </w:rPr>
+              <w:t>vol_heure_arrivee</w:t>
             </w:r>
             <w:proofErr w:type="spellEnd"/>
           </w:p>
@@ -7353,19 +7169,11 @@
               </w:rPr>
             </w:pPr>
             <w:proofErr w:type="spellStart"/>
-            <w:proofErr w:type="gramStart"/>
-            <w:r>
-              <w:rPr>
-                <w:rFonts w:ascii="Calibri" w:hAnsi="Calibri" w:cs="Calibri"/>
-              </w:rPr>
-              <w:t>passager</w:t>
-            </w:r>
-            <w:proofErr w:type="gramEnd"/>
-            <w:r>
-              <w:rPr>
-                <w:rFonts w:ascii="Calibri" w:hAnsi="Calibri" w:cs="Calibri"/>
-              </w:rPr>
-              <w:t>_id</w:t>
+            <w:r>
+              <w:rPr>
+                <w:rFonts w:ascii="Calibri" w:hAnsi="Calibri" w:cs="Calibri"/>
+              </w:rPr>
+              <w:t>passager_id</w:t>
             </w:r>
             <w:proofErr w:type="spellEnd"/>
           </w:p>
@@ -7422,19 +7230,11 @@
               </w:rPr>
             </w:pPr>
             <w:proofErr w:type="spellStart"/>
-            <w:proofErr w:type="gramStart"/>
-            <w:r>
-              <w:rPr>
-                <w:rFonts w:ascii="Calibri" w:hAnsi="Calibri" w:cs="Calibri"/>
-              </w:rPr>
-              <w:t>passager</w:t>
-            </w:r>
-            <w:proofErr w:type="gramEnd"/>
-            <w:r>
-              <w:rPr>
-                <w:rFonts w:ascii="Calibri" w:hAnsi="Calibri" w:cs="Calibri"/>
-              </w:rPr>
-              <w:t>_numero_passeport</w:t>
+            <w:r>
+              <w:rPr>
+                <w:rFonts w:ascii="Calibri" w:hAnsi="Calibri" w:cs="Calibri"/>
+              </w:rPr>
+              <w:t>passager_numero_passeport</w:t>
             </w:r>
             <w:proofErr w:type="spellEnd"/>
           </w:p>
@@ -7491,19 +7291,11 @@
               </w:rPr>
             </w:pPr>
             <w:proofErr w:type="spellStart"/>
-            <w:proofErr w:type="gramStart"/>
-            <w:r>
-              <w:rPr>
-                <w:rFonts w:ascii="Calibri" w:hAnsi="Calibri" w:cs="Calibri"/>
-              </w:rPr>
-              <w:t>passager</w:t>
-            </w:r>
-            <w:proofErr w:type="gramEnd"/>
-            <w:r>
-              <w:rPr>
-                <w:rFonts w:ascii="Calibri" w:hAnsi="Calibri" w:cs="Calibri"/>
-              </w:rPr>
-              <w:t>_nom</w:t>
+            <w:r>
+              <w:rPr>
+                <w:rFonts w:ascii="Calibri" w:hAnsi="Calibri" w:cs="Calibri"/>
+              </w:rPr>
+              <w:t>passager_nom</w:t>
             </w:r>
             <w:proofErr w:type="spellEnd"/>
           </w:p>
@@ -7560,19 +7352,11 @@
               </w:rPr>
             </w:pPr>
             <w:proofErr w:type="spellStart"/>
-            <w:proofErr w:type="gramStart"/>
-            <w:r>
-              <w:rPr>
-                <w:rFonts w:ascii="Calibri" w:hAnsi="Calibri" w:cs="Calibri"/>
-              </w:rPr>
-              <w:t>passager</w:t>
-            </w:r>
-            <w:proofErr w:type="gramEnd"/>
-            <w:r>
-              <w:rPr>
-                <w:rFonts w:ascii="Calibri" w:hAnsi="Calibri" w:cs="Calibri"/>
-              </w:rPr>
-              <w:t>_prenom</w:t>
+            <w:r>
+              <w:rPr>
+                <w:rFonts w:ascii="Calibri" w:hAnsi="Calibri" w:cs="Calibri"/>
+              </w:rPr>
+              <w:t>passager_prenom</w:t>
             </w:r>
             <w:proofErr w:type="spellEnd"/>
           </w:p>
@@ -7706,19 +7490,11 @@
               </w:rPr>
             </w:pPr>
             <w:proofErr w:type="spellStart"/>
-            <w:proofErr w:type="gramStart"/>
-            <w:r>
-              <w:rPr>
-                <w:rFonts w:ascii="Calibri" w:hAnsi="Calibri" w:cs="Calibri"/>
-              </w:rPr>
-              <w:t>reservation</w:t>
-            </w:r>
-            <w:proofErr w:type="gramEnd"/>
-            <w:r>
-              <w:rPr>
-                <w:rFonts w:ascii="Calibri" w:hAnsi="Calibri" w:cs="Calibri"/>
-              </w:rPr>
-              <w:t>_id</w:t>
+            <w:r>
+              <w:rPr>
+                <w:rFonts w:ascii="Calibri" w:hAnsi="Calibri" w:cs="Calibri"/>
+              </w:rPr>
+              <w:t>reservation_id</w:t>
             </w:r>
             <w:proofErr w:type="spellEnd"/>
           </w:p>
@@ -7775,19 +7551,11 @@
               </w:rPr>
             </w:pPr>
             <w:proofErr w:type="spellStart"/>
-            <w:proofErr w:type="gramStart"/>
-            <w:r>
-              <w:rPr>
-                <w:rFonts w:ascii="Calibri" w:hAnsi="Calibri" w:cs="Calibri"/>
-              </w:rPr>
-              <w:t>reservation</w:t>
-            </w:r>
-            <w:proofErr w:type="gramEnd"/>
-            <w:r>
-              <w:rPr>
-                <w:rFonts w:ascii="Calibri" w:hAnsi="Calibri" w:cs="Calibri"/>
-              </w:rPr>
-              <w:t>_siege</w:t>
+            <w:r>
+              <w:rPr>
+                <w:rFonts w:ascii="Calibri" w:hAnsi="Calibri" w:cs="Calibri"/>
+              </w:rPr>
+              <w:t>reservation_siege</w:t>
             </w:r>
             <w:proofErr w:type="spellEnd"/>
           </w:p>
@@ -7844,19 +7612,11 @@
               </w:rPr>
             </w:pPr>
             <w:proofErr w:type="spellStart"/>
-            <w:proofErr w:type="gramStart"/>
-            <w:r>
-              <w:rPr>
-                <w:rFonts w:ascii="Calibri" w:hAnsi="Calibri" w:cs="Calibri"/>
-              </w:rPr>
-              <w:t>reservation</w:t>
-            </w:r>
-            <w:proofErr w:type="gramEnd"/>
-            <w:r>
-              <w:rPr>
-                <w:rFonts w:ascii="Calibri" w:hAnsi="Calibri" w:cs="Calibri"/>
-              </w:rPr>
-              <w:t>_prix</w:t>
+            <w:r>
+              <w:rPr>
+                <w:rFonts w:ascii="Calibri" w:hAnsi="Calibri" w:cs="Calibri"/>
+              </w:rPr>
+              <w:t>reservation_prix</w:t>
             </w:r>
             <w:proofErr w:type="spellEnd"/>
           </w:p>
@@ -11509,25 +11269,7 @@
                 <w:color w:val="25364B"/>
                 <w:sz w:val="18"/>
               </w:rPr>
-              <w:t>(</w:t>
-            </w:r>
-            <w:proofErr w:type="gramStart"/>
-            <w:r>
-              <w:rPr>
-                <w:rFonts w:ascii="DejaVu Sans Mono" w:hAnsi="DejaVu Sans Mono"/>
-                <w:color w:val="25364B"/>
-                <w:sz w:val="18"/>
-              </w:rPr>
-              <w:t>aeroport</w:t>
-            </w:r>
-            <w:proofErr w:type="gramEnd"/>
-            <w:r>
-              <w:rPr>
-                <w:rFonts w:ascii="DejaVu Sans Mono" w:hAnsi="DejaVu Sans Mono"/>
-                <w:color w:val="25364B"/>
-                <w:sz w:val="18"/>
-              </w:rPr>
-              <w:t xml:space="preserve">_id, </w:t>
+              <w:t xml:space="preserve">(aeroport_id, </w:t>
             </w:r>
             <w:r>
               <w:rPr>
@@ -11698,25 +11440,7 @@
                 <w:color w:val="25364B"/>
                 <w:sz w:val="18"/>
               </w:rPr>
-              <w:t xml:space="preserve">    </w:t>
-            </w:r>
-            <w:proofErr w:type="gramStart"/>
-            <w:r>
-              <w:rPr>
-                <w:rFonts w:ascii="DejaVu Sans Mono" w:hAnsi="DejaVu Sans Mono"/>
-                <w:color w:val="25364B"/>
-                <w:sz w:val="18"/>
-              </w:rPr>
-              <w:t>code</w:t>
-            </w:r>
-            <w:proofErr w:type="gramEnd"/>
-            <w:r>
-              <w:rPr>
-                <w:rFonts w:ascii="DejaVu Sans Mono" w:hAnsi="DejaVu Sans Mono"/>
-                <w:color w:val="25364B"/>
-                <w:sz w:val="18"/>
-              </w:rPr>
-              <w:t xml:space="preserve">_iata = </w:t>
+              <w:t xml:space="preserve">    code_iata = </w:t>
             </w:r>
             <w:r>
               <w:rPr>
@@ -11834,25 +11558,7 @@
                 <w:color w:val="25364B"/>
                 <w:sz w:val="18"/>
               </w:rPr>
-              <w:t xml:space="preserve">    </w:t>
-            </w:r>
-            <w:proofErr w:type="gramStart"/>
-            <w:r>
-              <w:rPr>
-                <w:rFonts w:ascii="DejaVu Sans Mono" w:hAnsi="DejaVu Sans Mono"/>
-                <w:color w:val="25364B"/>
-                <w:sz w:val="18"/>
-              </w:rPr>
-              <w:t>code</w:t>
-            </w:r>
-            <w:proofErr w:type="gramEnd"/>
-            <w:r>
-              <w:rPr>
-                <w:rFonts w:ascii="DejaVu Sans Mono" w:hAnsi="DejaVu Sans Mono"/>
-                <w:color w:val="25364B"/>
-                <w:sz w:val="18"/>
-              </w:rPr>
-              <w:t xml:space="preserve">_icao = </w:t>
+              <w:t xml:space="preserve">    code_icao = </w:t>
             </w:r>
             <w:r>
               <w:rPr>
@@ -21631,7 +21337,6 @@
               <w:t xml:space="preserve">, </w:t>
             </w:r>
             <w:proofErr w:type="spellStart"/>
-            <w:proofErr w:type="gramStart"/>
             <w:r>
               <w:rPr>
                 <w:lang w:val="en-US"/>
@@ -21639,7 +21344,6 @@
               <w:t>P.prenom</w:t>
             </w:r>
             <w:proofErr w:type="spellEnd"/>
-            <w:proofErr w:type="gramEnd"/>
             <w:r>
               <w:rPr>
                 <w:lang w:val="en-US"/>
@@ -21647,19 +21351,11 @@
               <w:t xml:space="preserve">, </w:t>
             </w:r>
             <w:proofErr w:type="spellStart"/>
-            <w:proofErr w:type="gramStart"/>
             <w:r>
               <w:rPr>
                 <w:lang w:val="en-US"/>
               </w:rPr>
-              <w:t>P.numero</w:t>
-            </w:r>
-            <w:proofErr w:type="gramEnd"/>
-            <w:r>
-              <w:rPr>
-                <w:lang w:val="en-US"/>
-              </w:rPr>
-              <w:t>_passeport</w:t>
+              <w:t>P.numero_passeport</w:t>
             </w:r>
             <w:proofErr w:type="spellEnd"/>
             <w:r>
@@ -21845,41 +21541,25 @@
               <w:t xml:space="preserve">JOIN t_reservation AS R ON </w:t>
             </w:r>
             <w:proofErr w:type="spellStart"/>
-            <w:proofErr w:type="gramStart"/>
             <w:r>
               <w:rPr>
                 <w:lang w:val="en-US"/>
               </w:rPr>
-              <w:t>R.passager</w:t>
-            </w:r>
-            <w:proofErr w:type="gramEnd"/>
+              <w:t>R.passager_fk</w:t>
+            </w:r>
+            <w:proofErr w:type="spellEnd"/>
             <w:r>
               <w:rPr>
                 <w:lang w:val="en-US"/>
               </w:rPr>
-              <w:t>_fk</w:t>
-            </w:r>
-            <w:proofErr w:type="spellEnd"/>
+              <w:t xml:space="preserve"> = </w:t>
+            </w:r>
+            <w:proofErr w:type="spellStart"/>
             <w:r>
               <w:rPr>
                 <w:lang w:val="en-US"/>
               </w:rPr>
-              <w:t xml:space="preserve"> = </w:t>
-            </w:r>
-            <w:proofErr w:type="spellStart"/>
-            <w:proofErr w:type="gramStart"/>
-            <w:r>
-              <w:rPr>
-                <w:lang w:val="en-US"/>
-              </w:rPr>
-              <w:t>P.passager</w:t>
-            </w:r>
-            <w:proofErr w:type="gramEnd"/>
-            <w:r>
-              <w:rPr>
-                <w:lang w:val="en-US"/>
-              </w:rPr>
-              <w:t>_id</w:t>
+              <w:t>P.passager_id</w:t>
             </w:r>
             <w:proofErr w:type="spellEnd"/>
           </w:p>
@@ -22064,41 +21744,25 @@
               <w:t xml:space="preserve"> AS A ON </w:t>
             </w:r>
             <w:proofErr w:type="spellStart"/>
-            <w:proofErr w:type="gramStart"/>
             <w:r>
               <w:rPr>
                 <w:lang w:val="en-US"/>
               </w:rPr>
-              <w:t>A.aeroport</w:t>
-            </w:r>
-            <w:proofErr w:type="gramEnd"/>
+              <w:t>A.aeroport_id</w:t>
+            </w:r>
+            <w:proofErr w:type="spellEnd"/>
             <w:r>
               <w:rPr>
                 <w:lang w:val="en-US"/>
               </w:rPr>
-              <w:t>_id</w:t>
-            </w:r>
-            <w:proofErr w:type="spellEnd"/>
+              <w:t xml:space="preserve"> = </w:t>
+            </w:r>
+            <w:proofErr w:type="spellStart"/>
             <w:r>
               <w:rPr>
                 <w:lang w:val="en-US"/>
               </w:rPr>
-              <w:t xml:space="preserve"> = </w:t>
-            </w:r>
-            <w:proofErr w:type="spellStart"/>
-            <w:proofErr w:type="gramStart"/>
-            <w:r>
-              <w:rPr>
-                <w:lang w:val="en-US"/>
-              </w:rPr>
-              <w:t>V.aeroport</w:t>
-            </w:r>
-            <w:proofErr w:type="gramEnd"/>
-            <w:r>
-              <w:rPr>
-                <w:lang w:val="en-US"/>
-              </w:rPr>
-              <w:t>_depart_fk</w:t>
+              <w:t>V.aeroport_depart_fk</w:t>
             </w:r>
             <w:proofErr w:type="spellEnd"/>
             <w:r>
@@ -22525,19 +22189,11 @@
                 <w:lang w:val="en-US"/>
               </w:rPr>
             </w:pPr>
-            <w:proofErr w:type="gramStart"/>
             <w:r>
               <w:rPr>
                 <w:lang w:val="en-US"/>
               </w:rPr>
-              <w:t>FROM t</w:t>
-            </w:r>
-            <w:proofErr w:type="gramEnd"/>
-            <w:r>
-              <w:rPr>
-                <w:lang w:val="en-US"/>
-              </w:rPr>
-              <w:t>_reservation</w:t>
+              <w:t>FROM t_reservation</w:t>
             </w:r>
           </w:p>
         </w:tc>
@@ -23322,23 +22978,9 @@
     </w:p>
     <w:p>
       <w:pPr>
-        <w:pStyle w:val="Titre1"/>
-        <w:rPr>
-          <w:rFonts w:ascii="Calibri" w:hAnsi="Calibri" w:cs="Calibri"/>
-          <w:b/>
-          <w:bCs/>
-        </w:rPr>
-      </w:pPr>
-      <w:bookmarkStart w:id="22" w:name="_Toc244075399"/>
-      <w:r>
-        <w:rPr>
-          <w:rFonts w:ascii="Calibri" w:hAnsi="Calibri" w:cs="Calibri"/>
-          <w:b/>
-          <w:bCs/>
-        </w:rPr>
-        <w:t>7. Annexes</w:t>
-      </w:r>
-      <w:bookmarkEnd w:id="22"/>
+        <w:pStyle w:val="Paragraphedeliste"/>
+        <w:jc w:val="both"/>
+      </w:pPr>
     </w:p>
     <w:p>
       <w:pPr>
@@ -23347,19 +22989,55 @@
           <w:ilvl w:val="0"/>
           <w:numId w:val="33"/>
         </w:numPr>
-      </w:pPr>
-      <w:r>
+        <w:jc w:val="both"/>
         <w:rPr>
           <w:rFonts w:ascii="Calibri" w:hAnsi="Calibri" w:cs="Calibri"/>
           <w:b/>
           <w:bCs/>
         </w:rPr>
-        <w:t>Cahier des charges</w:t>
+      </w:pPr>
+      <w:r>
+        <w:rPr>
+          <w:rFonts w:ascii="Calibri" w:hAnsi="Calibri" w:cs="Calibri"/>
+          <w:b/>
+          <w:bCs/>
+        </w:rPr>
+        <w:t>Document</w:t>
+      </w:r>
+      <w:r>
+        <w:rPr>
+          <w:rFonts w:ascii="Calibri" w:hAnsi="Calibri" w:cs="Calibri"/>
+          <w:b/>
+          <w:bCs/>
+        </w:rPr>
+        <w:t>ation LOAD DATA Statement</w:t>
       </w:r>
     </w:p>
     <w:p>
       <w:pPr>
         <w:pStyle w:val="Paragraphedeliste"/>
+        <w:jc w:val="both"/>
+        <w:rPr>
+          <w:rFonts w:ascii="Calibri" w:hAnsi="Calibri" w:cs="Calibri"/>
+        </w:rPr>
+      </w:pPr>
+      <w:r>
+        <w:rPr>
+          <w:rFonts w:ascii="Calibri" w:hAnsi="Calibri" w:cs="Calibri"/>
+        </w:rPr>
+        <w:t>Dans ce</w:t>
+      </w:r>
+      <w:r>
+        <w:rPr>
+          <w:rFonts w:ascii="Calibri" w:hAnsi="Calibri" w:cs="Calibri"/>
+        </w:rPr>
+        <w:t>tte documentation, j’ai pu analyser et comprendre les différents codes possibles ainsi que la structure d’un LOAD DATA.</w:t>
+      </w:r>
+    </w:p>
+    <w:p>
+      <w:pPr>
+        <w:pStyle w:val="Paragraphedeliste"/>
+        <w:jc w:val="both"/>
       </w:pPr>
       <w:r>
         <w:rPr>
@@ -23371,6 +23049,175 @@
         <w:t xml:space="preserve"> </w:t>
       </w:r>
       <w:hyperlink r:id="rId34" w:history="1">
+        <w:r>
+          <w:rPr>
+            <w:rStyle w:val="Lienhypertexte"/>
+          </w:rPr>
+          <w:t>https://dev.mysql.com/doc/refman/8.0/en/load-data.html</w:t>
+        </w:r>
+      </w:hyperlink>
+      <w:r>
+        <w:t xml:space="preserve"> </w:t>
+      </w:r>
+    </w:p>
+    <w:p>
+      <w:pPr>
+        <w:pStyle w:val="Paragraphedeliste"/>
+        <w:jc w:val="both"/>
+      </w:pPr>
+    </w:p>
+    <w:p>
+      <w:pPr>
+        <w:pStyle w:val="Paragraphedeliste"/>
+        <w:numPr>
+          <w:ilvl w:val="0"/>
+          <w:numId w:val="33"/>
+        </w:numPr>
+        <w:jc w:val="both"/>
+        <w:rPr>
+          <w:rFonts w:ascii="Calibri" w:hAnsi="Calibri" w:cs="Calibri"/>
+          <w:b/>
+          <w:bCs/>
+        </w:rPr>
+      </w:pPr>
+      <w:r>
+        <w:rPr>
+          <w:rFonts w:ascii="Calibri" w:hAnsi="Calibri" w:cs="Calibri"/>
+          <w:b/>
+          <w:bCs/>
+        </w:rPr>
+        <w:t>Document</w:t>
+      </w:r>
+      <w:r>
+        <w:rPr>
+          <w:rFonts w:ascii="Calibri" w:hAnsi="Calibri" w:cs="Calibri"/>
+          <w:b/>
+          <w:bCs/>
+        </w:rPr>
+        <w:t xml:space="preserve">ation </w:t>
+      </w:r>
+      <w:r>
+        <w:rPr>
+          <w:rFonts w:ascii="Calibri" w:hAnsi="Calibri" w:cs="Calibri"/>
+          <w:b/>
+          <w:bCs/>
+        </w:rPr>
+        <w:t>Flow Control Functions</w:t>
+      </w:r>
+    </w:p>
+    <w:p>
+      <w:pPr>
+        <w:pStyle w:val="Paragraphedeliste"/>
+        <w:jc w:val="both"/>
+        <w:rPr>
+          <w:rFonts w:ascii="Calibri" w:hAnsi="Calibri" w:cs="Calibri"/>
+        </w:rPr>
+      </w:pPr>
+      <w:r>
+        <w:rPr>
+          <w:rFonts w:ascii="Calibri" w:hAnsi="Calibri" w:cs="Calibri"/>
+        </w:rPr>
+        <w:t>Dans ce</w:t>
+      </w:r>
+      <w:r>
+        <w:rPr>
+          <w:rFonts w:ascii="Calibri" w:hAnsi="Calibri" w:cs="Calibri"/>
+        </w:rPr>
+        <w:t xml:space="preserve">tte documentation, j’ai pu </w:t>
+      </w:r>
+      <w:r>
+        <w:rPr>
+          <w:rFonts w:ascii="Calibri" w:hAnsi="Calibri" w:cs="Calibri"/>
+        </w:rPr>
+        <w:t xml:space="preserve">comprendre comment convertir un texte « NULL » en valeur SQL </w:t>
+      </w:r>
+      <w:r>
+        <w:rPr>
+          <w:rFonts w:ascii="Calibri" w:hAnsi="Calibri" w:cs="Calibri"/>
+        </w:rPr>
+        <w:t>'NULL'</w:t>
+      </w:r>
+      <w:r>
+        <w:rPr>
+          <w:rFonts w:ascii="Calibri" w:hAnsi="Calibri" w:cs="Calibri"/>
+        </w:rPr>
+        <w:t>.</w:t>
+      </w:r>
+    </w:p>
+    <w:p>
+      <w:pPr>
+        <w:pStyle w:val="Paragraphedeliste"/>
+      </w:pPr>
+      <w:r>
+        <w:rPr>
+          <w:rFonts w:ascii="Calibri" w:hAnsi="Calibri" w:cs="Calibri"/>
+        </w:rPr>
+        <w:t>Source :</w:t>
+      </w:r>
+      <w:r>
+        <w:t xml:space="preserve"> </w:t>
+      </w:r>
+      <w:hyperlink r:id="rId35" w:history="1">
+        <w:r>
+          <w:rPr>
+            <w:rStyle w:val="Lienhypertexte"/>
+          </w:rPr>
+          <w:t>https://dev.mysql.com/doc/refman/8.0/en/flow-control-functions.html#function_nullif</w:t>
+        </w:r>
+      </w:hyperlink>
+    </w:p>
+    <w:p>
+      <w:pPr>
+        <w:pStyle w:val="Titre1"/>
+        <w:rPr>
+          <w:rFonts w:ascii="Calibri" w:hAnsi="Calibri" w:cs="Calibri"/>
+          <w:b/>
+          <w:bCs/>
+        </w:rPr>
+      </w:pPr>
+      <w:bookmarkStart w:id="22" w:name="_Toc244075399"/>
+      <w:r>
+        <w:rPr>
+          <w:rFonts w:ascii="Calibri" w:hAnsi="Calibri" w:cs="Calibri"/>
+          <w:b/>
+          <w:bCs/>
+        </w:rPr>
+        <w:lastRenderedPageBreak/>
+        <w:t>7. Annexes</w:t>
+      </w:r>
+      <w:bookmarkEnd w:id="22"/>
+    </w:p>
+    <w:p>
+      <w:pPr>
+        <w:pStyle w:val="Paragraphedeliste"/>
+        <w:numPr>
+          <w:ilvl w:val="0"/>
+          <w:numId w:val="33"/>
+        </w:numPr>
+      </w:pPr>
+      <w:r>
+        <w:rPr>
+          <w:rFonts w:ascii="Calibri" w:hAnsi="Calibri" w:cs="Calibri"/>
+          <w:b/>
+          <w:bCs/>
+        </w:rPr>
+        <w:t>Cahier des charges</w:t>
+      </w:r>
+    </w:p>
+    <w:p>
+      <w:pPr>
+        <w:pStyle w:val="Paragraphedeliste"/>
+      </w:pPr>
+      <w:r>
+        <w:rPr>
+          <w:rFonts w:ascii="Calibri" w:hAnsi="Calibri" w:cs="Calibri"/>
+        </w:rPr>
+        <w:t>Source :</w:t>
+      </w:r>
+      <w:r>
+        <w:t xml:space="preserve"> </w:t>
+      </w:r>
+      <w:hyperlink r:id="rId36" w:history="1">
         <w:r>
           <w:rPr>
             <w:rStyle w:val="Lienhypertexte"/>
@@ -23422,7 +23269,7 @@
         </w:rPr>
         <w:t xml:space="preserve"> </w:t>
       </w:r>
-      <w:hyperlink r:id="rId35" w:history="1">
+      <w:hyperlink r:id="rId37" w:history="1">
         <w:r>
           <w:rPr>
             <w:rStyle w:val="Lienhypertexte"/>
@@ -23472,7 +23319,7 @@
       <w:r>
         <w:t xml:space="preserve"> </w:t>
       </w:r>
-      <w:hyperlink r:id="rId36" w:history="1">
+      <w:hyperlink r:id="rId38" w:history="1">
         <w:r>
           <w:rPr>
             <w:rStyle w:val="Lienhypertexte"/>
@@ -23521,7 +23368,7 @@
       <w:r>
         <w:t xml:space="preserve"> </w:t>
       </w:r>
-      <w:hyperlink r:id="rId37" w:history="1">
+      <w:hyperlink r:id="rId39" w:history="1">
         <w:r>
           <w:rPr>
             <w:rStyle w:val="Lienhypertexte"/>
@@ -23531,7 +23378,7 @@
       </w:hyperlink>
     </w:p>
     <w:sectPr>
-      <w:footerReference w:type="first" r:id="rId38"/>
+      <w:footerReference w:type="first" r:id="rId40"/>
       <w:type w:val="continuous"/>
       <w:pgSz w:w="11906" w:h="16838"/>
       <w:pgMar w:top="1417" w:right="1417" w:bottom="1417" w:left="1417" w:header="708" w:footer="708" w:gutter="0"/>

</xml_diff>

<commit_message>
doc(rapport): Ajout de la description d'un LOAD DATA
</commit_message>
<xml_diff>
--- a/DOC/annexes/AugustoRomain-P_DB_GestionAeroport-Rapport.docx
+++ b/DOC/annexes/AugustoRomain-P_DB_GestionAeroport-Rapport.docx
@@ -5579,7 +5579,6 @@
                 <w:rFonts w:ascii="Calibri" w:hAnsi="Calibri" w:cs="Calibri"/>
               </w:rPr>
             </w:pPr>
-            <w:proofErr w:type="spellStart"/>
             <w:proofErr w:type="gramStart"/>
             <w:r>
               <w:rPr>
@@ -5594,7 +5593,6 @@
               </w:rPr>
               <w:t>_id</w:t>
             </w:r>
-            <w:proofErr w:type="spellEnd"/>
           </w:p>
         </w:tc>
         <w:tc>
@@ -9774,21 +9772,7 @@
         <w:rPr>
           <w:rFonts w:ascii="Calibri" w:hAnsi="Calibri" w:cs="Calibri"/>
         </w:rPr>
-        <w:t xml:space="preserve"> une base de données se nommant « </w:t>
-      </w:r>
-      <w:proofErr w:type="spellStart"/>
-      <w:r>
-        <w:rPr>
-          <w:rFonts w:ascii="Calibri" w:hAnsi="Calibri" w:cs="Calibri"/>
-        </w:rPr>
-        <w:t>db_aeroport</w:t>
-      </w:r>
-      <w:proofErr w:type="spellEnd"/>
-      <w:r>
-        <w:rPr>
-          <w:rFonts w:ascii="Calibri" w:hAnsi="Calibri" w:cs="Calibri"/>
-        </w:rPr>
-        <w:t xml:space="preserve"> », puis j’y est inséré le code </w:t>
+        <w:t xml:space="preserve"> une base de données se nommant « db_aeroport », puis j’y est inséré le code </w:t>
       </w:r>
       <w:r>
         <w:rPr>
@@ -11962,25 +11946,7 @@
                 <w:color w:val="25364B"/>
                 <w:sz w:val="20"/>
               </w:rPr>
-              <w:t xml:space="preserve">PhpMyAdmin   /   </w:t>
-            </w:r>
-            <w:proofErr w:type="spellStart"/>
-            <w:r>
-              <w:rPr>
-                <w:rFonts w:ascii="Calibri" w:hAnsi="Calibri"/>
-                <w:color w:val="25364B"/>
-                <w:sz w:val="20"/>
-              </w:rPr>
-              <w:t>db_aeroport</w:t>
-            </w:r>
-            <w:proofErr w:type="spellEnd"/>
-            <w:r>
-              <w:rPr>
-                <w:rFonts w:ascii="Calibri" w:hAnsi="Calibri"/>
-                <w:color w:val="25364B"/>
-                <w:sz w:val="20"/>
-              </w:rPr>
-              <w:t xml:space="preserve">   /   t_aeroport</w:t>
+              <w:t>PhpMyAdmin   /   db_aeroport   /   t_aeroport</w:t>
             </w:r>
           </w:p>
         </w:tc>
@@ -12093,6 +12059,51 @@
         <w:t>02 Compagnie</w:t>
       </w:r>
     </w:p>
+    <w:p>
+      <w:pPr>
+        <w:ind w:left="142"/>
+        <w:rPr>
+          <w:rFonts w:ascii="Calibri" w:hAnsi="Calibri"/>
+          <w:b/>
+          <w:color w:val="000000"/>
+        </w:rPr>
+      </w:pPr>
+      <w:r>
+        <w:rPr>
+          <w:rFonts w:ascii="Calibri" w:hAnsi="Calibri"/>
+          <w:b/>
+          <w:color w:val="000000"/>
+        </w:rPr>
+        <w:t>Déroulement de l’insertion</w:t>
+      </w:r>
+    </w:p>
+    <w:p>
+      <w:pPr>
+        <w:ind w:left="142"/>
+        <w:rPr>
+          <w:rFonts w:ascii="Calibri" w:hAnsi="Calibri" w:cs="Calibri"/>
+        </w:rPr>
+      </w:pPr>
+      <w:r>
+        <w:rPr>
+          <w:rFonts w:ascii="Calibri" w:hAnsi="Calibri" w:cs="Calibri"/>
+        </w:rPr>
+        <w:t xml:space="preserve">Sur cette insertion, j’ai eu un problème que j’ai réglé assez facilement. Le problème était que j’ai voulu faire l’insertion de « t_avion.tsv », qui a déclenché l’erreur : « </w:t>
+      </w:r>
+      <w:r>
+        <w:rPr>
+          <w:rFonts w:ascii="Calibri" w:hAnsi="Calibri" w:cs="Calibri"/>
+          <w:color w:val="EE0000"/>
+        </w:rPr>
+        <w:t xml:space="preserve">#1452 - Cannot add or update a child row: a foreign key constraint fails (db_aeroport.t_avion, CONSTRAINT t_avion_ibfk_1 FOREIGN KEY (compagnie_fk) REFERENCES t_compagnie (compagnie_id)) </w:t>
+      </w:r>
+      <w:r>
+        <w:rPr>
+          <w:rFonts w:ascii="Calibri" w:hAnsi="Calibri" w:cs="Calibri"/>
+        </w:rPr>
+        <w:t>». J’ai donc directement compris que je devais d’abord réaliser l’insertion de « t_compagnie.tsv ».</w:t>
+      </w:r>
+    </w:p>
     <w:tbl>
       <w:tblPr>
         <w:tblW w:w="8803" w:type="dxa"/>
@@ -12145,19 +12156,8 @@
                 <w:color w:val="FFFFFF"/>
                 <w:sz w:val="20"/>
               </w:rPr>
-              <w:t xml:space="preserve">SQL   /   </w:t>
-            </w:r>
-            <w:proofErr w:type="spellStart"/>
-            <w:r>
-              <w:rPr>
-                <w:rFonts w:ascii="Calibri" w:hAnsi="Calibri"/>
-                <w:b/>
-                <w:color w:val="FFFFFF"/>
-                <w:sz w:val="20"/>
-              </w:rPr>
-              <w:t>t_compagnie.tsv</w:t>
-            </w:r>
-            <w:proofErr w:type="spellEnd"/>
+              <w:t>SQL   /   t_compagnie.tsv</w:t>
+            </w:r>
           </w:p>
         </w:tc>
       </w:tr>
@@ -12276,42 +12276,24 @@
                 <w:color w:val="06734E"/>
                 <w:sz w:val="18"/>
               </w:rPr>
-              <w:t>'/var/lib/mysql-files/</w:t>
-            </w:r>
-            <w:proofErr w:type="spellStart"/>
+              <w:t>'/var/lib/mysql-files/t</w:t>
+            </w:r>
             <w:r>
               <w:rPr>
                 <w:rFonts w:ascii="DejaVu Sans Mono" w:hAnsi="DejaVu Sans Mono"/>
                 <w:color w:val="06734E"/>
                 <w:sz w:val="18"/>
-              </w:rPr>
-              <w:t>t</w:t>
+                <w:szCs w:val="18"/>
+              </w:rPr>
+              <w:t>_</w:t>
             </w:r>
             <w:r>
               <w:rPr>
                 <w:rFonts w:ascii="DejaVu Sans Mono" w:hAnsi="DejaVu Sans Mono"/>
                 <w:color w:val="06734E"/>
                 <w:sz w:val="18"/>
-                <w:szCs w:val="18"/>
-              </w:rPr>
-              <w:t>_</w:t>
-            </w:r>
-            <w:r>
-              <w:rPr>
-                <w:rFonts w:ascii="DejaVu Sans Mono" w:hAnsi="DejaVu Sans Mono"/>
-                <w:color w:val="06734E"/>
-                <w:sz w:val="18"/>
-              </w:rPr>
-              <w:t>compagnie.tsv</w:t>
-            </w:r>
-            <w:proofErr w:type="spellEnd"/>
-            <w:r>
-              <w:rPr>
-                <w:rFonts w:ascii="DejaVu Sans Mono" w:hAnsi="DejaVu Sans Mono"/>
-                <w:color w:val="06734E"/>
-                <w:sz w:val="18"/>
-              </w:rPr>
-              <w:t>'</w:t>
+              </w:rPr>
+              <w:t>compagnie.tsv'</w:t>
             </w:r>
           </w:p>
         </w:tc>
@@ -12406,18 +12388,8 @@
                 <w:color w:val="25364B"/>
                 <w:sz w:val="18"/>
               </w:rPr>
-              <w:t xml:space="preserve"> </w:t>
-            </w:r>
-            <w:proofErr w:type="spellStart"/>
-            <w:r>
-              <w:rPr>
-                <w:rFonts w:ascii="DejaVu Sans Mono" w:hAnsi="DejaVu Sans Mono"/>
-                <w:color w:val="25364B"/>
-                <w:sz w:val="18"/>
-              </w:rPr>
-              <w:t>t_compagnie</w:t>
-            </w:r>
-            <w:proofErr w:type="spellEnd"/>
+              <w:t xml:space="preserve"> t_compagnie</w:t>
+            </w:r>
           </w:p>
         </w:tc>
       </w:tr>
@@ -12860,67 +12832,6 @@
               </w:rPr>
               <w:t>LINES;</w:t>
             </w:r>
-          </w:p>
-        </w:tc>
-      </w:tr>
-      <w:tr>
-        <w:trPr>
-          <w:cantSplit/>
-          <w:jc w:val="center"/>
-        </w:trPr>
-        <w:tc>
-          <w:tcPr>
-            <w:tcW w:w="567" w:type="dxa"/>
-            <w:tcBorders>
-              <w:top w:val="single" w:sz="6" w:space="0" w:color="D9D9D9"/>
-              <w:bottom w:val="single" w:sz="6" w:space="0" w:color="D9D9D9"/>
-            </w:tcBorders>
-            <w:shd w:val="clear" w:color="auto" w:fill="E9EEF4"/>
-            <w:tcMar>
-              <w:top w:w="55" w:type="dxa"/>
-              <w:left w:w="130" w:type="dxa"/>
-              <w:bottom w:w="55" w:type="dxa"/>
-              <w:right w:w="130" w:type="dxa"/>
-            </w:tcMar>
-            <w:vAlign w:val="center"/>
-          </w:tcPr>
-          <w:p>
-            <w:pPr>
-              <w:keepNext/>
-              <w:spacing w:after="0" w:line="240" w:lineRule="auto"/>
-              <w:jc w:val="right"/>
-            </w:pPr>
-            <w:r>
-              <w:rPr>
-                <w:rFonts w:ascii="DejaVu Sans Mono" w:hAnsi="DejaVu Sans Mono"/>
-                <w:color w:val="7C899B"/>
-                <w:sz w:val="18"/>
-              </w:rPr>
-              <w:t>7</w:t>
-            </w:r>
-          </w:p>
-        </w:tc>
-        <w:tc>
-          <w:tcPr>
-            <w:tcW w:w="8236" w:type="dxa"/>
-            <w:tcBorders>
-              <w:top w:val="single" w:sz="6" w:space="0" w:color="D9D9D9"/>
-              <w:bottom w:val="single" w:sz="6" w:space="0" w:color="D9D9D9"/>
-            </w:tcBorders>
-            <w:shd w:val="clear" w:color="auto" w:fill="F5F7FA"/>
-            <w:tcMar>
-              <w:top w:w="55" w:type="dxa"/>
-              <w:left w:w="130" w:type="dxa"/>
-              <w:bottom w:w="55" w:type="dxa"/>
-              <w:right w:w="130" w:type="dxa"/>
-            </w:tcMar>
-            <w:vAlign w:val="center"/>
-          </w:tcPr>
-          <w:p>
-            <w:pPr>
-              <w:keepNext/>
-              <w:spacing w:after="0" w:line="240" w:lineRule="auto"/>
-            </w:pPr>
           </w:p>
         </w:tc>
       </w:tr>
@@ -13001,36 +12912,8 @@
                 <w:color w:val="25364B"/>
                 <w:sz w:val="20"/>
               </w:rPr>
-              <w:t xml:space="preserve">PhpMyAdmin   /   </w:t>
-            </w:r>
-            <w:proofErr w:type="spellStart"/>
-            <w:r>
-              <w:rPr>
-                <w:rFonts w:ascii="Calibri" w:hAnsi="Calibri"/>
-                <w:color w:val="25364B"/>
-                <w:sz w:val="20"/>
-              </w:rPr>
-              <w:t>db_aeroport</w:t>
-            </w:r>
-            <w:proofErr w:type="spellEnd"/>
-            <w:r>
-              <w:rPr>
-                <w:rFonts w:ascii="Calibri" w:hAnsi="Calibri"/>
-                <w:color w:val="25364B"/>
-                <w:sz w:val="20"/>
-              </w:rPr>
-              <w:t xml:space="preserve">   /   </w:t>
-            </w:r>
-            <w:proofErr w:type="spellStart"/>
-            <w:r>
-              <w:rPr>
-                <w:rFonts w:ascii="Calibri" w:hAnsi="Calibri"/>
-                <w:color w:val="25364B"/>
-                <w:sz w:val="20"/>
-              </w:rPr>
-              <w:t>t_compagnie</w:t>
-            </w:r>
-            <w:proofErr w:type="spellEnd"/>
+              <w:t>PhpMyAdmin   /   db_aeroport   /   t_compagnie</w:t>
+            </w:r>
           </w:p>
         </w:tc>
       </w:tr>
@@ -14118,25 +14001,7 @@
                 <w:color w:val="25364B"/>
                 <w:sz w:val="20"/>
               </w:rPr>
-              <w:t xml:space="preserve">PhpMyAdmin   /   </w:t>
-            </w:r>
-            <w:proofErr w:type="spellStart"/>
-            <w:r>
-              <w:rPr>
-                <w:rFonts w:ascii="Calibri" w:hAnsi="Calibri"/>
-                <w:color w:val="25364B"/>
-                <w:sz w:val="20"/>
-              </w:rPr>
-              <w:t>db_aeroport</w:t>
-            </w:r>
-            <w:proofErr w:type="spellEnd"/>
-            <w:r>
-              <w:rPr>
-                <w:rFonts w:ascii="Calibri" w:hAnsi="Calibri"/>
-                <w:color w:val="25364B"/>
-                <w:sz w:val="20"/>
-              </w:rPr>
-              <w:t xml:space="preserve">   /   </w:t>
+              <w:t xml:space="preserve">PhpMyAdmin   /   db_aeroport   /   </w:t>
             </w:r>
             <w:proofErr w:type="spellStart"/>
             <w:r>
@@ -14362,19 +14227,8 @@
                 <w:color w:val="FFFFFF"/>
                 <w:sz w:val="20"/>
               </w:rPr>
-              <w:t xml:space="preserve">SQL   /   </w:t>
-            </w:r>
-            <w:proofErr w:type="spellStart"/>
-            <w:r>
-              <w:rPr>
-                <w:rFonts w:ascii="Calibri" w:hAnsi="Calibri"/>
-                <w:b/>
-                <w:color w:val="FFFFFF"/>
-                <w:sz w:val="20"/>
-              </w:rPr>
-              <w:t>t_avion.tsv</w:t>
-            </w:r>
-            <w:proofErr w:type="spellEnd"/>
+              <w:t>SQL   /   t_avion.tsv</w:t>
+            </w:r>
           </w:p>
         </w:tc>
       </w:tr>
@@ -14493,25 +14347,7 @@
                 <w:color w:val="06734E"/>
                 <w:sz w:val="18"/>
               </w:rPr>
-              <w:t>'/var/lib/mysql-files/</w:t>
-            </w:r>
-            <w:proofErr w:type="spellStart"/>
-            <w:r>
-              <w:rPr>
-                <w:rFonts w:ascii="DejaVu Sans Mono" w:hAnsi="DejaVu Sans Mono"/>
-                <w:color w:val="06734E"/>
-                <w:sz w:val="18"/>
-              </w:rPr>
-              <w:t>t_avion.tsv</w:t>
-            </w:r>
-            <w:proofErr w:type="spellEnd"/>
-            <w:r>
-              <w:rPr>
-                <w:rFonts w:ascii="DejaVu Sans Mono" w:hAnsi="DejaVu Sans Mono"/>
-                <w:color w:val="06734E"/>
-                <w:sz w:val="18"/>
-              </w:rPr>
-              <w:t>'</w:t>
+              <w:t>'/var/lib/mysql-files/t_avion.tsv'</w:t>
             </w:r>
           </w:p>
         </w:tc>
@@ -15218,25 +15054,7 @@
                 <w:color w:val="25364B"/>
                 <w:sz w:val="20"/>
               </w:rPr>
-              <w:t xml:space="preserve">PhpMyAdmin   /   </w:t>
-            </w:r>
-            <w:proofErr w:type="spellStart"/>
-            <w:r>
-              <w:rPr>
-                <w:rFonts w:ascii="Calibri" w:hAnsi="Calibri"/>
-                <w:color w:val="25364B"/>
-                <w:sz w:val="20"/>
-              </w:rPr>
-              <w:t>db_aeroport</w:t>
-            </w:r>
-            <w:proofErr w:type="spellEnd"/>
-            <w:r>
-              <w:rPr>
-                <w:rFonts w:ascii="Calibri" w:hAnsi="Calibri"/>
-                <w:color w:val="25364B"/>
-                <w:sz w:val="20"/>
-              </w:rPr>
-              <w:t xml:space="preserve">   /   </w:t>
+              <w:t xml:space="preserve">PhpMyAdmin   /   db_aeroport   /   </w:t>
             </w:r>
             <w:proofErr w:type="spellStart"/>
             <w:r>
@@ -16318,25 +16136,7 @@
                 <w:color w:val="25364B"/>
                 <w:sz w:val="20"/>
               </w:rPr>
-              <w:t xml:space="preserve">PhpMyAdmin   /   </w:t>
-            </w:r>
-            <w:proofErr w:type="spellStart"/>
-            <w:r>
-              <w:rPr>
-                <w:rFonts w:ascii="Calibri" w:hAnsi="Calibri"/>
-                <w:color w:val="25364B"/>
-                <w:sz w:val="20"/>
-              </w:rPr>
-              <w:t>db_aeroport</w:t>
-            </w:r>
-            <w:proofErr w:type="spellEnd"/>
-            <w:r>
-              <w:rPr>
-                <w:rFonts w:ascii="Calibri" w:hAnsi="Calibri"/>
-                <w:color w:val="25364B"/>
-                <w:sz w:val="20"/>
-              </w:rPr>
-              <w:t xml:space="preserve">   /   </w:t>
+              <w:t xml:space="preserve">PhpMyAdmin   /   db_aeroport   /   </w:t>
             </w:r>
             <w:proofErr w:type="spellStart"/>
             <w:r>
@@ -17470,25 +17270,7 @@
                 <w:color w:val="25364B"/>
                 <w:sz w:val="20"/>
               </w:rPr>
-              <w:t xml:space="preserve">PhpMyAdmin   /   </w:t>
-            </w:r>
-            <w:proofErr w:type="spellStart"/>
-            <w:r>
-              <w:rPr>
-                <w:rFonts w:ascii="Calibri" w:hAnsi="Calibri"/>
-                <w:color w:val="25364B"/>
-                <w:sz w:val="20"/>
-              </w:rPr>
-              <w:t>db_aeroport</w:t>
-            </w:r>
-            <w:proofErr w:type="spellEnd"/>
-            <w:r>
-              <w:rPr>
-                <w:rFonts w:ascii="Calibri" w:hAnsi="Calibri"/>
-                <w:color w:val="25364B"/>
-                <w:sz w:val="20"/>
-              </w:rPr>
-              <w:t xml:space="preserve">   /   </w:t>
+              <w:t xml:space="preserve">PhpMyAdmin   /   db_aeroport   /   </w:t>
             </w:r>
             <w:proofErr w:type="spellStart"/>
             <w:r>
@@ -18567,25 +18349,7 @@
                 <w:color w:val="25364B"/>
                 <w:sz w:val="20"/>
               </w:rPr>
-              <w:t xml:space="preserve">PhpMyAdmin   /   </w:t>
-            </w:r>
-            <w:proofErr w:type="spellStart"/>
-            <w:r>
-              <w:rPr>
-                <w:rFonts w:ascii="Calibri" w:hAnsi="Calibri"/>
-                <w:color w:val="25364B"/>
-                <w:sz w:val="20"/>
-              </w:rPr>
-              <w:t>db_aeroport</w:t>
-            </w:r>
-            <w:proofErr w:type="spellEnd"/>
-            <w:r>
-              <w:rPr>
-                <w:rFonts w:ascii="Calibri" w:hAnsi="Calibri"/>
-                <w:color w:val="25364B"/>
-                <w:sz w:val="20"/>
-              </w:rPr>
-              <w:t xml:space="preserve">   /   t_vol</w:t>
+              <w:t>PhpMyAdmin   /   db_aeroport   /   t_vol</w:t>
             </w:r>
           </w:p>
         </w:tc>
@@ -19646,25 +19410,7 @@
                 <w:color w:val="25364B"/>
                 <w:sz w:val="20"/>
               </w:rPr>
-              <w:t xml:space="preserve">PhpMyAdmin   /   </w:t>
-            </w:r>
-            <w:proofErr w:type="spellStart"/>
-            <w:r>
-              <w:rPr>
-                <w:rFonts w:ascii="Calibri" w:hAnsi="Calibri"/>
-                <w:color w:val="25364B"/>
-                <w:sz w:val="20"/>
-              </w:rPr>
-              <w:t>db_aeroport</w:t>
-            </w:r>
-            <w:proofErr w:type="spellEnd"/>
-            <w:r>
-              <w:rPr>
-                <w:rFonts w:ascii="Calibri" w:hAnsi="Calibri"/>
-                <w:color w:val="25364B"/>
-                <w:sz w:val="20"/>
-              </w:rPr>
-              <w:t xml:space="preserve">   /   t_reservation</w:t>
+              <w:t>PhpMyAdmin   /   db_aeroport   /   t_reservation</w:t>
             </w:r>
           </w:p>
         </w:tc>
@@ -20122,7 +19868,6 @@
             <w:r>
               <w:t xml:space="preserve"> </w:t>
             </w:r>
-            <w:proofErr w:type="spellStart"/>
             <w:r>
               <w:rPr>
                 <w:rFonts w:ascii="DejaVu Sans Mono" w:hAnsi="DejaVu Sans Mono"/>
@@ -20130,17 +19875,7 @@
                 <w:sz w:val="18"/>
                 <w:lang w:val="en-US"/>
               </w:rPr>
-              <w:t>compagnie_fk</w:t>
-            </w:r>
-            <w:proofErr w:type="spellEnd"/>
-            <w:r>
-              <w:rPr>
-                <w:rFonts w:ascii="DejaVu Sans Mono" w:hAnsi="DejaVu Sans Mono"/>
-                <w:color w:val="25364B"/>
-                <w:sz w:val="18"/>
-                <w:lang w:val="en-US"/>
-              </w:rPr>
-              <w:t xml:space="preserve"> =</w:t>
+              <w:t>compagnie_fk =</w:t>
             </w:r>
             <w:r>
               <w:t xml:space="preserve"> </w:t>
@@ -21048,27 +20783,7 @@
                 <w:color w:val="315BC0"/>
                 <w:sz w:val="18"/>
               </w:rPr>
-              <w:t xml:space="preserve">SELECT </w:t>
-            </w:r>
-            <w:proofErr w:type="spellStart"/>
-            <w:r>
-              <w:rPr>
-                <w:rFonts w:ascii="DejaVu Sans Mono" w:hAnsi="DejaVu Sans Mono"/>
-                <w:b/>
-                <w:color w:val="315BC0"/>
-                <w:sz w:val="18"/>
-              </w:rPr>
-              <w:t>compagnie_fk</w:t>
-            </w:r>
-            <w:proofErr w:type="spellEnd"/>
-            <w:r>
-              <w:rPr>
-                <w:rFonts w:ascii="DejaVu Sans Mono" w:hAnsi="DejaVu Sans Mono"/>
-                <w:b/>
-                <w:color w:val="315BC0"/>
-                <w:sz w:val="18"/>
-              </w:rPr>
-              <w:t xml:space="preserve">, COUNT(*) AS </w:t>
+              <w:t xml:space="preserve">SELECT compagnie_fk, COUNT(*) AS </w:t>
             </w:r>
             <w:proofErr w:type="spellStart"/>
             <w:r>
@@ -21268,7 +20983,6 @@
               </w:rPr>
               <w:t xml:space="preserve"> </w:t>
             </w:r>
-            <w:proofErr w:type="spellStart"/>
             <w:r>
               <w:rPr>
                 <w:rFonts w:ascii="DejaVu Sans Mono" w:hAnsi="DejaVu Sans Mono"/>
@@ -21278,7 +20992,6 @@
               </w:rPr>
               <w:t>compagnie_fk</w:t>
             </w:r>
-            <w:proofErr w:type="spellEnd"/>
           </w:p>
         </w:tc>
       </w:tr>

</xml_diff>

<commit_message>
doc(rapport): Ajout de la consigne d'une requête
</commit_message>
<xml_diff>
--- a/DOC/annexes/AugustoRomain-P_DB_GestionAeroport-Rapport.docx
+++ b/DOC/annexes/AugustoRomain-P_DB_GestionAeroport-Rapport.docx
@@ -19376,6 +19376,20 @@
         <w:t>Requête n°1</w:t>
       </w:r>
     </w:p>
+    <w:p>
+      <w:pPr>
+        <w:ind w:left="142"/>
+        <w:rPr>
+          <w:rFonts w:ascii="Calibri" w:hAnsi="Calibri" w:cs="Calibri"/>
+        </w:rPr>
+      </w:pPr>
+      <w:r>
+        <w:rPr>
+          <w:rFonts w:ascii="Calibri" w:hAnsi="Calibri" w:cs="Calibri"/>
+        </w:rPr>
+        <w:t>Afficher les 2 premiers avions de la compagnie compagnie_id = 60, triés par capacité décroissante. Vous devez afficher toutes les colonnes.</w:t>
+      </w:r>
+    </w:p>
     <w:tbl>
       <w:tblPr>
         <w:tblW w:w="8803" w:type="dxa"/>
@@ -19944,6 +19958,16 @@
       </w:r>
     </w:p>
     <w:p>
+      <w:r>
+        <w:br w:type="page"/>
+      </w:r>
+    </w:p>
+    <w:p>
+      <w:pPr>
+        <w:ind w:left="142"/>
+      </w:pPr>
+    </w:p>
+    <w:p>
       <w:pPr>
         <w:ind w:left="142"/>
         <w:rPr>
@@ -20461,7 +20485,6 @@
           <w:color w:val="000000"/>
           <w:sz w:val="28"/>
         </w:rPr>
-        <w:lastRenderedPageBreak/>
         <w:t>Requête n°3</w:t>
       </w:r>
     </w:p>
@@ -20555,6 +20578,7 @@
                 <w:color w:val="7C899B"/>
                 <w:sz w:val="18"/>
               </w:rPr>
+              <w:lastRenderedPageBreak/>
               <w:t>1</w:t>
             </w:r>
           </w:p>
@@ -21005,7 +21029,6 @@
           <w:sz w:val="28"/>
           <w:lang w:val="en-US"/>
         </w:rPr>
-        <w:lastRenderedPageBreak/>
         <w:t>Requête n°4</w:t>
       </w:r>
     </w:p>
@@ -21061,6 +21084,7 @@
                 <w:color w:val="FFFFFF"/>
                 <w:sz w:val="20"/>
               </w:rPr>
+              <w:lastRenderedPageBreak/>
               <w:t xml:space="preserve">SQL   </w:t>
             </w:r>
           </w:p>
@@ -21834,7 +21858,6 @@
           <w:color w:val="000000"/>
           <w:sz w:val="28"/>
         </w:rPr>
-        <w:lastRenderedPageBreak/>
         <w:t>Re</w:t>
       </w:r>
       <w:r>
@@ -21899,6 +21922,7 @@
                 <w:color w:val="FFFFFF"/>
                 <w:sz w:val="20"/>
               </w:rPr>
+              <w:lastRenderedPageBreak/>
               <w:t xml:space="preserve">SQL   </w:t>
             </w:r>
           </w:p>
@@ -22305,7 +22329,6 @@
           <w:color w:val="000000"/>
           <w:sz w:val="28"/>
         </w:rPr>
-        <w:lastRenderedPageBreak/>
         <w:t>Requête n°6</w:t>
       </w:r>
     </w:p>
@@ -22361,6 +22384,7 @@
                 <w:color w:val="FFFFFF"/>
                 <w:sz w:val="20"/>
               </w:rPr>
+              <w:lastRenderedPageBreak/>
               <w:t xml:space="preserve">SQL   </w:t>
             </w:r>
           </w:p>
@@ -23043,7 +23067,6 @@
           <w:b/>
           <w:bCs/>
         </w:rPr>
-        <w:lastRenderedPageBreak/>
         <w:t>7. Annexes</w:t>
       </w:r>
       <w:bookmarkEnd w:id="22"/>

</xml_diff>

<commit_message>
doc(rapport): Ajout des consignes de cahques requêtes
</commit_message>
<xml_diff>
--- a/DOC/annexes/AugustoRomain-P_DB_GestionAeroport-Rapport.docx
+++ b/DOC/annexes/AugustoRomain-P_DB_GestionAeroport-Rapport.docx
@@ -19387,7 +19387,19 @@
         <w:rPr>
           <w:rFonts w:ascii="Calibri" w:hAnsi="Calibri" w:cs="Calibri"/>
         </w:rPr>
-        <w:t>Afficher les 2 premiers avions de la compagnie compagnie_id = 60, triés par capacité décroissante. Vous devez afficher toutes les colonnes.</w:t>
+        <w:t>Afficher</w:t>
+      </w:r>
+      <w:r>
+        <w:rPr>
+          <w:rFonts w:ascii="Calibri" w:hAnsi="Calibri" w:cs="Calibri"/>
+        </w:rPr>
+        <w:t xml:space="preserve"> </w:t>
+      </w:r>
+      <w:r>
+        <w:rPr>
+          <w:rFonts w:ascii="Calibri" w:hAnsi="Calibri" w:cs="Calibri"/>
+        </w:rPr>
+        <w:t>les 2 premiers avions de la compagnie compagnie_id = 60, triés par capacité décroissante. Vous devez afficher toutes les colonnes.</w:t>
       </w:r>
     </w:p>
     <w:tbl>
@@ -19965,11 +19977,6 @@
     <w:p>
       <w:pPr>
         <w:ind w:left="142"/>
-      </w:pPr>
-    </w:p>
-    <w:p>
-      <w:pPr>
-        <w:ind w:left="142"/>
         <w:rPr>
           <w:rFonts w:ascii="Calibri" w:hAnsi="Calibri"/>
           <w:b/>
@@ -19984,7 +19991,22 @@
           <w:color w:val="000000"/>
           <w:sz w:val="28"/>
         </w:rPr>
+        <w:lastRenderedPageBreak/>
         <w:t>Requête n°2</w:t>
+      </w:r>
+    </w:p>
+    <w:p>
+      <w:pPr>
+        <w:ind w:left="142"/>
+        <w:rPr>
+          <w:rFonts w:ascii="Calibri" w:hAnsi="Calibri" w:cs="Calibri"/>
+        </w:rPr>
+      </w:pPr>
+      <w:r>
+        <w:rPr>
+          <w:rFonts w:ascii="Calibri" w:hAnsi="Calibri" w:cs="Calibri"/>
+        </w:rPr>
+        <w:t>Afficher les 3 premiers vols les plus récents (heure de départ la plus tardive). Vous devez afficher toutes les colonnes.</w:t>
       </w:r>
     </w:p>
     <w:tbl>
@@ -20413,6 +20435,28 @@
         </w:tc>
       </w:tr>
     </w:tbl>
+    <w:p>
+      <w:pPr>
+        <w:ind w:left="142"/>
+        <w:rPr>
+          <w:rFonts w:ascii="Calibri" w:hAnsi="Calibri"/>
+          <w:b/>
+          <w:color w:val="000000"/>
+          <w:sz w:val="28"/>
+        </w:rPr>
+      </w:pPr>
+    </w:p>
+    <w:p>
+      <w:pPr>
+        <w:ind w:left="142"/>
+        <w:rPr>
+          <w:rFonts w:ascii="Calibri" w:hAnsi="Calibri"/>
+          <w:b/>
+          <w:color w:val="000000"/>
+          <w:sz w:val="28"/>
+        </w:rPr>
+      </w:pPr>
+    </w:p>
     <w:p>
       <w:pPr>
         <w:ind w:left="142"/>
@@ -20470,7 +20514,6 @@
     </w:p>
     <w:p>
       <w:pPr>
-        <w:ind w:left="142"/>
         <w:rPr>
           <w:rFonts w:ascii="Calibri" w:hAnsi="Calibri"/>
           <w:b/>
@@ -20485,7 +20528,42 @@
           <w:color w:val="000000"/>
           <w:sz w:val="28"/>
         </w:rPr>
+        <w:br w:type="page"/>
+      </w:r>
+    </w:p>
+    <w:p>
+      <w:pPr>
+        <w:ind w:left="142"/>
+        <w:rPr>
+          <w:rFonts w:ascii="Calibri" w:hAnsi="Calibri"/>
+          <w:b/>
+          <w:color w:val="000000"/>
+          <w:sz w:val="28"/>
+        </w:rPr>
+      </w:pPr>
+      <w:r>
+        <w:rPr>
+          <w:rFonts w:ascii="Calibri" w:hAnsi="Calibri"/>
+          <w:b/>
+          <w:color w:val="000000"/>
+          <w:sz w:val="28"/>
+        </w:rPr>
+        <w:lastRenderedPageBreak/>
         <w:t>Requête n°3</w:t>
+      </w:r>
+    </w:p>
+    <w:p>
+      <w:pPr>
+        <w:ind w:left="142"/>
+        <w:rPr>
+          <w:rFonts w:ascii="Calibri" w:hAnsi="Calibri" w:cs="Calibri"/>
+        </w:rPr>
+      </w:pPr>
+      <w:r>
+        <w:rPr>
+          <w:rFonts w:ascii="Calibri" w:hAnsi="Calibri" w:cs="Calibri"/>
+        </w:rPr>
+        <w:t>Afficher le nombre total de vols opérés par chaque compagnie aérienne (compagnie_fk). Le résultat doit être ordonné par le nombre de vols de manière décroissante. Aide : Vous ne devez afficher que 2 colonnes dans le SELECT.</w:t>
       </w:r>
     </w:p>
     <w:tbl>
@@ -20578,7 +20656,6 @@
                 <w:color w:val="7C899B"/>
                 <w:sz w:val="18"/>
               </w:rPr>
-              <w:lastRenderedPageBreak/>
               <w:t>1</w:t>
             </w:r>
           </w:p>
@@ -20950,9 +21027,17 @@
           <w:lang w:val="en-US"/>
         </w:rPr>
         <w:drawing>
-          <wp:inline distT="0" distB="0" distL="0" distR="0" wp14:anchorId="2EC84992" wp14:editId="4204CE0B">
-            <wp:extent cx="5760720" cy="6569710"/>
-            <wp:effectExtent l="0" t="0" r="0" b="2540"/>
+          <wp:anchor distT="0" distB="0" distL="114300" distR="114300" simplePos="0" relativeHeight="251683840" behindDoc="1" locked="0" layoutInCell="1" allowOverlap="1" wp14:anchorId="2EC84992" wp14:editId="2600CB2E">
+            <wp:simplePos x="0" y="0"/>
+            <wp:positionH relativeFrom="column">
+              <wp:posOffset>71755</wp:posOffset>
+            </wp:positionH>
+            <wp:positionV relativeFrom="paragraph">
+              <wp:posOffset>359410</wp:posOffset>
+            </wp:positionV>
+            <wp:extent cx="5760720" cy="5419725"/>
+            <wp:effectExtent l="0" t="0" r="0" b="9525"/>
+            <wp:wrapTopAndBottom/>
             <wp:docPr id="1085485325" name="Image 1"/>
             <wp:cNvGraphicFramePr>
               <a:graphicFrameLocks xmlns:a="http://schemas.openxmlformats.org/drawingml/2006/main" noChangeAspect="1"/>
@@ -20973,7 +21058,7 @@
                   <pic:spPr>
                     <a:xfrm>
                       <a:off x="0" y="0"/>
-                      <a:ext cx="5760720" cy="6569710"/>
+                      <a:ext cx="5760720" cy="5419725"/>
                     </a:xfrm>
                     <a:prstGeom prst="rect">
                       <a:avLst/>
@@ -20982,7 +21067,13 @@
                 </pic:pic>
               </a:graphicData>
             </a:graphic>
-          </wp:inline>
+            <wp14:sizeRelH relativeFrom="margin">
+              <wp14:pctWidth>0</wp14:pctWidth>
+            </wp14:sizeRelH>
+            <wp14:sizeRelV relativeFrom="margin">
+              <wp14:pctHeight>0</wp14:pctHeight>
+            </wp14:sizeRelV>
+          </wp:anchor>
         </w:drawing>
       </w:r>
     </w:p>
@@ -21000,7 +21091,6 @@
     </w:p>
     <w:p>
       <w:pPr>
-        <w:ind w:left="142"/>
         <w:rPr>
           <w:rFonts w:ascii="Calibri" w:hAnsi="Calibri"/>
           <w:b/>
@@ -21009,10 +21099,7 @@
           <w:lang w:val="en-US"/>
         </w:rPr>
       </w:pPr>
-    </w:p>
-    <w:p>
-      <w:pPr>
-        <w:ind w:left="142"/>
+      <w:r>
         <w:rPr>
           <w:rFonts w:ascii="Calibri" w:hAnsi="Calibri"/>
           <w:b/>
@@ -21020,8 +21107,12 @@
           <w:sz w:val="28"/>
           <w:lang w:val="en-US"/>
         </w:rPr>
-      </w:pPr>
-      <w:r>
+        <w:br w:type="page"/>
+      </w:r>
+    </w:p>
+    <w:p>
+      <w:pPr>
+        <w:ind w:left="142"/>
         <w:rPr>
           <w:rFonts w:ascii="Calibri" w:hAnsi="Calibri"/>
           <w:b/>
@@ -21029,8 +21120,113 @@
           <w:sz w:val="28"/>
           <w:lang w:val="en-US"/>
         </w:rPr>
-        <w:t>Requête n°4</w:t>
-      </w:r>
+      </w:pPr>
+      <w:proofErr w:type="spellStart"/>
+      <w:r>
+        <w:rPr>
+          <w:rFonts w:ascii="Calibri" w:hAnsi="Calibri"/>
+          <w:b/>
+          <w:color w:val="000000"/>
+          <w:sz w:val="28"/>
+          <w:lang w:val="en-US"/>
+        </w:rPr>
+        <w:lastRenderedPageBreak/>
+        <w:t>Requête</w:t>
+      </w:r>
+      <w:proofErr w:type="spellEnd"/>
+      <w:r>
+        <w:rPr>
+          <w:rFonts w:ascii="Calibri" w:hAnsi="Calibri"/>
+          <w:b/>
+          <w:color w:val="000000"/>
+          <w:sz w:val="28"/>
+          <w:lang w:val="en-US"/>
+        </w:rPr>
+        <w:t xml:space="preserve"> n°4</w:t>
+      </w:r>
+    </w:p>
+    <w:p>
+      <w:pPr>
+        <w:ind w:left="142"/>
+        <w:rPr>
+          <w:rFonts w:ascii="Calibri" w:hAnsi="Calibri" w:cs="Calibri"/>
+        </w:rPr>
+      </w:pPr>
+      <w:r>
+        <w:rPr>
+          <w:rFonts w:ascii="Calibri" w:hAnsi="Calibri" w:cs="Calibri"/>
+        </w:rPr>
+        <w:t xml:space="preserve">Afficher la liste des passagers, leur numéro de passeport, ainsi que l'aéroport de départ du vol réservé. </w:t>
+      </w:r>
+    </w:p>
+    <w:p>
+      <w:pPr>
+        <w:spacing w:after="0"/>
+        <w:ind w:left="142"/>
+        <w:rPr>
+          <w:rFonts w:ascii="Calibri" w:hAnsi="Calibri" w:cs="Calibri"/>
+        </w:rPr>
+      </w:pPr>
+      <w:r>
+        <w:rPr>
+          <w:rFonts w:ascii="Calibri" w:hAnsi="Calibri" w:cs="Calibri"/>
+        </w:rPr>
+        <w:t xml:space="preserve">1ère colonne : nom du passager </w:t>
+      </w:r>
+    </w:p>
+    <w:p>
+      <w:pPr>
+        <w:spacing w:after="0"/>
+        <w:ind w:left="142"/>
+        <w:rPr>
+          <w:rFonts w:ascii="Calibri" w:hAnsi="Calibri" w:cs="Calibri"/>
+        </w:rPr>
+      </w:pPr>
+      <w:r>
+        <w:rPr>
+          <w:rFonts w:ascii="Calibri" w:hAnsi="Calibri" w:cs="Calibri"/>
+        </w:rPr>
+        <w:t xml:space="preserve">2ème colonne : prénom du passager </w:t>
+      </w:r>
+    </w:p>
+    <w:p>
+      <w:pPr>
+        <w:spacing w:after="0"/>
+        <w:ind w:left="142"/>
+        <w:rPr>
+          <w:rFonts w:ascii="Calibri" w:hAnsi="Calibri" w:cs="Calibri"/>
+        </w:rPr>
+      </w:pPr>
+      <w:r>
+        <w:rPr>
+          <w:rFonts w:ascii="Calibri" w:hAnsi="Calibri" w:cs="Calibri"/>
+        </w:rPr>
+        <w:t xml:space="preserve">3ème colonne : numéro de passeport du passager </w:t>
+      </w:r>
+    </w:p>
+    <w:p>
+      <w:pPr>
+        <w:spacing w:after="0"/>
+        <w:ind w:left="142"/>
+        <w:rPr>
+          <w:rFonts w:ascii="Calibri" w:hAnsi="Calibri" w:cs="Calibri"/>
+        </w:rPr>
+      </w:pPr>
+      <w:r>
+        <w:rPr>
+          <w:rFonts w:ascii="Calibri" w:hAnsi="Calibri" w:cs="Calibri"/>
+        </w:rPr>
+        <w:t>4ème colonne : nom de l’aéroport de départ</w:t>
+      </w:r>
+    </w:p>
+    <w:p>
+      <w:pPr>
+        <w:spacing w:after="0"/>
+        <w:ind w:left="142"/>
+        <w:rPr>
+          <w:rFonts w:ascii="Calibri" w:hAnsi="Calibri" w:cs="Calibri"/>
+        </w:rPr>
+      </w:pPr>
     </w:p>
     <w:tbl>
       <w:tblPr>
@@ -21084,7 +21280,6 @@
                 <w:color w:val="FFFFFF"/>
                 <w:sz w:val="20"/>
               </w:rPr>
-              <w:lastRenderedPageBreak/>
               <w:t xml:space="preserve">SQL   </w:t>
             </w:r>
           </w:p>
@@ -21663,6 +21858,30 @@
           <w:lang w:val="en-US"/>
         </w:rPr>
       </w:pPr>
+    </w:p>
+    <w:p>
+      <w:pPr>
+        <w:ind w:left="142"/>
+        <w:rPr>
+          <w:rFonts w:ascii="Calibri" w:hAnsi="Calibri"/>
+          <w:b/>
+          <w:color w:val="000000"/>
+          <w:sz w:val="28"/>
+          <w:lang w:val="en-US"/>
+        </w:rPr>
+      </w:pPr>
+    </w:p>
+    <w:p>
+      <w:pPr>
+        <w:ind w:left="142"/>
+        <w:rPr>
+          <w:rFonts w:ascii="Calibri" w:hAnsi="Calibri"/>
+          <w:b/>
+          <w:color w:val="000000"/>
+          <w:sz w:val="28"/>
+          <w:lang w:val="en-US"/>
+        </w:rPr>
+      </w:pPr>
       <w:r>
         <w:rPr>
           <w:rFonts w:ascii="Calibri" w:hAnsi="Calibri"/>
@@ -21673,8 +21892,8 @@
           <w:lang w:val="en-US"/>
         </w:rPr>
         <w:drawing>
-          <wp:inline distT="0" distB="0" distL="0" distR="0" wp14:anchorId="7E8BAE65" wp14:editId="3C46432D">
-            <wp:extent cx="5760720" cy="2743835"/>
+          <wp:inline distT="0" distB="0" distL="0" distR="0" wp14:anchorId="7E8BAE65" wp14:editId="3CD39AF0">
+            <wp:extent cx="5760720" cy="3105150"/>
             <wp:effectExtent l="0" t="0" r="0" b="0"/>
             <wp:docPr id="2046970354" name="Image 1"/>
             <wp:cNvGraphicFramePr>
@@ -21696,7 +21915,7 @@
                   <pic:spPr>
                     <a:xfrm>
                       <a:off x="0" y="0"/>
-                      <a:ext cx="5760720" cy="2743835"/>
+                      <a:ext cx="5760720" cy="3105150"/>
                     </a:xfrm>
                     <a:prstGeom prst="rect">
                       <a:avLst/>
@@ -21723,7 +21942,6 @@
     </w:p>
     <w:p>
       <w:pPr>
-        <w:ind w:left="142"/>
         <w:rPr>
           <w:rFonts w:ascii="Calibri" w:hAnsi="Calibri"/>
           <w:b/>
@@ -21732,10 +21950,7 @@
           <w:lang w:val="en-US"/>
         </w:rPr>
       </w:pPr>
-    </w:p>
-    <w:p>
-      <w:pPr>
-        <w:ind w:left="142"/>
+      <w:r>
         <w:rPr>
           <w:rFonts w:ascii="Calibri" w:hAnsi="Calibri"/>
           <w:b/>
@@ -21743,11 +21958,11 @@
           <w:sz w:val="28"/>
           <w:lang w:val="en-US"/>
         </w:rPr>
-      </w:pPr>
+        <w:br w:type="page"/>
+      </w:r>
     </w:p>
     <w:p>
       <w:pPr>
-        <w:ind w:left="142"/>
         <w:rPr>
           <w:rFonts w:ascii="Calibri" w:hAnsi="Calibri"/>
           <w:b/>
@@ -21765,33 +21980,26 @@
           <w:b/>
           <w:color w:val="000000"/>
           <w:sz w:val="28"/>
-          <w:lang w:val="en-US"/>
-        </w:rPr>
-      </w:pPr>
-    </w:p>
-    <w:p>
-      <w:pPr>
-        <w:ind w:left="142"/>
+        </w:rPr>
+      </w:pPr>
+      <w:r>
         <w:rPr>
           <w:rFonts w:ascii="Calibri" w:hAnsi="Calibri"/>
           <w:b/>
           <w:color w:val="000000"/>
           <w:sz w:val="28"/>
-          <w:lang w:val="en-US"/>
-        </w:rPr>
-      </w:pPr>
-    </w:p>
-    <w:p>
-      <w:pPr>
-        <w:ind w:left="142"/>
+        </w:rPr>
+        <w:t>Re</w:t>
+      </w:r>
+      <w:r>
         <w:rPr>
           <w:rFonts w:ascii="Calibri" w:hAnsi="Calibri"/>
           <w:b/>
           <w:color w:val="000000"/>
           <w:sz w:val="28"/>
-          <w:lang w:val="en-US"/>
-        </w:rPr>
-      </w:pPr>
+        </w:rPr>
+        <w:t>quête n°5</w:t>
+      </w:r>
     </w:p>
     <w:p>
       <w:pPr>
@@ -21801,73 +22009,13 @@
           <w:b/>
           <w:color w:val="000000"/>
           <w:sz w:val="28"/>
-          <w:lang w:val="en-US"/>
-        </w:rPr>
-      </w:pPr>
-    </w:p>
-    <w:p>
-      <w:pPr>
-        <w:ind w:left="142"/>
-        <w:rPr>
-          <w:rFonts w:ascii="Calibri" w:hAnsi="Calibri"/>
-          <w:b/>
-          <w:color w:val="000000"/>
-          <w:sz w:val="28"/>
-          <w:lang w:val="en-US"/>
-        </w:rPr>
-      </w:pPr>
-    </w:p>
-    <w:p>
-      <w:pPr>
-        <w:ind w:left="142"/>
-        <w:rPr>
-          <w:rFonts w:ascii="Calibri" w:hAnsi="Calibri"/>
-          <w:b/>
-          <w:color w:val="000000"/>
-          <w:sz w:val="28"/>
-          <w:lang w:val="en-US"/>
-        </w:rPr>
-      </w:pPr>
-    </w:p>
-    <w:p>
-      <w:pPr>
-        <w:ind w:left="142"/>
-        <w:rPr>
-          <w:rFonts w:ascii="Calibri" w:hAnsi="Calibri"/>
-          <w:b/>
-          <w:color w:val="000000"/>
-          <w:sz w:val="28"/>
-          <w:lang w:val="en-US"/>
-        </w:rPr>
-      </w:pPr>
-    </w:p>
-    <w:p>
-      <w:pPr>
-        <w:ind w:left="142"/>
-        <w:rPr>
-          <w:rFonts w:ascii="Calibri" w:hAnsi="Calibri"/>
-          <w:b/>
-          <w:color w:val="000000"/>
-          <w:sz w:val="28"/>
-        </w:rPr>
-      </w:pPr>
-      <w:r>
-        <w:rPr>
-          <w:rFonts w:ascii="Calibri" w:hAnsi="Calibri"/>
-          <w:b/>
-          <w:color w:val="000000"/>
-          <w:sz w:val="28"/>
-        </w:rPr>
-        <w:t>Re</w:t>
-      </w:r>
-      <w:r>
-        <w:rPr>
-          <w:rFonts w:ascii="Calibri" w:hAnsi="Calibri"/>
-          <w:b/>
-          <w:color w:val="000000"/>
-          <w:sz w:val="28"/>
-        </w:rPr>
-        <w:t>quête n°5</w:t>
+        </w:rPr>
+      </w:pPr>
+      <w:r>
+        <w:rPr>
+          <w:rFonts w:ascii="Calibri" w:hAnsi="Calibri" w:cs="Calibri"/>
+        </w:rPr>
+        <w:t>Affiche le prix moyen des réservations pour chaque vol (vol_fk). Le résultat doit être ordonné par le prix moyen du plus petit au plus grand.</w:t>
       </w:r>
     </w:p>
     <w:tbl>
@@ -21922,7 +22070,6 @@
                 <w:color w:val="FFFFFF"/>
                 <w:sz w:val="20"/>
               </w:rPr>
-              <w:lastRenderedPageBreak/>
               <w:t xml:space="preserve">SQL   </w:t>
             </w:r>
           </w:p>
@@ -21987,15 +22134,7 @@
               <w:spacing w:after="0" w:line="240" w:lineRule="auto"/>
             </w:pPr>
             <w:r>
-              <w:t xml:space="preserve">SELECT </w:t>
-            </w:r>
-            <w:proofErr w:type="spellStart"/>
-            <w:r>
-              <w:t>vol_fk</w:t>
-            </w:r>
-            <w:proofErr w:type="spellEnd"/>
-            <w:r>
-              <w:t xml:space="preserve">, AVG(prix) AS </w:t>
+              <w:t xml:space="preserve">SELECT vol_fk, AVG(prix) AS </w:t>
             </w:r>
             <w:proofErr w:type="spellStart"/>
             <w:r>
@@ -22148,16 +22287,8 @@
               <w:rPr>
                 <w:lang w:val="en-US"/>
               </w:rPr>
-              <w:t xml:space="preserve">GROUP BY </w:t>
-            </w:r>
-            <w:proofErr w:type="spellStart"/>
-            <w:r>
-              <w:rPr>
-                <w:lang w:val="en-US"/>
-              </w:rPr>
-              <w:t>vol_fk</w:t>
-            </w:r>
-            <w:proofErr w:type="spellEnd"/>
+              <w:t>GROUP BY vol_fk</w:t>
+            </w:r>
           </w:p>
         </w:tc>
       </w:tr>
@@ -22256,6 +22387,17 @@
           <w:sz w:val="28"/>
         </w:rPr>
       </w:pPr>
+    </w:p>
+    <w:p>
+      <w:pPr>
+        <w:ind w:left="142"/>
+        <w:rPr>
+          <w:rFonts w:ascii="Calibri" w:hAnsi="Calibri"/>
+          <w:b/>
+          <w:color w:val="000000"/>
+          <w:sz w:val="28"/>
+        </w:rPr>
+      </w:pPr>
       <w:r>
         <w:rPr>
           <w:rFonts w:ascii="Calibri" w:hAnsi="Calibri"/>
@@ -22265,9 +22407,9 @@
           <w:sz w:val="28"/>
         </w:rPr>
         <w:drawing>
-          <wp:inline distT="0" distB="0" distL="0" distR="0" wp14:anchorId="32E0D3C1" wp14:editId="34FCFF70">
-            <wp:extent cx="5760720" cy="6647180"/>
-            <wp:effectExtent l="0" t="0" r="0" b="1270"/>
+          <wp:inline distT="0" distB="0" distL="0" distR="0" wp14:anchorId="32E0D3C1" wp14:editId="099264E0">
+            <wp:extent cx="5760720" cy="5791200"/>
+            <wp:effectExtent l="0" t="0" r="0" b="0"/>
             <wp:docPr id="795874479" name="Image 1"/>
             <wp:cNvGraphicFramePr>
               <a:graphicFrameLocks xmlns:a="http://schemas.openxmlformats.org/drawingml/2006/main" noChangeAspect="1"/>
@@ -22288,7 +22430,7 @@
                   <pic:spPr>
                     <a:xfrm>
                       <a:off x="0" y="0"/>
-                      <a:ext cx="5760720" cy="6647180"/>
+                      <a:ext cx="5760720" cy="5791200"/>
                     </a:xfrm>
                     <a:prstGeom prst="rect">
                       <a:avLst/>
@@ -22303,7 +22445,6 @@
     </w:p>
     <w:p>
       <w:pPr>
-        <w:ind w:left="142"/>
         <w:rPr>
           <w:rFonts w:ascii="Calibri" w:hAnsi="Calibri"/>
           <w:b/>
@@ -22311,26 +22452,43 @@
           <w:sz w:val="28"/>
         </w:rPr>
       </w:pPr>
-    </w:p>
-    <w:p>
-      <w:pPr>
-        <w:ind w:left="142"/>
+      <w:r>
         <w:rPr>
           <w:rFonts w:ascii="Calibri" w:hAnsi="Calibri"/>
           <w:b/>
           <w:color w:val="000000"/>
           <w:sz w:val="28"/>
         </w:rPr>
-      </w:pPr>
-      <w:r>
+        <w:lastRenderedPageBreak/>
+        <w:t>Requête n°6</w:t>
+      </w:r>
+    </w:p>
+    <w:p>
+      <w:pPr>
         <w:rPr>
           <w:rFonts w:ascii="Calibri" w:hAnsi="Calibri"/>
           <w:b/>
           <w:color w:val="000000"/>
           <w:sz w:val="28"/>
         </w:rPr>
-        <w:t>Requête n°6</w:t>
-      </w:r>
+      </w:pPr>
+      <w:r>
+        <w:rPr>
+          <w:rFonts w:ascii="Calibri" w:hAnsi="Calibri" w:cs="Calibri"/>
+        </w:rPr>
+        <w:t>Afficher tous les noms d’aéroports, ainsi que le nom des compagnies basées dans chaque aéroport (y compris ceux sans compagnie).</w:t>
+      </w:r>
+    </w:p>
+    <w:p>
+      <w:pPr>
+        <w:ind w:left="142"/>
+        <w:rPr>
+          <w:rFonts w:ascii="Calibri" w:hAnsi="Calibri"/>
+          <w:b/>
+          <w:color w:val="000000"/>
+          <w:sz w:val="28"/>
+        </w:rPr>
+      </w:pPr>
     </w:p>
     <w:tbl>
       <w:tblPr>
@@ -22384,7 +22542,6 @@
                 <w:color w:val="FFFFFF"/>
                 <w:sz w:val="20"/>
               </w:rPr>
-              <w:lastRenderedPageBreak/>
               <w:t xml:space="preserve">SQL   </w:t>
             </w:r>
           </w:p>
@@ -23037,6 +23194,7 @@
         <w:rPr>
           <w:rFonts w:ascii="Calibri" w:hAnsi="Calibri" w:cs="Calibri"/>
         </w:rPr>
+        <w:lastRenderedPageBreak/>
         <w:t>Source :</w:t>
       </w:r>
       <w:r>

</xml_diff>